<commit_message>
docs: add 长安大学 cover page to 胡艺瀚 course-design log
</commit_message>
<xml_diff>
--- a/docs/team/daily/胡艺瀚_课程设计日志.docx
+++ b/docs/team/daily/胡艺瀚_课程设计日志.docx
@@ -2,9 +2,89 @@
 <file path=word/document.xml><?xml version="1.0" encoding="utf-8"?>
 <w:document xmlns:wpc="http://schemas.microsoft.com/office/word/2010/wordprocessingCanvas" xmlns:mo="http://schemas.microsoft.com/office/mac/office/2008/main" xmlns:mc="http://schemas.openxmlformats.org/markup-compatibility/2006" xmlns:mv="urn:schemas-microsoft-com:mac:vml" xmlns:o="urn:schemas-microsoft-com:office:office" xmlns:r="http://schemas.openxmlformats.org/officeDocument/2006/relationships" xmlns:m="http://schemas.openxmlformats.org/officeDocument/2006/math" xmlns:v="urn:schemas-microsoft-com:vml" xmlns:wp14="http://schemas.microsoft.com/office/word/2010/wordprocessingDrawing" xmlns:wp="http://schemas.openxmlformats.org/drawingml/2006/wordprocessingDrawing" xmlns:w10="urn:schemas-microsoft-com:office:word" xmlns:w="http://schemas.openxmlformats.org/wordprocessingml/2006/main" xmlns:w14="http://schemas.microsoft.com/office/word/2010/wordml" xmlns:wpg="http://schemas.microsoft.com/office/word/2010/wordprocessingGroup" xmlns:wpi="http://schemas.microsoft.com/office/word/2010/wordprocessingInk" xmlns:wne="http://schemas.microsoft.com/office/word/2006/wordml" xmlns:wps="http://schemas.microsoft.com/office/word/2010/wordprocessingShape" mc:Ignorable="w14 wp14">
   <w:body>
+    <w:p/>
     <w:p>
       <w:pPr>
-        <w:spacing w:after="200"/>
+        <w:jc w:val="center"/>
+      </w:pPr>
+      <w:r>
+        <w:drawing>
+          <wp:inline xmlns:a="http://schemas.openxmlformats.org/drawingml/2006/main" xmlns:pic="http://schemas.openxmlformats.org/drawingml/2006/picture">
+            <wp:extent cx="827999" cy="827999"/>
+            <wp:docPr id="1" name="Picture 1"/>
+            <wp:cNvGraphicFramePr>
+              <a:graphicFrameLocks noChangeAspect="1"/>
+            </wp:cNvGraphicFramePr>
+            <a:graphic>
+              <a:graphicData uri="http://schemas.openxmlformats.org/drawingml/2006/picture">
+                <pic:pic>
+                  <pic:nvPicPr>
+                    <pic:cNvPr id="0" name="changan_logo.png"/>
+                    <pic:cNvPicPr/>
+                  </pic:nvPicPr>
+                  <pic:blipFill>
+                    <a:blip r:embed="rId9"/>
+                    <a:stretch>
+                      <a:fillRect/>
+                    </a:stretch>
+                  </pic:blipFill>
+                  <pic:spPr>
+                    <a:xfrm>
+                      <a:off x="0" y="0"/>
+                      <a:ext cx="827999" cy="827999"/>
+                    </a:xfrm>
+                    <a:prstGeom prst="rect"/>
+                  </pic:spPr>
+                </pic:pic>
+              </a:graphicData>
+            </a:graphic>
+          </wp:inline>
+        </w:drawing>
+      </w:r>
+      <w:r>
+        <w:t xml:space="preserve">   </w:t>
+      </w:r>
+      <w:r>
+        <w:drawing>
+          <wp:inline xmlns:a="http://schemas.openxmlformats.org/drawingml/2006/main" xmlns:pic="http://schemas.openxmlformats.org/drawingml/2006/picture">
+            <wp:extent cx="1958118" cy="684000"/>
+            <wp:docPr id="2" name="Picture 2"/>
+            <wp:cNvGraphicFramePr>
+              <a:graphicFrameLocks noChangeAspect="1"/>
+            </wp:cNvGraphicFramePr>
+            <a:graphic>
+              <a:graphicData uri="http://schemas.openxmlformats.org/drawingml/2006/picture">
+                <pic:pic>
+                  <pic:nvPicPr>
+                    <pic:cNvPr id="0" name="changan_name.png"/>
+                    <pic:cNvPicPr/>
+                  </pic:nvPicPr>
+                  <pic:blipFill>
+                    <a:blip r:embed="rId10"/>
+                    <a:stretch>
+                      <a:fillRect/>
+                    </a:stretch>
+                  </pic:blipFill>
+                  <pic:spPr>
+                    <a:xfrm>
+                      <a:off x="0" y="0"/>
+                      <a:ext cx="1958118" cy="684000"/>
+                    </a:xfrm>
+                    <a:prstGeom prst="rect"/>
+                  </pic:spPr>
+                </pic:pic>
+              </a:graphicData>
+            </a:graphic>
+          </wp:inline>
+        </w:drawing>
+      </w:r>
+    </w:p>
+    <w:p/>
+    <w:p/>
+    <w:p/>
+    <w:p>
+      <w:pPr>
+        <w:spacing w:after="120"/>
         <w:jc w:val="center"/>
       </w:pPr>
       <w:r>
@@ -12,149 +92,175 @@
           <w:rFonts w:ascii="Arial" w:hAnsi="Arial" w:eastAsia="黑体"/>
           <w:b/>
           <w:color w:val="000000"/>
-          <w:sz w:val="32"/>
+          <w:sz w:val="36"/>
         </w:rPr>
         <w:t>《数据通信与网络课程设计》课程设计日志</w:t>
       </w:r>
     </w:p>
+    <w:p/>
+    <w:p/>
+    <w:p/>
+    <w:p/>
+    <w:p/>
+    <w:p/>
     <w:p>
       <w:pPr>
-        <w:spacing w:line="336" w:lineRule="auto" w:after="0"/>
+        <w:spacing w:line="360" w:lineRule="auto"/>
+        <w:ind w:left="1701"/>
       </w:pPr>
       <w:r>
         <w:rPr>
           <w:rFonts w:ascii="Times New Roman" w:hAnsi="Times New Roman" w:eastAsia="宋体"/>
-          <w:b w:val="0"/>
+          <w:b/>
           <w:color w:val="000000"/>
-          <w:sz w:val="24"/>
+          <w:sz w:val="26"/>
         </w:rPr>
         <w:t>课设题目：基于 MQTT 的多节点环境监测系统设计</w:t>
       </w:r>
     </w:p>
     <w:p>
       <w:pPr>
-        <w:spacing w:line="336" w:lineRule="auto" w:after="0"/>
+        <w:spacing w:line="360" w:lineRule="auto"/>
+        <w:ind w:left="1701"/>
       </w:pPr>
       <w:r>
         <w:rPr>
           <w:rFonts w:ascii="Times New Roman" w:hAnsi="Times New Roman" w:eastAsia="宋体"/>
-          <w:b w:val="0"/>
+          <w:b/>
           <w:color w:val="000000"/>
-          <w:sz w:val="24"/>
+          <w:sz w:val="26"/>
         </w:rPr>
         <w:t>所在小组：</w:t>
       </w:r>
     </w:p>
     <w:p>
       <w:pPr>
-        <w:spacing w:line="336" w:lineRule="auto" w:after="0"/>
+        <w:spacing w:line="360" w:lineRule="auto"/>
+        <w:ind w:left="1701"/>
       </w:pPr>
       <w:r>
         <w:rPr>
           <w:rFonts w:ascii="Times New Roman" w:hAnsi="Times New Roman" w:eastAsia="宋体"/>
-          <w:b w:val="0"/>
+          <w:b/>
           <w:color w:val="000000"/>
-          <w:sz w:val="24"/>
+          <w:sz w:val="26"/>
         </w:rPr>
         <w:t>学生姓名：胡艺瀚</w:t>
       </w:r>
     </w:p>
     <w:p>
       <w:pPr>
-        <w:spacing w:line="336" w:lineRule="auto" w:after="0"/>
+        <w:spacing w:line="360" w:lineRule="auto"/>
+        <w:ind w:left="1701"/>
       </w:pPr>
       <w:r>
         <w:rPr>
           <w:rFonts w:ascii="Times New Roman" w:hAnsi="Times New Roman" w:eastAsia="宋体"/>
-          <w:b w:val="0"/>
+          <w:b/>
           <w:color w:val="000000"/>
-          <w:sz w:val="24"/>
+          <w:sz w:val="26"/>
         </w:rPr>
         <w:t>学    号：2023905925</w:t>
       </w:r>
     </w:p>
     <w:p>
       <w:pPr>
-        <w:spacing w:line="336" w:lineRule="auto" w:after="0"/>
+        <w:spacing w:line="360" w:lineRule="auto"/>
+        <w:ind w:left="1701"/>
       </w:pPr>
       <w:r>
         <w:rPr>
           <w:rFonts w:ascii="Times New Roman" w:hAnsi="Times New Roman" w:eastAsia="宋体"/>
-          <w:b w:val="0"/>
+          <w:b/>
           <w:color w:val="000000"/>
-          <w:sz w:val="24"/>
+          <w:sz w:val="26"/>
         </w:rPr>
         <w:t>班    级：2023240303</w:t>
       </w:r>
     </w:p>
     <w:p>
       <w:pPr>
-        <w:spacing w:line="336" w:lineRule="auto" w:after="0"/>
+        <w:spacing w:line="360" w:lineRule="auto"/>
+        <w:ind w:left="1701"/>
       </w:pPr>
       <w:r>
         <w:rPr>
           <w:rFonts w:ascii="Times New Roman" w:hAnsi="Times New Roman" w:eastAsia="宋体"/>
-          <w:b w:val="0"/>
+          <w:b/>
           <w:color w:val="000000"/>
-          <w:sz w:val="24"/>
+          <w:sz w:val="26"/>
         </w:rPr>
         <w:t>小组成员：孙博宇、韦煜城、曾家豪</w:t>
       </w:r>
     </w:p>
     <w:p>
       <w:pPr>
-        <w:spacing w:line="336" w:lineRule="auto" w:after="0"/>
+        <w:spacing w:line="360" w:lineRule="auto"/>
+        <w:ind w:left="1701"/>
       </w:pPr>
       <w:r>
         <w:rPr>
           <w:rFonts w:ascii="Times New Roman" w:hAnsi="Times New Roman" w:eastAsia="宋体"/>
-          <w:b w:val="0"/>
+          <w:b/>
           <w:color w:val="000000"/>
-          <w:sz w:val="24"/>
+          <w:sz w:val="26"/>
         </w:rPr>
         <w:t>本人主要分工：软件设计与系统集成（MQTT 方案、网络负载与成本建模、需求计算器、Web 监控端、性能与压测）及项目流程推进</w:t>
       </w:r>
     </w:p>
     <w:p>
       <w:pPr>
-        <w:spacing w:line="336" w:lineRule="auto" w:after="0"/>
+        <w:spacing w:line="360" w:lineRule="auto"/>
+        <w:ind w:left="1701"/>
       </w:pPr>
       <w:r>
         <w:rPr>
           <w:rFonts w:ascii="Times New Roman" w:hAnsi="Times New Roman" w:eastAsia="宋体"/>
-          <w:b w:val="0"/>
+          <w:b/>
           <w:color w:val="000000"/>
-          <w:sz w:val="24"/>
+          <w:sz w:val="26"/>
         </w:rPr>
         <w:t>指导老师：和洁，傅攀峰，刘若辰</w:t>
       </w:r>
     </w:p>
     <w:p>
       <w:pPr>
-        <w:spacing w:line="336" w:lineRule="auto" w:after="0"/>
+        <w:spacing w:line="360" w:lineRule="auto"/>
+        <w:ind w:left="1701"/>
       </w:pPr>
       <w:r>
         <w:rPr>
           <w:rFonts w:ascii="Times New Roman" w:hAnsi="Times New Roman" w:eastAsia="宋体"/>
-          <w:b w:val="0"/>
+          <w:b/>
           <w:color w:val="000000"/>
-          <w:sz w:val="24"/>
+          <w:sz w:val="26"/>
         </w:rPr>
         <w:t>时    间：2026 年 6 月</w:t>
       </w:r>
     </w:p>
+    <w:p/>
+    <w:p/>
+    <w:p/>
+    <w:p/>
+    <w:p/>
+    <w:p/>
     <w:p>
       <w:pPr>
-        <w:spacing w:line="336" w:lineRule="auto" w:after="0"/>
+        <w:jc w:val="center"/>
       </w:pPr>
       <w:r>
         <w:rPr>
-          <w:rFonts w:ascii="Times New Roman" w:hAnsi="Times New Roman" w:eastAsia="宋体"/>
-          <w:b w:val="0"/>
+          <w:rFonts w:ascii="Arial" w:hAnsi="Arial" w:eastAsia="黑体"/>
+          <w:b/>
           <w:color w:val="000000"/>
-          <w:sz w:val="24"/>
+          <w:sz w:val="30"/>
         </w:rPr>
         <w:t>信息工程学院</w:t>
+      </w:r>
+    </w:p>
+    <w:p>
+      <w:r>
+        <w:br w:type="page"/>
       </w:r>
     </w:p>
     <w:p>

</xml_diff>

<commit_message>
docs: align 胡艺瀚 log fonts to template and add per-day separators
</commit_message>
<xml_diff>
--- a/docs/team/daily/胡艺瀚_课程设计日志.docx
+++ b/docs/team/daily/胡艺瀚_课程设计日志.docx
@@ -792,2980 +792,1737 @@
     <w:p>
       <w:pPr>
         <w:pStyle w:val="3"/>
-        <w:spacing w:before="200" w:after="80"/>
-      </w:pPr>
-      <w:r>
-        <w:rPr>
-          <w:rFonts w:ascii="Arial" w:hAnsi="Arial" w:eastAsia="黑体"/>
-          <w:b/>
-          <w:color w:val="000000"/>
-          <w:sz w:val="26"/>
-        </w:rPr>
+      </w:pPr>
+      <w:r>
         <w:t>第 1 个工作日：题目理解、项目规划与需求设计</w:t>
       </w:r>
     </w:p>
     <w:p>
-      <w:pPr>
-        <w:spacing w:line="336" w:lineRule="auto" w:after="0"/>
-      </w:pPr>
-      <w:r>
-        <w:rPr>
-          <w:rFonts w:ascii="Times New Roman" w:hAnsi="Times New Roman" w:eastAsia="宋体"/>
-          <w:b w:val="0"/>
-          <w:color w:val="000000"/>
-          <w:sz w:val="24"/>
-        </w:rPr>
+      <w:r>
         <w:t>日期：2026年6月8日</w:t>
       </w:r>
     </w:p>
     <w:p>
-      <w:pPr>
-        <w:spacing w:before="80" w:after="40"/>
-      </w:pPr>
-      <w:r>
-        <w:rPr>
-          <w:rFonts w:ascii="Arial" w:hAnsi="Arial" w:eastAsia="黑体"/>
-          <w:b/>
-          <w:color w:val="000000"/>
-          <w:sz w:val="24"/>
+      <w:r>
+        <w:rPr>
+          <w:b/>
         </w:rPr>
         <w:t>1. 今日主要工作内容</w:t>
       </w:r>
     </w:p>
     <w:p>
       <w:pPr>
-        <w:spacing w:line="300" w:lineRule="auto" w:after="40"/>
-        <w:ind w:firstLine="480"/>
-      </w:pPr>
-      <w:r>
-        <w:rPr>
-          <w:rFonts w:ascii="Times New Roman" w:hAnsi="Times New Roman" w:eastAsia="宋体"/>
-          <w:b w:val="0"/>
-          <w:color w:val="000000"/>
-          <w:sz w:val="24"/>
-        </w:rPr>
+        <w:spacing w:line="324" w:lineRule="auto"/>
+      </w:pPr>
+      <w:r>
         <w:t>今天主要完成课程设计项目的启动与整体规划。上午认真听取老师对课程设计的讲解，了解整体安排、工作日进度、阶段检查、报告结构、答辩方式和测试证据要求；老师强调要体现工程思维，从需求分析、方案设计、协议选择、测试验证到过程记录完整说明设计依据。课后对本组选题进行分析，组织并参与第一次小组会议，讨论应用场景、技术路线、分工与性能目标。</w:t>
       </w:r>
     </w:p>
     <w:p>
-      <w:pPr>
-        <w:spacing w:before="80" w:after="40"/>
-      </w:pPr>
-      <w:r>
-        <w:rPr>
-          <w:rFonts w:ascii="Arial" w:hAnsi="Arial" w:eastAsia="黑体"/>
-          <w:b/>
-          <w:color w:val="000000"/>
-          <w:sz w:val="24"/>
+      <w:r>
+        <w:rPr>
+          <w:b/>
         </w:rPr>
         <w:t>2. 本人完成的具体任务</w:t>
       </w:r>
     </w:p>
     <w:p>
       <w:pPr>
-        <w:spacing w:line="300" w:lineRule="auto" w:after="20"/>
-      </w:pPr>
-      <w:r>
-        <w:rPr>
-          <w:rFonts w:ascii="Times New Roman" w:hAnsi="Times New Roman" w:eastAsia="宋体"/>
-          <w:b w:val="0"/>
-          <w:color w:val="000000"/>
-          <w:sz w:val="24"/>
-        </w:rPr>
+        <w:spacing w:line="324" w:lineRule="auto"/>
+      </w:pPr>
+      <w:r>
         <w:t>① 梳理课程设计的阶段要求、提交材料和答辩重点。</w:t>
       </w:r>
     </w:p>
     <w:p>
       <w:pPr>
-        <w:spacing w:line="300" w:lineRule="auto" w:after="20"/>
-      </w:pPr>
-      <w:r>
-        <w:rPr>
-          <w:rFonts w:ascii="Times New Roman" w:hAnsi="Times New Roman" w:eastAsia="宋体"/>
-          <w:b w:val="0"/>
-          <w:color w:val="000000"/>
-          <w:sz w:val="24"/>
-        </w:rPr>
+        <w:spacing w:line="324" w:lineRule="auto"/>
+      </w:pPr>
+      <w:r>
         <w:t>② 主导构建项目整体推进流程，确定“一个模块一个模块推进”的方式。</w:t>
       </w:r>
     </w:p>
     <w:p>
       <w:pPr>
-        <w:spacing w:line="300" w:lineRule="auto" w:after="20"/>
-      </w:pPr>
-      <w:r>
-        <w:rPr>
-          <w:rFonts w:ascii="Times New Roman" w:hAnsi="Times New Roman" w:eastAsia="宋体"/>
-          <w:b w:val="0"/>
-          <w:color w:val="000000"/>
-          <w:sz w:val="24"/>
-        </w:rPr>
+        <w:spacing w:line="324" w:lineRule="auto"/>
+      </w:pPr>
+      <w:r>
         <w:t>③ 规划 GitHub 协作流程，通过 Issue、commit、README 进度和文档进行过程留痕。</w:t>
       </w:r>
     </w:p>
     <w:p>
       <w:pPr>
-        <w:spacing w:line="300" w:lineRule="auto" w:after="20"/>
-      </w:pPr>
-      <w:r>
-        <w:rPr>
-          <w:rFonts w:ascii="Times New Roman" w:hAnsi="Times New Roman" w:eastAsia="宋体"/>
-          <w:b w:val="0"/>
-          <w:color w:val="000000"/>
-          <w:sz w:val="24"/>
-        </w:rPr>
+        <w:spacing w:line="324" w:lineRule="auto"/>
+      </w:pPr>
+      <w:r>
         <w:t>④ 组织第一次小组会议，明确分工：本人和曾家豪负责软件侧，孙博宇和韦煜城负责硬件侧。</w:t>
       </w:r>
     </w:p>
     <w:p>
       <w:pPr>
-        <w:spacing w:line="300" w:lineRule="auto" w:after="20"/>
-      </w:pPr>
-      <w:r>
-        <w:rPr>
-          <w:rFonts w:ascii="Times New Roman" w:hAnsi="Times New Roman" w:eastAsia="宋体"/>
-          <w:b w:val="0"/>
-          <w:color w:val="000000"/>
-          <w:sz w:val="24"/>
-        </w:rPr>
+        <w:spacing w:line="324" w:lineRule="auto"/>
+      </w:pPr>
+      <w:r>
         <w:t>⑤ 完成项目基础目录结构搭建、课程资料归档与 README 初版。</w:t>
       </w:r>
     </w:p>
     <w:p>
       <w:pPr>
-        <w:spacing w:line="300" w:lineRule="auto" w:after="20"/>
-      </w:pPr>
-      <w:r>
-        <w:rPr>
-          <w:rFonts w:ascii="Times New Roman" w:hAnsi="Times New Roman" w:eastAsia="宋体"/>
-          <w:b w:val="0"/>
-          <w:color w:val="000000"/>
-          <w:sz w:val="24"/>
-        </w:rPr>
+        <w:spacing w:line="324" w:lineRule="auto"/>
+      </w:pPr>
+      <w:r>
         <w:t>⑥ 完成《需求分析与设计指标》初稿，以及《MQTT 主题与消息格式设计》文档（Topic 命名、JSON 字段与中文显示映射）。</w:t>
       </w:r>
     </w:p>
     <w:p>
-      <w:pPr>
-        <w:spacing w:before="80" w:after="40"/>
-      </w:pPr>
-      <w:r>
-        <w:rPr>
-          <w:rFonts w:ascii="Arial" w:hAnsi="Arial" w:eastAsia="黑体"/>
-          <w:b/>
-          <w:color w:val="000000"/>
-          <w:sz w:val="24"/>
+      <w:r>
+        <w:rPr>
+          <w:b/>
         </w:rPr>
         <w:t>3. 遇到的问题</w:t>
       </w:r>
     </w:p>
     <w:p>
       <w:pPr>
-        <w:spacing w:line="300" w:lineRule="auto" w:after="20"/>
-      </w:pPr>
-      <w:r>
-        <w:rPr>
-          <w:rFonts w:ascii="Times New Roman" w:hAnsi="Times New Roman" w:eastAsia="宋体"/>
-          <w:b w:val="0"/>
-          <w:color w:val="000000"/>
-          <w:sz w:val="24"/>
-        </w:rPr>
+        <w:spacing w:line="324" w:lineRule="auto"/>
+      </w:pPr>
+      <w:r>
         <w:t>① 项目初期任务较多，一次性规划过大容易导致后续执行压力过大。</w:t>
       </w:r>
     </w:p>
     <w:p>
       <w:pPr>
-        <w:spacing w:line="300" w:lineRule="auto" w:after="20"/>
-      </w:pPr>
-      <w:r>
-        <w:rPr>
-          <w:rFonts w:ascii="Times New Roman" w:hAnsi="Times New Roman" w:eastAsia="宋体"/>
-          <w:b w:val="0"/>
-          <w:color w:val="000000"/>
-          <w:sz w:val="24"/>
-        </w:rPr>
+        <w:spacing w:line="324" w:lineRule="auto"/>
+      </w:pPr>
+      <w:r>
         <w:t>② 设计 MQTT Topic 和 JSON 字段时，需要判断是否可使用中文命名。</w:t>
       </w:r>
     </w:p>
     <w:p>
-      <w:pPr>
-        <w:spacing w:before="80" w:after="40"/>
-      </w:pPr>
-      <w:r>
-        <w:rPr>
-          <w:rFonts w:ascii="Arial" w:hAnsi="Arial" w:eastAsia="黑体"/>
-          <w:b/>
-          <w:color w:val="000000"/>
-          <w:sz w:val="24"/>
+      <w:r>
+        <w:rPr>
+          <w:b/>
         </w:rPr>
         <w:t>4. 解决方法</w:t>
       </w:r>
     </w:p>
     <w:p>
       <w:pPr>
-        <w:spacing w:line="300" w:lineRule="auto" w:after="20"/>
-      </w:pPr>
-      <w:r>
-        <w:rPr>
-          <w:rFonts w:ascii="Times New Roman" w:hAnsi="Times New Roman" w:eastAsia="宋体"/>
-          <w:b w:val="0"/>
-          <w:color w:val="000000"/>
-          <w:sz w:val="24"/>
-        </w:rPr>
+        <w:spacing w:line="324" w:lineRule="auto"/>
+      </w:pPr>
+      <w:r>
         <w:t>① 采用“一个模块一个模块推进”的流程，每次只围绕当前模块完成设计、实现和提交。</w:t>
       </w:r>
     </w:p>
     <w:p>
       <w:pPr>
-        <w:spacing w:line="300" w:lineRule="auto" w:after="20"/>
-      </w:pPr>
-      <w:r>
-        <w:rPr>
-          <w:rFonts w:ascii="Times New Roman" w:hAnsi="Times New Roman" w:eastAsia="宋体"/>
-          <w:b w:val="0"/>
-          <w:color w:val="000000"/>
-          <w:sz w:val="24"/>
-        </w:rPr>
+        <w:spacing w:line="324" w:lineRule="auto"/>
+      </w:pPr>
+      <w:r>
         <w:t>② 确定文档和页面展示用中文，但 Topic、JSON 字段和代码变量统一用英文，减少编码兼容与抓包分析问题。</w:t>
       </w:r>
     </w:p>
     <w:p>
-      <w:pPr>
-        <w:spacing w:before="80" w:after="40"/>
-      </w:pPr>
-      <w:r>
-        <w:rPr>
-          <w:rFonts w:ascii="Arial" w:hAnsi="Arial" w:eastAsia="黑体"/>
-          <w:b/>
-          <w:color w:val="000000"/>
-          <w:sz w:val="24"/>
+      <w:r>
+        <w:rPr>
+          <w:b/>
         </w:rPr>
         <w:t>5. 今日成果</w:t>
       </w:r>
     </w:p>
     <w:p>
       <w:pPr>
-        <w:spacing w:line="300" w:lineRule="auto" w:after="20"/>
-      </w:pPr>
-      <w:r>
-        <w:rPr>
-          <w:rFonts w:ascii="Times New Roman" w:hAnsi="Times New Roman" w:eastAsia="宋体"/>
-          <w:b w:val="0"/>
-          <w:color w:val="000000"/>
-          <w:sz w:val="24"/>
-        </w:rPr>
+        <w:spacing w:line="324" w:lineRule="auto"/>
+      </w:pPr>
+      <w:r>
         <w:t>① 完成项目仓库初始结构、README 初版，以及需求分析与 MQTT 协议设计文档。</w:t>
       </w:r>
     </w:p>
     <w:p>
       <w:pPr>
-        <w:spacing w:line="300" w:lineRule="auto" w:after="20"/>
-      </w:pPr>
-      <w:r>
-        <w:rPr>
-          <w:rFonts w:ascii="Times New Roman" w:hAnsi="Times New Roman" w:eastAsia="宋体"/>
-          <w:b w:val="0"/>
-          <w:color w:val="000000"/>
-          <w:sz w:val="24"/>
-        </w:rPr>
+        <w:spacing w:line="324" w:lineRule="auto"/>
+      </w:pPr>
+      <w:r>
         <w:t>② 主导确定项目整体流程与小组分工，并整理第一次会议记录。</w:t>
       </w:r>
     </w:p>
     <w:p>
-      <w:pPr>
-        <w:spacing w:before="80" w:after="40"/>
-      </w:pPr>
-      <w:r>
-        <w:rPr>
-          <w:rFonts w:ascii="Arial" w:hAnsi="Arial" w:eastAsia="黑体"/>
-          <w:b/>
-          <w:color w:val="000000"/>
-          <w:sz w:val="24"/>
+      <w:r>
+        <w:rPr>
+          <w:b/>
         </w:rPr>
         <w:t>6. 明日计划</w:t>
       </w:r>
     </w:p>
     <w:p>
       <w:pPr>
-        <w:spacing w:line="300" w:lineRule="auto" w:after="20"/>
-      </w:pPr>
-      <w:r>
-        <w:rPr>
-          <w:rFonts w:ascii="Times New Roman" w:hAnsi="Times New Roman" w:eastAsia="宋体"/>
-          <w:b w:val="0"/>
-          <w:color w:val="000000"/>
-          <w:sz w:val="24"/>
-        </w:rPr>
+        <w:spacing w:line="324" w:lineRule="auto"/>
+      </w:pPr>
+      <w:r>
         <w:t>① 推进 GitHub 协作流程规范。</w:t>
       </w:r>
     </w:p>
     <w:p>
       <w:pPr>
-        <w:spacing w:line="300" w:lineRule="auto" w:after="20"/>
-      </w:pPr>
-      <w:r>
-        <w:rPr>
-          <w:rFonts w:ascii="Times New Roman" w:hAnsi="Times New Roman" w:eastAsia="宋体"/>
-          <w:b w:val="0"/>
-          <w:color w:val="000000"/>
-          <w:sz w:val="24"/>
-        </w:rPr>
+        <w:spacing w:line="324" w:lineRule="auto"/>
+      </w:pPr>
+      <w:r>
         <w:t>② 进行本地 MQTT Broker 方案调研，为 PC 模拟节点和监控端开发做准备。</w:t>
       </w:r>
     </w:p>
     <w:p>
       <w:pPr>
+        <w:pBdr>
+          <w:bottom w:val="single" w:sz="6" w:space="1" w:color="auto"/>
+        </w:pBdr>
+        <w:spacing w:after="120"/>
+      </w:pPr>
+    </w:p>
+    <w:p>
+      <w:pPr>
         <w:pStyle w:val="3"/>
-        <w:spacing w:before="200" w:after="80"/>
-      </w:pPr>
-      <w:r>
-        <w:rPr>
-          <w:rFonts w:ascii="Arial" w:hAnsi="Arial" w:eastAsia="黑体"/>
-          <w:b/>
-          <w:color w:val="000000"/>
-          <w:sz w:val="26"/>
-        </w:rPr>
+      </w:pPr>
+      <w:r>
         <w:t>第 2 个工作日：协作流程规范与本地 Broker 验证</w:t>
       </w:r>
     </w:p>
     <w:p>
-      <w:pPr>
-        <w:spacing w:line="336" w:lineRule="auto" w:after="0"/>
-      </w:pPr>
-      <w:r>
-        <w:rPr>
-          <w:rFonts w:ascii="Times New Roman" w:hAnsi="Times New Roman" w:eastAsia="宋体"/>
-          <w:b w:val="0"/>
-          <w:color w:val="000000"/>
-          <w:sz w:val="24"/>
-        </w:rPr>
+      <w:r>
         <w:t>日期：2026年6月9日</w:t>
       </w:r>
     </w:p>
     <w:p>
-      <w:pPr>
-        <w:spacing w:before="80" w:after="40"/>
-      </w:pPr>
-      <w:r>
-        <w:rPr>
-          <w:rFonts w:ascii="Arial" w:hAnsi="Arial" w:eastAsia="黑体"/>
-          <w:b/>
-          <w:color w:val="000000"/>
-          <w:sz w:val="24"/>
+      <w:r>
+        <w:rPr>
+          <w:b/>
         </w:rPr>
         <w:t>1. 今日主要工作内容</w:t>
       </w:r>
     </w:p>
     <w:p>
       <w:pPr>
-        <w:spacing w:line="300" w:lineRule="auto" w:after="40"/>
-        <w:ind w:firstLine="480"/>
-      </w:pPr>
-      <w:r>
-        <w:rPr>
-          <w:rFonts w:ascii="Times New Roman" w:hAnsi="Times New Roman" w:eastAsia="宋体"/>
-          <w:b w:val="0"/>
-          <w:color w:val="000000"/>
-          <w:sz w:val="24"/>
-        </w:rPr>
+        <w:spacing w:line="324" w:lineRule="auto"/>
+      </w:pPr>
+      <w:r>
         <w:t>今天主要围绕 GitHub 协作流程规范和软件侧开发准备开展工作。对小组成员提交的 Issue 和 PR 进行审查，进一步规范“先 Issue、再 PR、审查后合并”的流程；并编写本地 MQTT Broker 与发布订阅测试脚本，为 PC 模拟节点和 Web 监控端开发打基础。</w:t>
       </w:r>
     </w:p>
     <w:p>
-      <w:pPr>
-        <w:spacing w:before="80" w:after="40"/>
-      </w:pPr>
-      <w:r>
-        <w:rPr>
-          <w:rFonts w:ascii="Arial" w:hAnsi="Arial" w:eastAsia="黑体"/>
-          <w:b/>
-          <w:color w:val="000000"/>
-          <w:sz w:val="24"/>
+      <w:r>
+        <w:rPr>
+          <w:b/>
         </w:rPr>
         <w:t>2. 本人完成的具体任务</w:t>
       </w:r>
     </w:p>
     <w:p>
       <w:pPr>
-        <w:spacing w:line="300" w:lineRule="auto" w:after="20"/>
-      </w:pPr>
-      <w:r>
-        <w:rPr>
-          <w:rFonts w:ascii="Times New Roman" w:hAnsi="Times New Roman" w:eastAsia="宋体"/>
-          <w:b w:val="0"/>
-          <w:color w:val="000000"/>
-          <w:sz w:val="24"/>
-        </w:rPr>
+        <w:spacing w:line="324" w:lineRule="auto"/>
+      </w:pPr>
+      <w:r>
         <w:t>① 审查队友提交的 ESP32 硬件节点设计、工程化分析等 Issue 和 PR，整理可复制到评论区的修改建议（文件名补 .md、PR 关联 Issue、文档范围压缩、协议一致性检查等）。</w:t>
       </w:r>
     </w:p>
     <w:p>
       <w:pPr>
-        <w:spacing w:line="300" w:lineRule="auto" w:after="20"/>
-      </w:pPr>
-      <w:r>
-        <w:rPr>
-          <w:rFonts w:ascii="Times New Roman" w:hAnsi="Times New Roman" w:eastAsia="宋体"/>
-          <w:b w:val="0"/>
-          <w:color w:val="000000"/>
-          <w:sz w:val="24"/>
-        </w:rPr>
+        <w:spacing w:line="324" w:lineRule="auto"/>
+      </w:pPr>
+      <w:r>
         <w:t>② 处理 GitHub 分支同步与推送问题，熟悉 fetch、pull --ff-only、merge、push 等操作。</w:t>
       </w:r>
     </w:p>
     <w:p>
       <w:pPr>
-        <w:spacing w:line="300" w:lineRule="auto" w:after="20"/>
-      </w:pPr>
-      <w:r>
-        <w:rPr>
-          <w:rFonts w:ascii="Times New Roman" w:hAnsi="Times New Roman" w:eastAsia="宋体"/>
-          <w:b w:val="0"/>
-          <w:color w:val="000000"/>
-          <w:sz w:val="24"/>
-        </w:rPr>
+        <w:spacing w:line="324" w:lineRule="auto"/>
+      </w:pPr>
+      <w:r>
         <w:t>③ 新增 requirements.txt，记录 paho-mqtt 与 amqtt 依赖。</w:t>
       </w:r>
     </w:p>
     <w:p>
       <w:pPr>
-        <w:spacing w:line="300" w:lineRule="auto" w:after="20"/>
-      </w:pPr>
-      <w:r>
-        <w:rPr>
-          <w:rFonts w:ascii="Times New Roman" w:hAnsi="Times New Roman" w:eastAsia="宋体"/>
-          <w:b w:val="0"/>
-          <w:color w:val="000000"/>
-          <w:sz w:val="24"/>
-        </w:rPr>
+        <w:spacing w:line="324" w:lineRule="auto"/>
+      </w:pPr>
+      <w:r>
         <w:t>④ 编写 scripts/mqtt_broker.py 启动本地轻量 Broker，以及发布/订阅测试脚本。</w:t>
       </w:r>
     </w:p>
     <w:p>
       <w:pPr>
-        <w:spacing w:line="300" w:lineRule="auto" w:after="20"/>
-      </w:pPr>
-      <w:r>
-        <w:rPr>
-          <w:rFonts w:ascii="Times New Roman" w:hAnsi="Times New Roman" w:eastAsia="宋体"/>
-          <w:b w:val="0"/>
-          <w:color w:val="000000"/>
-          <w:sz w:val="24"/>
-        </w:rPr>
+        <w:spacing w:line="324" w:lineRule="auto"/>
+      </w:pPr>
+      <w:r>
         <w:t>⑤ 用 Python 脚本完成 2 个节点、4 类环境数据共 8 条消息的发布订阅验证。</w:t>
       </w:r>
     </w:p>
     <w:p>
-      <w:pPr>
-        <w:spacing w:before="80" w:after="40"/>
-      </w:pPr>
-      <w:r>
-        <w:rPr>
-          <w:rFonts w:ascii="Arial" w:hAnsi="Arial" w:eastAsia="黑体"/>
-          <w:b/>
-          <w:color w:val="000000"/>
-          <w:sz w:val="24"/>
+      <w:r>
+        <w:rPr>
+          <w:b/>
         </w:rPr>
         <w:t>3. 遇到的问题</w:t>
       </w:r>
     </w:p>
     <w:p>
       <w:pPr>
-        <w:spacing w:line="300" w:lineRule="auto" w:after="20"/>
-      </w:pPr>
-      <w:r>
-        <w:rPr>
-          <w:rFonts w:ascii="Times New Roman" w:hAnsi="Times New Roman" w:eastAsia="宋体"/>
-          <w:b w:val="0"/>
-          <w:color w:val="000000"/>
-          <w:sz w:val="24"/>
-        </w:rPr>
+        <w:spacing w:line="324" w:lineRule="auto"/>
+      </w:pPr>
+      <w:r>
         <w:t>① 本地 main 与远程 main 存在差异，直接 push 被拒绝。</w:t>
       </w:r>
     </w:p>
     <w:p>
       <w:pPr>
-        <w:spacing w:line="300" w:lineRule="auto" w:after="20"/>
-      </w:pPr>
-      <w:r>
-        <w:rPr>
-          <w:rFonts w:ascii="Times New Roman" w:hAnsi="Times New Roman" w:eastAsia="宋体"/>
-          <w:b w:val="0"/>
-          <w:color w:val="000000"/>
-          <w:sz w:val="24"/>
-        </w:rPr>
+        <w:spacing w:line="324" w:lineRule="auto"/>
+      </w:pPr>
+      <w:r>
         <w:t>② 队友的 Issue 和 PR 存在任务范围偏大、文件名缺后缀、PR 与 Issue 未关联等问题。</w:t>
       </w:r>
     </w:p>
     <w:p>
-      <w:pPr>
-        <w:spacing w:before="80" w:after="40"/>
-      </w:pPr>
-      <w:r>
-        <w:rPr>
-          <w:rFonts w:ascii="Arial" w:hAnsi="Arial" w:eastAsia="黑体"/>
-          <w:b/>
-          <w:color w:val="000000"/>
-          <w:sz w:val="24"/>
+      <w:r>
+        <w:rPr>
+          <w:b/>
         </w:rPr>
         <w:t>4. 解决方法</w:t>
       </w:r>
     </w:p>
     <w:p>
       <w:pPr>
-        <w:spacing w:line="300" w:lineRule="auto" w:after="20"/>
-      </w:pPr>
-      <w:r>
-        <w:rPr>
-          <w:rFonts w:ascii="Times New Roman" w:hAnsi="Times New Roman" w:eastAsia="宋体"/>
-          <w:b w:val="0"/>
-          <w:color w:val="000000"/>
-          <w:sz w:val="24"/>
-        </w:rPr>
+        <w:spacing w:line="324" w:lineRule="auto"/>
+      </w:pPr>
+      <w:r>
         <w:t>① 先 fetch 再用 pull --ff-only 将本地快进到远程最新，理解了远程更新时不能直接推送的原因。</w:t>
       </w:r>
     </w:p>
     <w:p>
       <w:pPr>
-        <w:spacing w:line="300" w:lineRule="auto" w:after="20"/>
-      </w:pPr>
-      <w:r>
-        <w:rPr>
-          <w:rFonts w:ascii="Times New Roman" w:hAnsi="Times New Roman" w:eastAsia="宋体"/>
-          <w:b w:val="0"/>
-          <w:color w:val="000000"/>
-          <w:sz w:val="24"/>
-        </w:rPr>
+        <w:spacing w:line="324" w:lineRule="auto"/>
+      </w:pPr>
+      <w:r>
         <w:t>② 采用先审查、再评论建议、最后由对应负责人修改的方式处理队友 PR，既规范又保留各自工作过程。</w:t>
       </w:r>
     </w:p>
     <w:p>
-      <w:pPr>
-        <w:spacing w:before="80" w:after="40"/>
-      </w:pPr>
-      <w:r>
-        <w:rPr>
-          <w:rFonts w:ascii="Arial" w:hAnsi="Arial" w:eastAsia="黑体"/>
-          <w:b/>
-          <w:color w:val="000000"/>
-          <w:sz w:val="24"/>
+      <w:r>
+        <w:rPr>
+          <w:b/>
         </w:rPr>
         <w:t>5. 今日成果</w:t>
       </w:r>
     </w:p>
     <w:p>
       <w:pPr>
-        <w:spacing w:line="300" w:lineRule="auto" w:after="20"/>
-      </w:pPr>
-      <w:r>
-        <w:rPr>
-          <w:rFonts w:ascii="Times New Roman" w:hAnsi="Times New Roman" w:eastAsia="宋体"/>
-          <w:b w:val="0"/>
-          <w:color w:val="000000"/>
-          <w:sz w:val="24"/>
-        </w:rPr>
+        <w:spacing w:line="324" w:lineRule="auto"/>
+      </w:pPr>
+      <w:r>
         <w:t>① 完成 Issue 与 PR 审查，明确队友 PR 合并前需修改的问题。</w:t>
       </w:r>
     </w:p>
     <w:p>
       <w:pPr>
-        <w:spacing w:line="300" w:lineRule="auto" w:after="20"/>
-      </w:pPr>
-      <w:r>
-        <w:rPr>
-          <w:rFonts w:ascii="Times New Roman" w:hAnsi="Times New Roman" w:eastAsia="宋体"/>
-          <w:b w:val="0"/>
-          <w:color w:val="000000"/>
-          <w:sz w:val="24"/>
-        </w:rPr>
+        <w:spacing w:line="324" w:lineRule="auto"/>
+      </w:pPr>
+      <w:r>
         <w:t>② 完成本地 Broker 与发布订阅测试脚本，成功收发 8 条测试消息。</w:t>
       </w:r>
     </w:p>
     <w:p>
-      <w:pPr>
-        <w:spacing w:before="80" w:after="40"/>
-      </w:pPr>
-      <w:r>
-        <w:rPr>
-          <w:rFonts w:ascii="Arial" w:hAnsi="Arial" w:eastAsia="黑体"/>
-          <w:b/>
-          <w:color w:val="000000"/>
-          <w:sz w:val="24"/>
+      <w:r>
+        <w:rPr>
+          <w:b/>
         </w:rPr>
         <w:t>6. 明日计划</w:t>
       </w:r>
     </w:p>
     <w:p>
       <w:pPr>
-        <w:spacing w:line="300" w:lineRule="auto" w:after="20"/>
-      </w:pPr>
-      <w:r>
-        <w:rPr>
-          <w:rFonts w:ascii="Times New Roman" w:hAnsi="Times New Roman" w:eastAsia="宋体"/>
-          <w:b w:val="0"/>
-          <w:color w:val="000000"/>
-          <w:sz w:val="24"/>
-        </w:rPr>
+        <w:spacing w:line="324" w:lineRule="auto"/>
+      </w:pPr>
+      <w:r>
         <w:t>① 实现 PC 模拟环境监测节点。</w:t>
       </w:r>
     </w:p>
     <w:p>
       <w:pPr>
-        <w:spacing w:line="300" w:lineRule="auto" w:after="20"/>
-      </w:pPr>
-      <w:r>
-        <w:rPr>
-          <w:rFonts w:ascii="Times New Roman" w:hAnsi="Times New Roman" w:eastAsia="宋体"/>
-          <w:b w:val="0"/>
-          <w:color w:val="000000"/>
-          <w:sz w:val="24"/>
-        </w:rPr>
+        <w:spacing w:line="324" w:lineRule="auto"/>
+      </w:pPr>
+      <w:r>
         <w:t>② 实现 Web 监控端订阅显示功能。</w:t>
       </w:r>
     </w:p>
     <w:p>
       <w:pPr>
+        <w:pBdr>
+          <w:bottom w:val="single" w:sz="6" w:space="1" w:color="auto"/>
+        </w:pBdr>
+        <w:spacing w:after="120"/>
+      </w:pPr>
+    </w:p>
+    <w:p>
+      <w:pPr>
         <w:pStyle w:val="3"/>
-        <w:spacing w:before="200" w:after="80"/>
-      </w:pPr>
-      <w:r>
-        <w:rPr>
-          <w:rFonts w:ascii="Arial" w:hAnsi="Arial" w:eastAsia="黑体"/>
-          <w:b/>
-          <w:color w:val="000000"/>
-          <w:sz w:val="26"/>
-        </w:rPr>
+      </w:pPr>
+      <w:r>
         <w:t>第 3 个工作日：PC 模拟节点与 Web 监控端实现</w:t>
       </w:r>
     </w:p>
     <w:p>
-      <w:pPr>
-        <w:spacing w:line="336" w:lineRule="auto" w:after="0"/>
-      </w:pPr>
-      <w:r>
-        <w:rPr>
-          <w:rFonts w:ascii="Times New Roman" w:hAnsi="Times New Roman" w:eastAsia="宋体"/>
-          <w:b w:val="0"/>
-          <w:color w:val="000000"/>
-          <w:sz w:val="24"/>
-        </w:rPr>
+      <w:r>
         <w:t>日期：2026年6月10日</w:t>
       </w:r>
     </w:p>
     <w:p>
-      <w:pPr>
-        <w:spacing w:before="80" w:after="40"/>
-      </w:pPr>
-      <w:r>
-        <w:rPr>
-          <w:rFonts w:ascii="Arial" w:hAnsi="Arial" w:eastAsia="黑体"/>
-          <w:b/>
-          <w:color w:val="000000"/>
-          <w:sz w:val="24"/>
+      <w:r>
+        <w:rPr>
+          <w:b/>
         </w:rPr>
         <w:t>1. 今日主要工作内容</w:t>
       </w:r>
     </w:p>
     <w:p>
       <w:pPr>
-        <w:spacing w:line="300" w:lineRule="auto" w:after="40"/>
-        <w:ind w:firstLine="480"/>
-      </w:pPr>
-      <w:r>
-        <w:rPr>
-          <w:rFonts w:ascii="Times New Roman" w:hAnsi="Times New Roman" w:eastAsia="宋体"/>
-          <w:b w:val="0"/>
-          <w:color w:val="000000"/>
-          <w:sz w:val="24"/>
-        </w:rPr>
+        <w:spacing w:line="324" w:lineRule="auto"/>
+      </w:pPr>
+      <w:r>
         <w:t>今天是中期检查前的最后一个工作日，主要完成软件侧两个核心模块——PC 模拟节点和 Web 监控端，并审查合并队友的 ESP32 设计文档。目标是让“模拟节点 → Broker → 监控端显示”的完整软件链路真正跑起来，为中期检查提供可演示、可验证的成果。</w:t>
       </w:r>
     </w:p>
     <w:p>
-      <w:pPr>
-        <w:spacing w:before="80" w:after="40"/>
-      </w:pPr>
-      <w:r>
-        <w:rPr>
-          <w:rFonts w:ascii="Arial" w:hAnsi="Arial" w:eastAsia="黑体"/>
-          <w:b/>
-          <w:color w:val="000000"/>
-          <w:sz w:val="24"/>
+      <w:r>
+        <w:rPr>
+          <w:b/>
         </w:rPr>
         <w:t>2. 本人完成的具体任务</w:t>
       </w:r>
     </w:p>
     <w:p>
       <w:pPr>
-        <w:spacing w:line="300" w:lineRule="auto" w:after="20"/>
-      </w:pPr>
-      <w:r>
-        <w:rPr>
-          <w:rFonts w:ascii="Times New Roman" w:hAnsi="Times New Roman" w:eastAsia="宋体"/>
-          <w:b w:val="0"/>
-          <w:color w:val="000000"/>
-          <w:sz w:val="24"/>
-        </w:rPr>
+        <w:spacing w:line="324" w:lineRule="auto"/>
+      </w:pPr>
+      <w:r>
         <w:t>① 实现 PC 模拟节点 sim_node.py，支持节点编号、数据类型、上传周期和 QoS 等命令行配置。</w:t>
       </w:r>
     </w:p>
     <w:p>
       <w:pPr>
-        <w:spacing w:line="300" w:lineRule="auto" w:after="20"/>
-      </w:pPr>
-      <w:r>
-        <w:rPr>
-          <w:rFonts w:ascii="Times New Roman" w:hAnsi="Times New Roman" w:eastAsia="宋体"/>
-          <w:b w:val="0"/>
-          <w:color w:val="000000"/>
-          <w:sz w:val="24"/>
-        </w:rPr>
+        <w:spacing w:line="324" w:lineRule="auto"/>
+      </w:pPr>
+      <w:r>
         <w:t>② 采用均值回归随机游走生成温湿度、光照、噪声等数据，使其平滑变化、贴近真实环境。</w:t>
       </w:r>
     </w:p>
     <w:p>
       <w:pPr>
-        <w:spacing w:line="300" w:lineRule="auto" w:after="20"/>
-      </w:pPr>
-      <w:r>
-        <w:rPr>
-          <w:rFonts w:ascii="Times New Roman" w:hAnsi="Times New Roman" w:eastAsia="宋体"/>
-          <w:b w:val="0"/>
-          <w:color w:val="000000"/>
-          <w:sz w:val="24"/>
-        </w:rPr>
+        <w:spacing w:line="324" w:lineRule="auto"/>
+      </w:pPr>
+      <w:r>
         <w:t>③ 实现断线自动重连与 QoS 1 离线排队补发，经双节点并发与 Broker 重启验证重连能力。</w:t>
       </w:r>
     </w:p>
     <w:p>
       <w:pPr>
-        <w:spacing w:line="300" w:lineRule="auto" w:after="20"/>
-      </w:pPr>
-      <w:r>
-        <w:rPr>
-          <w:rFonts w:ascii="Times New Roman" w:hAnsi="Times New Roman" w:eastAsia="宋体"/>
-          <w:b w:val="0"/>
-          <w:color w:val="000000"/>
-          <w:sz w:val="24"/>
-        </w:rPr>
+        <w:spacing w:line="324" w:lineRule="auto"/>
+      </w:pPr>
+      <w:r>
         <w:t>④ 实现 Web 监控端 web_monitor.py，基于 Flask + SSE 网页实时刷新，无需手动刷新。</w:t>
       </w:r>
     </w:p>
     <w:p>
       <w:pPr>
-        <w:spacing w:line="300" w:lineRule="auto" w:after="20"/>
-      </w:pPr>
-      <w:r>
-        <w:rPr>
-          <w:rFonts w:ascii="Times New Roman" w:hAnsi="Times New Roman" w:eastAsia="宋体"/>
-          <w:b w:val="0"/>
-          <w:color w:val="000000"/>
-          <w:sz w:val="24"/>
-        </w:rPr>
+        <w:spacing w:line="324" w:lineRule="auto"/>
+      </w:pPr>
+      <w:r>
         <w:t>⑤ 实现节点编号、数据类型中文映射、数值、单位、上传/接收时间显示，记录毫秒级接收日志，15 秒无数据自动标记离线。</w:t>
       </w:r>
     </w:p>
     <w:p>
       <w:pPr>
-        <w:spacing w:line="300" w:lineRule="auto" w:after="20"/>
-      </w:pPr>
-      <w:r>
-        <w:rPr>
-          <w:rFonts w:ascii="Times New Roman" w:hAnsi="Times New Roman" w:eastAsia="宋体"/>
-          <w:b w:val="0"/>
-          <w:color w:val="000000"/>
-          <w:sz w:val="24"/>
-        </w:rPr>
+        <w:spacing w:line="324" w:lineRule="auto"/>
+      </w:pPr>
+      <w:r>
         <w:t>⑥ 编写两模块的运行验证文档；审查并合并队友孙博宇的两个 ESP32 设计 PR，合并前指出文件名与数据类型口径问题。</w:t>
       </w:r>
     </w:p>
     <w:p>
-      <w:pPr>
-        <w:spacing w:before="80" w:after="40"/>
-      </w:pPr>
-      <w:r>
-        <w:rPr>
-          <w:rFonts w:ascii="Arial" w:hAnsi="Arial" w:eastAsia="黑体"/>
-          <w:b/>
-          <w:color w:val="000000"/>
-          <w:sz w:val="24"/>
+      <w:r>
+        <w:rPr>
+          <w:b/>
         </w:rPr>
         <w:t>3. 遇到的问题</w:t>
       </w:r>
     </w:p>
     <w:p>
       <w:pPr>
-        <w:spacing w:line="300" w:lineRule="auto" w:after="20"/>
-      </w:pPr>
-      <w:r>
-        <w:rPr>
-          <w:rFonts w:ascii="Times New Roman" w:hAnsi="Times New Roman" w:eastAsia="宋体"/>
-          <w:b w:val="0"/>
-          <w:color w:val="000000"/>
-          <w:sz w:val="24"/>
-        </w:rPr>
+        <w:spacing w:line="324" w:lineRule="auto"/>
+      </w:pPr>
+      <w:r>
         <w:t>① 纯随机数生成的模拟数据会无规律剧烈跳变，不像真实环境数据。</w:t>
       </w:r>
     </w:p>
     <w:p>
       <w:pPr>
-        <w:spacing w:line="300" w:lineRule="auto" w:after="20"/>
-      </w:pPr>
-      <w:r>
-        <w:rPr>
-          <w:rFonts w:ascii="Times New Roman" w:hAnsi="Times New Roman" w:eastAsia="宋体"/>
-          <w:b w:val="0"/>
-          <w:color w:val="000000"/>
-          <w:sz w:val="24"/>
-        </w:rPr>
+        <w:spacing w:line="324" w:lineRule="auto"/>
+      </w:pPr>
+      <w:r>
         <w:t>② 监控端需要在不刷新页面的情况下实时更新数据。</w:t>
       </w:r>
     </w:p>
     <w:p>
-      <w:pPr>
-        <w:spacing w:before="80" w:after="40"/>
-      </w:pPr>
-      <w:r>
-        <w:rPr>
-          <w:rFonts w:ascii="Arial" w:hAnsi="Arial" w:eastAsia="黑体"/>
-          <w:b/>
-          <w:color w:val="000000"/>
-          <w:sz w:val="24"/>
+      <w:r>
+        <w:rPr>
+          <w:b/>
         </w:rPr>
         <w:t>4. 解决方法</w:t>
       </w:r>
     </w:p>
     <w:p>
       <w:pPr>
-        <w:spacing w:line="300" w:lineRule="auto" w:after="20"/>
-      </w:pPr>
-      <w:r>
-        <w:rPr>
-          <w:rFonts w:ascii="Times New Roman" w:hAnsi="Times New Roman" w:eastAsia="宋体"/>
-          <w:b w:val="0"/>
-          <w:color w:val="000000"/>
-          <w:sz w:val="24"/>
-        </w:rPr>
+        <w:spacing w:line="324" w:lineRule="auto"/>
+      </w:pPr>
+      <w:r>
         <w:t>① 采用均值回归随机游走，每步向基准值回归并叠加高斯噪声，使数据在合理范围内平滑漂移。</w:t>
       </w:r>
     </w:p>
     <w:p>
       <w:pPr>
-        <w:spacing w:line="300" w:lineRule="auto" w:after="20"/>
-      </w:pPr>
-      <w:r>
-        <w:rPr>
-          <w:rFonts w:ascii="Times New Roman" w:hAnsi="Times New Roman" w:eastAsia="宋体"/>
-          <w:b w:val="0"/>
-          <w:color w:val="000000"/>
-          <w:sz w:val="24"/>
-        </w:rPr>
+        <w:spacing w:line="324" w:lineRule="auto"/>
+      </w:pPr>
+      <w:r>
         <w:t>② 采用 SSE，由后端在收到新消息时主动推送到浏览器。</w:t>
       </w:r>
     </w:p>
     <w:p>
-      <w:pPr>
-        <w:spacing w:before="80" w:after="40"/>
-      </w:pPr>
-      <w:r>
-        <w:rPr>
-          <w:rFonts w:ascii="Arial" w:hAnsi="Arial" w:eastAsia="黑体"/>
-          <w:b/>
-          <w:color w:val="000000"/>
-          <w:sz w:val="24"/>
+      <w:r>
+        <w:rPr>
+          <w:b/>
         </w:rPr>
         <w:t>5. 今日成果</w:t>
       </w:r>
     </w:p>
     <w:p>
       <w:pPr>
-        <w:spacing w:line="300" w:lineRule="auto" w:after="20"/>
-      </w:pPr>
-      <w:r>
-        <w:rPr>
-          <w:rFonts w:ascii="Times New Roman" w:hAnsi="Times New Roman" w:eastAsia="宋体"/>
-          <w:b w:val="0"/>
-          <w:color w:val="000000"/>
-          <w:sz w:val="24"/>
-        </w:rPr>
+        <w:spacing w:line="324" w:lineRule="auto"/>
+      </w:pPr>
+      <w:r>
         <w:t>① 完成 PC 模拟节点（Issue #16）与 Web 监控端（Issue #18）及验证文档。</w:t>
       </w:r>
     </w:p>
     <w:p>
       <w:pPr>
-        <w:spacing w:line="300" w:lineRule="auto" w:after="20"/>
-      </w:pPr>
-      <w:r>
-        <w:rPr>
-          <w:rFonts w:ascii="Times New Roman" w:hAnsi="Times New Roman" w:eastAsia="宋体"/>
-          <w:b w:val="0"/>
-          <w:color w:val="000000"/>
-          <w:sz w:val="24"/>
-        </w:rPr>
+        <w:spacing w:line="324" w:lineRule="auto"/>
+      </w:pPr>
+      <w:r>
         <w:t>② 打通“模拟节点 → Broker → 监控端网页显示”完整软件链路，并完成队友两个 ESP32 PR 的审查合并。</w:t>
       </w:r>
     </w:p>
     <w:p>
-      <w:pPr>
-        <w:spacing w:before="80" w:after="40"/>
-      </w:pPr>
-      <w:r>
-        <w:rPr>
-          <w:rFonts w:ascii="Arial" w:hAnsi="Arial" w:eastAsia="黑体"/>
-          <w:b/>
-          <w:color w:val="000000"/>
-          <w:sz w:val="24"/>
+      <w:r>
+        <w:rPr>
+          <w:b/>
         </w:rPr>
         <w:t>6. 明日计划</w:t>
       </w:r>
     </w:p>
     <w:p>
       <w:pPr>
-        <w:spacing w:line="300" w:lineRule="auto" w:after="20"/>
-      </w:pPr>
-      <w:r>
-        <w:rPr>
-          <w:rFonts w:ascii="Times New Roman" w:hAnsi="Times New Roman" w:eastAsia="宋体"/>
-          <w:b w:val="0"/>
-          <w:color w:val="000000"/>
-          <w:sz w:val="24"/>
-        </w:rPr>
+        <w:spacing w:line="324" w:lineRule="auto"/>
+      </w:pPr>
+      <w:r>
         <w:t>① 参加课程设计中期检查。</w:t>
       </w:r>
     </w:p>
     <w:p>
       <w:pPr>
-        <w:spacing w:line="300" w:lineRule="auto" w:after="20"/>
-      </w:pPr>
-      <w:r>
-        <w:rPr>
-          <w:rFonts w:ascii="Times New Roman" w:hAnsi="Times New Roman" w:eastAsia="宋体"/>
-          <w:b w:val="0"/>
-          <w:color w:val="000000"/>
-          <w:sz w:val="24"/>
-        </w:rPr>
+        <w:spacing w:line="324" w:lineRule="auto"/>
+      </w:pPr>
+      <w:r>
         <w:t>② 根据老师检查意见调整后续方案。</w:t>
       </w:r>
     </w:p>
     <w:p>
       <w:pPr>
+        <w:pBdr>
+          <w:bottom w:val="single" w:sz="6" w:space="1" w:color="auto"/>
+        </w:pBdr>
+        <w:spacing w:after="120"/>
+      </w:pPr>
+    </w:p>
+    <w:p>
+      <w:pPr>
         <w:pStyle w:val="3"/>
-        <w:spacing w:before="200" w:after="80"/>
-      </w:pPr>
-      <w:r>
-        <w:rPr>
-          <w:rFonts w:ascii="Arial" w:hAnsi="Arial" w:eastAsia="黑体"/>
-          <w:b/>
-          <w:color w:val="000000"/>
-          <w:sz w:val="26"/>
-        </w:rPr>
+      </w:pPr>
+      <w:r>
         <w:t>第 4 个工作日：中期检查、负载建模、MQTT 升级与性能实验</w:t>
       </w:r>
     </w:p>
     <w:p>
-      <w:pPr>
-        <w:spacing w:line="336" w:lineRule="auto" w:after="0"/>
-      </w:pPr>
-      <w:r>
-        <w:rPr>
-          <w:rFonts w:ascii="Times New Roman" w:hAnsi="Times New Roman" w:eastAsia="宋体"/>
-          <w:b w:val="0"/>
-          <w:color w:val="000000"/>
-          <w:sz w:val="24"/>
-        </w:rPr>
+      <w:r>
         <w:t>日期：2026年6月11日</w:t>
       </w:r>
     </w:p>
     <w:p>
-      <w:pPr>
-        <w:spacing w:before="80" w:after="40"/>
-      </w:pPr>
-      <w:r>
-        <w:rPr>
-          <w:rFonts w:ascii="Arial" w:hAnsi="Arial" w:eastAsia="黑体"/>
-          <w:b/>
-          <w:color w:val="000000"/>
-          <w:sz w:val="24"/>
+      <w:r>
+        <w:rPr>
+          <w:b/>
         </w:rPr>
         <w:t>1. 今日主要工作内容</w:t>
       </w:r>
     </w:p>
     <w:p>
       <w:pPr>
-        <w:spacing w:line="300" w:lineRule="auto" w:after="40"/>
-        <w:ind w:firstLine="480"/>
-      </w:pPr>
-      <w:r>
-        <w:rPr>
-          <w:rFonts w:ascii="Times New Roman" w:hAnsi="Times New Roman" w:eastAsia="宋体"/>
-          <w:b w:val="0"/>
-          <w:color w:val="000000"/>
-          <w:sz w:val="24"/>
-        </w:rPr>
+        <w:spacing w:line="324" w:lineRule="auto"/>
+      </w:pPr>
+      <w:r>
         <w:t>今天上午参加中期检查。老师指出当前方案功能完整，但还需体现“方案要由需求驱动”和“要充分考虑成本”。下午围绕反馈重新梳理工作，确定“需求建模 → 实验验证 → 需求计算器”的新主线，并开始密集推进网络负载建模、Broker 升级与性能实验。</w:t>
       </w:r>
     </w:p>
     <w:p>
-      <w:pPr>
-        <w:spacing w:before="80" w:after="40"/>
-      </w:pPr>
-      <w:r>
-        <w:rPr>
-          <w:rFonts w:ascii="Arial" w:hAnsi="Arial" w:eastAsia="黑体"/>
-          <w:b/>
-          <w:color w:val="000000"/>
-          <w:sz w:val="24"/>
+      <w:r>
+        <w:rPr>
+          <w:b/>
         </w:rPr>
         <w:t>2. 本人完成的具体任务</w:t>
       </w:r>
     </w:p>
     <w:p>
       <w:pPr>
-        <w:spacing w:line="300" w:lineRule="auto" w:after="20"/>
-      </w:pPr>
-      <w:r>
-        <w:rPr>
-          <w:rFonts w:ascii="Times New Roman" w:hAnsi="Times New Roman" w:eastAsia="宋体"/>
-          <w:b w:val="0"/>
-          <w:color w:val="000000"/>
-          <w:sz w:val="24"/>
-        </w:rPr>
+        <w:spacing w:line="324" w:lineRule="auto"/>
+      </w:pPr>
+      <w:r>
         <w:t>① 完成中期检查汇报。</w:t>
       </w:r>
     </w:p>
     <w:p>
       <w:pPr>
-        <w:spacing w:line="300" w:lineRule="auto" w:after="20"/>
-      </w:pPr>
-      <w:r>
-        <w:rPr>
-          <w:rFonts w:ascii="Times New Roman" w:hAnsi="Times New Roman" w:eastAsia="宋体"/>
-          <w:b w:val="0"/>
-          <w:color w:val="000000"/>
-          <w:sz w:val="24"/>
-        </w:rPr>
+        <w:spacing w:line="324" w:lineRule="auto"/>
+      </w:pPr>
+      <w:r>
         <w:t>② 建立“需求参数 → 网络负载 → 服务器配置 → 成本”的通用计算方法，完成《网络负载与服务器配置计算方法建模》（Issue #24）。</w:t>
       </w:r>
     </w:p>
     <w:p>
       <w:pPr>
-        <w:spacing w:line="300" w:lineRule="auto" w:after="20"/>
-      </w:pPr>
-      <w:r>
-        <w:rPr>
-          <w:rFonts w:ascii="Times New Roman" w:hAnsi="Times New Roman" w:eastAsia="宋体"/>
-          <w:b w:val="0"/>
-          <w:color w:val="000000"/>
-          <w:sz w:val="24"/>
-        </w:rPr>
+        <w:spacing w:line="324" w:lineRule="auto"/>
+      </w:pPr>
+      <w:r>
         <w:t>③ 完成 MQTT 方案升级（Issue #25）：Broker 由实验性 amqtt 升级为生产级 EMQX 5.8.9，客户端升级 MQTT 5.0（Topic Alias、会话过期），新增 json / json-min / msgpack 三种 payload 格式。</w:t>
       </w:r>
     </w:p>
     <w:p>
       <w:pPr>
-        <w:spacing w:line="300" w:lineRule="auto" w:after="20"/>
-      </w:pPr>
-      <w:r>
-        <w:rPr>
-          <w:rFonts w:ascii="Times New Roman" w:hAnsi="Times New Roman" w:eastAsia="宋体"/>
-          <w:b w:val="0"/>
-          <w:color w:val="000000"/>
-          <w:sz w:val="24"/>
-        </w:rPr>
+        <w:spacing w:line="324" w:lineRule="auto"/>
+      </w:pPr>
+      <w:r>
         <w:t>④ 因本地 Windows 不便做大规模压测，租用一台阿里云服务器作为实验台架，部署 EMQX 与 emqtt_bench。</w:t>
       </w:r>
     </w:p>
     <w:p>
       <w:pPr>
-        <w:spacing w:line="300" w:lineRule="auto" w:after="20"/>
-      </w:pPr>
-      <w:r>
-        <w:rPr>
-          <w:rFonts w:ascii="Times New Roman" w:hAnsi="Times New Roman" w:eastAsia="宋体"/>
-          <w:b w:val="0"/>
-          <w:color w:val="000000"/>
-          <w:sz w:val="24"/>
-        </w:rPr>
+        <w:spacing w:line="324" w:lineRule="auto"/>
+      </w:pPr>
+      <w:r>
         <w:t>⑤ 完成性能实验（Issue #27）：协议开销抓包矩阵、EMQX 容量与吞吐压测（5 万连接 / 5 万条每秒）、amqtt 对照、跨公网延迟实测，并把实测系数回填建模文档。</w:t>
       </w:r>
     </w:p>
     <w:p>
       <w:pPr>
-        <w:spacing w:line="300" w:lineRule="auto" w:after="20"/>
-      </w:pPr>
-      <w:r>
-        <w:rPr>
-          <w:rFonts w:ascii="Times New Roman" w:hAnsi="Times New Roman" w:eastAsia="宋体"/>
-          <w:b w:val="0"/>
-          <w:color w:val="000000"/>
-          <w:sz w:val="24"/>
-        </w:rPr>
+        <w:spacing w:line="324" w:lineRule="auto"/>
+      </w:pPr>
+      <w:r>
         <w:t>⑥ 完成需求计算器（Issue #33）：监控端新增 /calculator 页面，输入需求即输出负载、配置与成本。</w:t>
       </w:r>
     </w:p>
     <w:p>
       <w:pPr>
-        <w:spacing w:line="300" w:lineRule="auto" w:after="20"/>
-      </w:pPr>
-      <w:r>
-        <w:rPr>
-          <w:rFonts w:ascii="Times New Roman" w:hAnsi="Times New Roman" w:eastAsia="宋体"/>
-          <w:b w:val="0"/>
-          <w:color w:val="000000"/>
-          <w:sz w:val="24"/>
-        </w:rPr>
+        <w:spacing w:line="324" w:lineRule="auto"/>
+      </w:pPr>
+      <w:r>
         <w:t>⑦ 补充场景实景压测与稳定性验证：2 万连接 30 分钟零掉线、转发送达 99.96%、断线重连 5.2 秒。</w:t>
       </w:r>
     </w:p>
     <w:p>
-      <w:pPr>
-        <w:spacing w:before="80" w:after="40"/>
-      </w:pPr>
-      <w:r>
-        <w:rPr>
-          <w:rFonts w:ascii="Arial" w:hAnsi="Arial" w:eastAsia="黑体"/>
-          <w:b/>
-          <w:color w:val="000000"/>
-          <w:sz w:val="24"/>
+      <w:r>
+        <w:rPr>
+          <w:b/>
         </w:rPr>
         <w:t>3. 遇到的问题</w:t>
       </w:r>
     </w:p>
     <w:p>
       <w:pPr>
-        <w:spacing w:line="300" w:lineRule="auto" w:after="20"/>
-      </w:pPr>
-      <w:r>
-        <w:rPr>
-          <w:rFonts w:ascii="Times New Roman" w:hAnsi="Times New Roman" w:eastAsia="宋体"/>
-          <w:b w:val="0"/>
-          <w:color w:val="000000"/>
-          <w:sz w:val="24"/>
-        </w:rPr>
+        <w:spacing w:line="324" w:lineRule="auto"/>
+      </w:pPr>
+      <w:r>
         <w:t>① 老师指出原方案缺少明确的需求依据与成本分析。</w:t>
       </w:r>
     </w:p>
     <w:p>
       <w:pPr>
-        <w:spacing w:line="300" w:lineRule="auto" w:after="20"/>
-      </w:pPr>
-      <w:r>
-        <w:rPr>
-          <w:rFonts w:ascii="Times New Roman" w:hAnsi="Times New Roman" w:eastAsia="宋体"/>
-          <w:b w:val="0"/>
-          <w:color w:val="000000"/>
-          <w:sz w:val="24"/>
-        </w:rPr>
+        <w:spacing w:line="324" w:lineRule="auto"/>
+      </w:pPr>
+      <w:r>
         <w:t>② 本地笔记本不适合做几万连接压测，作为容量基准也不具备“可购买配置”的代表性。</w:t>
       </w:r>
     </w:p>
     <w:p>
-      <w:pPr>
-        <w:spacing w:before="80" w:after="40"/>
-      </w:pPr>
-      <w:r>
-        <w:rPr>
-          <w:rFonts w:ascii="Arial" w:hAnsi="Arial" w:eastAsia="黑体"/>
-          <w:b/>
-          <w:color w:val="000000"/>
-          <w:sz w:val="24"/>
+      <w:r>
+        <w:rPr>
+          <w:b/>
         </w:rPr>
         <w:t>4. 解决方法</w:t>
       </w:r>
     </w:p>
     <w:p>
       <w:pPr>
-        <w:spacing w:line="300" w:lineRule="auto" w:after="20"/>
-      </w:pPr>
-      <w:r>
-        <w:rPr>
-          <w:rFonts w:ascii="Times New Roman" w:hAnsi="Times New Roman" w:eastAsia="宋体"/>
-          <w:b w:val="0"/>
-          <w:color w:val="000000"/>
-          <w:sz w:val="24"/>
-        </w:rPr>
+        <w:spacing w:line="324" w:lineRule="auto"/>
+      </w:pPr>
+      <w:r>
         <w:t>① 建立通用计算模型，把方案选择变成可由需求参数推导的过程，而非拍脑袋决定。</w:t>
       </w:r>
     </w:p>
     <w:p>
       <w:pPr>
-        <w:spacing w:line="300" w:lineRule="auto" w:after="20"/>
-      </w:pPr>
-      <w:r>
-        <w:rPr>
-          <w:rFonts w:ascii="Times New Roman" w:hAnsi="Times New Roman" w:eastAsia="宋体"/>
-          <w:b w:val="0"/>
-          <w:color w:val="000000"/>
-          <w:sz w:val="24"/>
-        </w:rPr>
+        <w:spacing w:line="324" w:lineRule="auto"/>
+      </w:pPr>
+      <w:r>
         <w:t>② 用 amqtt 作对照组同条件压测，用数据对比说明 EMQX 的容量与吞吐优势；租用配置明确的云服务器，使容量曲线可对应“什么配置支撑多少节点、成本多少”。</w:t>
       </w:r>
     </w:p>
     <w:p>
-      <w:pPr>
-        <w:spacing w:before="80" w:after="40"/>
-      </w:pPr>
-      <w:r>
-        <w:rPr>
-          <w:rFonts w:ascii="Arial" w:hAnsi="Arial" w:eastAsia="黑体"/>
-          <w:b/>
-          <w:color w:val="000000"/>
-          <w:sz w:val="24"/>
+      <w:r>
+        <w:rPr>
+          <w:b/>
         </w:rPr>
         <w:t>5. 今日成果</w:t>
       </w:r>
     </w:p>
     <w:p>
       <w:pPr>
-        <w:spacing w:line="300" w:lineRule="auto" w:after="20"/>
-      </w:pPr>
-      <w:r>
-        <w:rPr>
-          <w:rFonts w:ascii="Times New Roman" w:hAnsi="Times New Roman" w:eastAsia="宋体"/>
-          <w:b w:val="0"/>
-          <w:color w:val="000000"/>
-          <w:sz w:val="24"/>
-        </w:rPr>
+        <w:spacing w:line="324" w:lineRule="auto"/>
+      </w:pPr>
+      <w:r>
         <w:t>① 完成中期汇报、负载与成本建模文档、MQTT 升级、性能实验（抓包/压测/对照/延迟并校准系数）与需求计算器初版。</w:t>
       </w:r>
     </w:p>
     <w:p>
-      <w:pPr>
-        <w:spacing w:before="80" w:after="40"/>
-      </w:pPr>
-      <w:r>
-        <w:rPr>
-          <w:rFonts w:ascii="Arial" w:hAnsi="Arial" w:eastAsia="黑体"/>
-          <w:b/>
-          <w:color w:val="000000"/>
-          <w:sz w:val="24"/>
+      <w:r>
+        <w:rPr>
+          <w:b/>
         </w:rPr>
         <w:t>6. 明日计划</w:t>
       </w:r>
     </w:p>
     <w:p>
       <w:pPr>
-        <w:spacing w:line="300" w:lineRule="auto" w:after="20"/>
-      </w:pPr>
-      <w:r>
-        <w:rPr>
-          <w:rFonts w:ascii="Times New Roman" w:hAnsi="Times New Roman" w:eastAsia="宋体"/>
-          <w:b w:val="0"/>
-          <w:color w:val="000000"/>
-          <w:sz w:val="24"/>
-        </w:rPr>
+        <w:spacing w:line="324" w:lineRule="auto"/>
+      </w:pPr>
+      <w:r>
         <w:t>① 补充满负载与 QoS 丢包实验，使内存建模更严谨。</w:t>
       </w:r>
     </w:p>
     <w:p>
       <w:pPr>
-        <w:spacing w:line="300" w:lineRule="auto" w:after="20"/>
-      </w:pPr>
-      <w:r>
-        <w:rPr>
-          <w:rFonts w:ascii="Times New Roman" w:hAnsi="Times New Roman" w:eastAsia="宋体"/>
-          <w:b w:val="0"/>
-          <w:color w:val="000000"/>
-          <w:sz w:val="24"/>
-        </w:rPr>
+        <w:spacing w:line="324" w:lineRule="auto"/>
+      </w:pPr>
+      <w:r>
         <w:t>② 进一步完善需求计算器的展示与可视化。</w:t>
       </w:r>
     </w:p>
     <w:p>
       <w:pPr>
+        <w:pBdr>
+          <w:bottom w:val="single" w:sz="6" w:space="1" w:color="auto"/>
+        </w:pBdr>
+        <w:spacing w:after="120"/>
+      </w:pPr>
+    </w:p>
+    <w:p>
+      <w:pPr>
         <w:pStyle w:val="3"/>
-        <w:spacing w:before="200" w:after="80"/>
-      </w:pPr>
-      <w:r>
-        <w:rPr>
-          <w:rFonts w:ascii="Arial" w:hAnsi="Arial" w:eastAsia="黑体"/>
-          <w:b/>
-          <w:color w:val="000000"/>
-          <w:sz w:val="26"/>
-        </w:rPr>
+      </w:pPr>
+      <w:r>
         <w:t>第 5 个工作日：补充性能实验与计算器升级</w:t>
       </w:r>
     </w:p>
     <w:p>
-      <w:pPr>
-        <w:spacing w:line="336" w:lineRule="auto" w:after="0"/>
-      </w:pPr>
-      <w:r>
-        <w:rPr>
-          <w:rFonts w:ascii="Times New Roman" w:hAnsi="Times New Roman" w:eastAsia="宋体"/>
-          <w:b w:val="0"/>
-          <w:color w:val="000000"/>
-          <w:sz w:val="24"/>
-        </w:rPr>
+      <w:r>
         <w:t>日期：2026年6月12日</w:t>
       </w:r>
     </w:p>
     <w:p>
-      <w:pPr>
-        <w:spacing w:before="80" w:after="40"/>
-      </w:pPr>
-      <w:r>
-        <w:rPr>
-          <w:rFonts w:ascii="Arial" w:hAnsi="Arial" w:eastAsia="黑体"/>
-          <w:b/>
-          <w:color w:val="000000"/>
-          <w:sz w:val="24"/>
+      <w:r>
+        <w:rPr>
+          <w:b/>
         </w:rPr>
         <w:t>1. 今日主要工作内容</w:t>
       </w:r>
     </w:p>
     <w:p>
       <w:pPr>
-        <w:spacing w:line="300" w:lineRule="auto" w:after="40"/>
-        <w:ind w:firstLine="480"/>
-      </w:pPr>
-      <w:r>
-        <w:rPr>
-          <w:rFonts w:ascii="Times New Roman" w:hAnsi="Times New Roman" w:eastAsia="宋体"/>
-          <w:b w:val="0"/>
-          <w:color w:val="000000"/>
-          <w:sz w:val="24"/>
-        </w:rPr>
+        <w:spacing w:line="324" w:lineRule="auto"/>
+      </w:pPr>
+      <w:r>
         <w:t>今天主要做两方面：一是补充完善性能实验使建模更严谨；二是为 ESP32 硬件节点接入做网络侧准备与对接规范。</w:t>
       </w:r>
     </w:p>
     <w:p>
-      <w:pPr>
-        <w:spacing w:before="80" w:after="40"/>
-      </w:pPr>
-      <w:r>
-        <w:rPr>
-          <w:rFonts w:ascii="Arial" w:hAnsi="Arial" w:eastAsia="黑体"/>
-          <w:b/>
-          <w:color w:val="000000"/>
-          <w:sz w:val="24"/>
+      <w:r>
+        <w:rPr>
+          <w:b/>
         </w:rPr>
         <w:t>2. 本人完成的具体任务</w:t>
       </w:r>
     </w:p>
     <w:p>
       <w:pPr>
-        <w:spacing w:line="300" w:lineRule="auto" w:after="20"/>
-      </w:pPr>
-      <w:r>
-        <w:rPr>
-          <w:rFonts w:ascii="Times New Roman" w:hAnsi="Times New Roman" w:eastAsia="宋体"/>
-          <w:b w:val="0"/>
-          <w:color w:val="000000"/>
-          <w:sz w:val="24"/>
-        </w:rPr>
+        <w:spacing w:line="324" w:lineRule="auto"/>
+      </w:pPr>
+      <w:r>
         <w:t>① 补充满负载连接爬坡实验，发现满负载每连接内存约为空闲的 2.46 倍，说明单一安全系数估算内存不够。</w:t>
       </w:r>
     </w:p>
     <w:p>
       <w:pPr>
-        <w:spacing w:line="300" w:lineRule="auto" w:after="20"/>
-      </w:pPr>
-      <w:r>
-        <w:rPr>
-          <w:rFonts w:ascii="Times New Roman" w:hAnsi="Times New Roman" w:eastAsia="宋体"/>
-          <w:b w:val="0"/>
-          <w:color w:val="000000"/>
-          <w:sz w:val="24"/>
-        </w:rPr>
+        <w:spacing w:line="324" w:lineRule="auto"/>
+      </w:pPr>
+      <w:r>
         <w:t>② 补充 QoS × 丢包实验，发现 MQTT 跑在 TCP 之上、由 TCP 重传兜底，三种 QoS 在持续连接下到达率都接近 100%，代价是延迟随丢包率上升。</w:t>
       </w:r>
     </w:p>
     <w:p>
       <w:pPr>
-        <w:spacing w:line="300" w:lineRule="auto" w:after="20"/>
-      </w:pPr>
-      <w:r>
-        <w:rPr>
-          <w:rFonts w:ascii="Times New Roman" w:hAnsi="Times New Roman" w:eastAsia="宋体"/>
-          <w:b w:val="0"/>
-          <w:color w:val="000000"/>
-          <w:sz w:val="24"/>
-        </w:rPr>
+        <w:spacing w:line="324" w:lineRule="auto"/>
+      </w:pPr>
+      <w:r>
         <w:t>③ 将连接爬坡加密到 10 个档位，使内存拟合曲线更扎实。</w:t>
       </w:r>
     </w:p>
     <w:p>
       <w:pPr>
-        <w:spacing w:line="300" w:lineRule="auto" w:after="20"/>
-      </w:pPr>
-      <w:r>
-        <w:rPr>
-          <w:rFonts w:ascii="Times New Roman" w:hAnsi="Times New Roman" w:eastAsia="宋体"/>
-          <w:b w:val="0"/>
-          <w:color w:val="000000"/>
-          <w:sz w:val="24"/>
-        </w:rPr>
+        <w:spacing w:line="324" w:lineRule="auto"/>
+      </w:pPr>
+      <w:r>
         <w:t>④ 升级需求计算器：内存估算改为“空闲下界 ~ 满负载上界”双模型，前端改为深色仪表盘并用图表展示模型与实测对照。</w:t>
       </w:r>
     </w:p>
     <w:p>
       <w:pPr>
-        <w:spacing w:line="300" w:lineRule="auto" w:after="20"/>
-      </w:pPr>
-      <w:r>
-        <w:rPr>
-          <w:rFonts w:ascii="Times New Roman" w:hAnsi="Times New Roman" w:eastAsia="宋体"/>
-          <w:b w:val="0"/>
-          <w:color w:val="000000"/>
-          <w:sz w:val="24"/>
-        </w:rPr>
+        <w:spacing w:line="324" w:lineRule="auto"/>
+      </w:pPr>
+      <w:r>
         <w:t>⑤ 完成 ESP32 接入网络侧准备（Issue #34）：监控端与模拟节点新增可燃气体、土壤湿度类型映射，建模文档新增接入层容量约束，计算器新增所需 AP 数输出，并整理 ESP32 到网络端对接规范。</w:t>
       </w:r>
     </w:p>
     <w:p>
       <w:pPr>
-        <w:spacing w:line="300" w:lineRule="auto" w:after="20"/>
-      </w:pPr>
-      <w:r>
-        <w:rPr>
-          <w:rFonts w:ascii="Times New Roman" w:hAnsi="Times New Roman" w:eastAsia="宋体"/>
-          <w:b w:val="0"/>
-          <w:color w:val="000000"/>
-          <w:sz w:val="24"/>
-        </w:rPr>
+        <w:spacing w:line="324" w:lineRule="auto"/>
+      </w:pPr>
+      <w:r>
         <w:t>⑥ 针对队友反馈的 ESP32 配网网页不稳定（Issue #35），分析原因并建议改用成熟的 WiFiManager 库。</w:t>
       </w:r>
     </w:p>
     <w:p>
-      <w:pPr>
-        <w:spacing w:before="80" w:after="40"/>
-      </w:pPr>
-      <w:r>
-        <w:rPr>
-          <w:rFonts w:ascii="Arial" w:hAnsi="Arial" w:eastAsia="黑体"/>
-          <w:b/>
-          <w:color w:val="000000"/>
-          <w:sz w:val="24"/>
+      <w:r>
+        <w:rPr>
+          <w:b/>
         </w:rPr>
         <w:t>3. 遇到的问题</w:t>
       </w:r>
     </w:p>
     <w:p>
       <w:pPr>
-        <w:spacing w:line="300" w:lineRule="auto" w:after="20"/>
-      </w:pPr>
-      <w:r>
-        <w:rPr>
-          <w:rFonts w:ascii="Times New Roman" w:hAnsi="Times New Roman" w:eastAsia="宋体"/>
-          <w:b w:val="0"/>
-          <w:color w:val="000000"/>
-          <w:sz w:val="24"/>
-        </w:rPr>
+        <w:spacing w:line="324" w:lineRule="auto"/>
+      </w:pPr>
+      <w:r>
         <w:t>① 早期内存模型用单一安全系数估算，与满负载实测差距较大。</w:t>
       </w:r>
     </w:p>
     <w:p>
       <w:pPr>
-        <w:spacing w:line="300" w:lineRule="auto" w:after="20"/>
-      </w:pPr>
-      <w:r>
-        <w:rPr>
-          <w:rFonts w:ascii="Times New Roman" w:hAnsi="Times New Roman" w:eastAsia="宋体"/>
-          <w:b w:val="0"/>
-          <w:color w:val="000000"/>
-          <w:sz w:val="24"/>
-        </w:rPr>
+        <w:spacing w:line="324" w:lineRule="auto"/>
+      </w:pPr>
+      <w:r>
         <w:t>② 队友 ESP32 固件采集的传感器类型与监控端原有类型不一致。</w:t>
       </w:r>
     </w:p>
     <w:p>
-      <w:pPr>
-        <w:spacing w:before="80" w:after="40"/>
-      </w:pPr>
-      <w:r>
-        <w:rPr>
-          <w:rFonts w:ascii="Arial" w:hAnsi="Arial" w:eastAsia="黑体"/>
-          <w:b/>
-          <w:color w:val="000000"/>
-          <w:sz w:val="24"/>
+      <w:r>
+        <w:rPr>
+          <w:b/>
         </w:rPr>
         <w:t>4. 解决方法</w:t>
       </w:r>
     </w:p>
     <w:p>
       <w:pPr>
-        <w:spacing w:line="300" w:lineRule="auto" w:after="20"/>
-      </w:pPr>
-      <w:r>
-        <w:rPr>
-          <w:rFonts w:ascii="Times New Roman" w:hAnsi="Times New Roman" w:eastAsia="宋体"/>
-          <w:b w:val="0"/>
-          <w:color w:val="000000"/>
-          <w:sz w:val="24"/>
-        </w:rPr>
+        <w:spacing w:line="324" w:lineRule="auto"/>
+      </w:pPr>
+      <w:r>
         <w:t>① 专门做满负载爬坡实验得到满负载内存曲线，把计算器升级为空闲~满负载双模型，选型按满负载上界取值。</w:t>
       </w:r>
     </w:p>
     <w:p>
       <w:pPr>
-        <w:spacing w:line="300" w:lineRule="auto" w:after="20"/>
-      </w:pPr>
-      <w:r>
-        <w:rPr>
-          <w:rFonts w:ascii="Times New Roman" w:hAnsi="Times New Roman" w:eastAsia="宋体"/>
-          <w:b w:val="0"/>
-          <w:color w:val="000000"/>
-          <w:sz w:val="24"/>
-        </w:rPr>
+        <w:spacing w:line="324" w:lineRule="auto"/>
+      </w:pPr>
+      <w:r>
         <w:t>② 在监控端与模拟节点补充对应类型映射与单位，使队友数据正确显示。</w:t>
       </w:r>
     </w:p>
     <w:p>
-      <w:pPr>
-        <w:spacing w:before="80" w:after="40"/>
-      </w:pPr>
-      <w:r>
-        <w:rPr>
-          <w:rFonts w:ascii="Arial" w:hAnsi="Arial" w:eastAsia="黑体"/>
-          <w:b/>
-          <w:color w:val="000000"/>
-          <w:sz w:val="24"/>
+      <w:r>
+        <w:rPr>
+          <w:b/>
         </w:rPr>
         <w:t>5. 今日成果</w:t>
       </w:r>
     </w:p>
     <w:p>
       <w:pPr>
-        <w:spacing w:line="300" w:lineRule="auto" w:after="20"/>
-      </w:pPr>
-      <w:r>
-        <w:rPr>
-          <w:rFonts w:ascii="Times New Roman" w:hAnsi="Times New Roman" w:eastAsia="宋体"/>
-          <w:b w:val="0"/>
-          <w:color w:val="000000"/>
-          <w:sz w:val="24"/>
-        </w:rPr>
+        <w:spacing w:line="324" w:lineRule="auto"/>
+      </w:pPr>
+      <w:r>
         <w:t>① 完成满负载爬坡与 QoS 丢包两项补充实验、计算器内存双模型与可视化升级、ESP32 接入网络侧准备与对接规范。</w:t>
       </w:r>
     </w:p>
     <w:p>
-      <w:pPr>
-        <w:spacing w:before="80" w:after="40"/>
-      </w:pPr>
-      <w:r>
-        <w:rPr>
-          <w:rFonts w:ascii="Arial" w:hAnsi="Arial" w:eastAsia="黑体"/>
-          <w:b/>
-          <w:color w:val="000000"/>
-          <w:sz w:val="24"/>
+      <w:r>
+        <w:rPr>
+          <w:b/>
         </w:rPr>
         <w:t>6. 明日计划</w:t>
       </w:r>
     </w:p>
     <w:p>
       <w:pPr>
-        <w:spacing w:line="300" w:lineRule="auto" w:after="20"/>
-      </w:pPr>
-      <w:r>
-        <w:rPr>
-          <w:rFonts w:ascii="Times New Roman" w:hAnsi="Times New Roman" w:eastAsia="宋体"/>
-          <w:b w:val="0"/>
-          <w:color w:val="000000"/>
-          <w:sz w:val="24"/>
-        </w:rPr>
+        <w:spacing w:line="324" w:lineRule="auto"/>
+      </w:pPr>
+      <w:r>
         <w:t>① 搭建 ESP32 联调所需的服务器环境，验证从硬件节点到监控端的完整链路。</w:t>
       </w:r>
     </w:p>
     <w:p>
       <w:pPr>
+        <w:pBdr>
+          <w:bottom w:val="single" w:sz="6" w:space="1" w:color="auto"/>
+        </w:pBdr>
+        <w:spacing w:after="120"/>
+      </w:pPr>
+    </w:p>
+    <w:p>
+      <w:pPr>
         <w:pStyle w:val="3"/>
-        <w:spacing w:before="200" w:after="80"/>
-      </w:pPr>
-      <w:r>
-        <w:rPr>
-          <w:rFonts w:ascii="Arial" w:hAnsi="Arial" w:eastAsia="黑体"/>
-          <w:b/>
-          <w:color w:val="000000"/>
-          <w:sz w:val="26"/>
-        </w:rPr>
+      </w:pPr>
+      <w:r>
         <w:t>第 6 个工作日：EMQX 部署与端到端联调</w:t>
       </w:r>
     </w:p>
     <w:p>
-      <w:pPr>
-        <w:spacing w:line="336" w:lineRule="auto" w:after="0"/>
-      </w:pPr>
-      <w:r>
-        <w:rPr>
-          <w:rFonts w:ascii="Times New Roman" w:hAnsi="Times New Roman" w:eastAsia="宋体"/>
-          <w:b w:val="0"/>
-          <w:color w:val="000000"/>
-          <w:sz w:val="24"/>
-        </w:rPr>
+      <w:r>
         <w:t>日期：2026年6月13日</w:t>
       </w:r>
     </w:p>
     <w:p>
-      <w:pPr>
-        <w:spacing w:before="80" w:after="40"/>
-      </w:pPr>
-      <w:r>
-        <w:rPr>
-          <w:rFonts w:ascii="Arial" w:hAnsi="Arial" w:eastAsia="黑体"/>
-          <w:b/>
-          <w:color w:val="000000"/>
-          <w:sz w:val="24"/>
+      <w:r>
+        <w:rPr>
+          <w:b/>
         </w:rPr>
         <w:t>1. 今日主要工作内容</w:t>
       </w:r>
     </w:p>
     <w:p>
       <w:pPr>
-        <w:spacing w:line="300" w:lineRule="auto" w:after="40"/>
-        <w:ind w:firstLine="480"/>
-      </w:pPr>
-      <w:r>
-        <w:rPr>
-          <w:rFonts w:ascii="Times New Roman" w:hAnsi="Times New Roman" w:eastAsia="宋体"/>
-          <w:b w:val="0"/>
-          <w:color w:val="000000"/>
-          <w:sz w:val="24"/>
-        </w:rPr>
+        <w:spacing w:line="324" w:lineRule="auto"/>
+      </w:pPr>
+      <w:r>
         <w:t>今天主要搭建并验证 ESP32 接入所需的服务器侧环境。考虑到方案主线是 EMQX，为使演示与报告一致，在本地用 Docker 部署 EMQX 5.8.9（与压测同版本），由笔记本扮演“未来自建部署的服务器”，并用模拟节点完整验证从设备到监控端的链路。</w:t>
       </w:r>
     </w:p>
     <w:p>
-      <w:pPr>
-        <w:spacing w:before="80" w:after="40"/>
-      </w:pPr>
-      <w:r>
-        <w:rPr>
-          <w:rFonts w:ascii="Arial" w:hAnsi="Arial" w:eastAsia="黑体"/>
-          <w:b/>
-          <w:color w:val="000000"/>
-          <w:sz w:val="24"/>
+      <w:r>
+        <w:rPr>
+          <w:b/>
         </w:rPr>
         <w:t>2. 本人完成的具体任务</w:t>
       </w:r>
     </w:p>
     <w:p>
       <w:pPr>
-        <w:spacing w:line="300" w:lineRule="auto" w:after="20"/>
-      </w:pPr>
-      <w:r>
-        <w:rPr>
-          <w:rFonts w:ascii="Times New Roman" w:hAnsi="Times New Roman" w:eastAsia="宋体"/>
-          <w:b w:val="0"/>
-          <w:color w:val="000000"/>
-          <w:sz w:val="24"/>
-        </w:rPr>
+        <w:spacing w:line="324" w:lineRule="auto"/>
+      </w:pPr>
+      <w:r>
         <w:t>① 在本地用 Docker 部署 EMQX 5.8.9，映射 MQTT 端口 1883 与 Dashboard 端口 18083。</w:t>
       </w:r>
     </w:p>
     <w:p>
       <w:pPr>
-        <w:spacing w:line="300" w:lineRule="auto" w:after="20"/>
-      </w:pPr>
-      <w:r>
-        <w:rPr>
-          <w:rFonts w:ascii="Times New Roman" w:hAnsi="Times New Roman" w:eastAsia="宋体"/>
-          <w:b w:val="0"/>
-          <w:color w:val="000000"/>
-          <w:sz w:val="24"/>
-        </w:rPr>
+        <w:spacing w:line="324" w:lineRule="auto"/>
+      </w:pPr>
+      <w:r>
         <w:t>② 配置 Windows 移动热点组网，使 ESP32 与笔记本同处一个局域网，笔记本固定 IP 192.168.137.1 作为 Broker 地址。</w:t>
       </w:r>
     </w:p>
     <w:p>
       <w:pPr>
-        <w:spacing w:line="300" w:lineRule="auto" w:after="20"/>
-      </w:pPr>
-      <w:r>
-        <w:rPr>
-          <w:rFonts w:ascii="Times New Roman" w:hAnsi="Times New Roman" w:eastAsia="宋体"/>
-          <w:b w:val="0"/>
-          <w:color w:val="000000"/>
-          <w:sz w:val="24"/>
-        </w:rPr>
+        <w:spacing w:line="324" w:lineRule="auto"/>
+      </w:pPr>
+      <w:r>
         <w:t>③ 用 PC 模拟节点模拟 ESP32（完整 JSON、MQTT 3.1.1）经热点 IP 连接 EMQX，端到端验证服务器侧链路全通，监控端正确显示四类数据。</w:t>
       </w:r>
     </w:p>
     <w:p>
       <w:pPr>
-        <w:spacing w:line="300" w:lineRule="auto" w:after="20"/>
-      </w:pPr>
-      <w:r>
-        <w:rPr>
-          <w:rFonts w:ascii="Times New Roman" w:hAnsi="Times New Roman" w:eastAsia="宋体"/>
-          <w:b w:val="0"/>
-          <w:color w:val="000000"/>
-          <w:sz w:val="24"/>
-        </w:rPr>
+        <w:spacing w:line="324" w:lineRule="auto"/>
+      </w:pPr>
+      <w:r>
         <w:t>④ 编写《EMQX 部署与联调说明》，记录部署、启停、联调、验证流程与常见问题排查。</w:t>
       </w:r>
     </w:p>
     <w:p>
-      <w:pPr>
-        <w:spacing w:before="80" w:after="40"/>
-      </w:pPr>
-      <w:r>
-        <w:rPr>
-          <w:rFonts w:ascii="Arial" w:hAnsi="Arial" w:eastAsia="黑体"/>
-          <w:b/>
-          <w:color w:val="000000"/>
-          <w:sz w:val="24"/>
+      <w:r>
+        <w:rPr>
+          <w:b/>
         </w:rPr>
         <w:t>3. 遇到的问题</w:t>
       </w:r>
     </w:p>
     <w:p>
       <w:pPr>
-        <w:spacing w:line="300" w:lineRule="auto" w:after="20"/>
-      </w:pPr>
-      <w:r>
-        <w:rPr>
-          <w:rFonts w:ascii="Times New Roman" w:hAnsi="Times New Roman" w:eastAsia="宋体"/>
-          <w:b w:val="0"/>
-          <w:color w:val="000000"/>
-          <w:sz w:val="24"/>
-        </w:rPr>
+        <w:spacing w:line="324" w:lineRule="auto"/>
+      </w:pPr>
+      <w:r>
         <w:t>① 演示用本地 Mosquitto 还是 EMQX 的一致性问题；Docker 拉取镜像报错；担心 Docker 端口映射只绑本机导致 ESP32 连不上。</w:t>
       </w:r>
     </w:p>
     <w:p>
-      <w:pPr>
-        <w:spacing w:before="80" w:after="40"/>
-      </w:pPr>
-      <w:r>
-        <w:rPr>
-          <w:rFonts w:ascii="Arial" w:hAnsi="Arial" w:eastAsia="黑体"/>
-          <w:b/>
-          <w:color w:val="000000"/>
-          <w:sz w:val="24"/>
+      <w:r>
+        <w:rPr>
+          <w:b/>
         </w:rPr>
         <w:t>4. 解决方法</w:t>
       </w:r>
     </w:p>
     <w:p>
       <w:pPr>
-        <w:spacing w:line="300" w:lineRule="auto" w:after="20"/>
-      </w:pPr>
-      <w:r>
-        <w:rPr>
-          <w:rFonts w:ascii="Times New Roman" w:hAnsi="Times New Roman" w:eastAsia="宋体"/>
-          <w:b w:val="0"/>
-          <w:color w:val="000000"/>
-          <w:sz w:val="24"/>
-        </w:rPr>
+        <w:spacing w:line="324" w:lineRule="auto"/>
+      </w:pPr>
+      <w:r>
         <w:t>① 演示统一改用与压测同版本的 EMQX 5.8.9（Docker），自带 Dashboard 便于答辩；登录 Docker Hub 后重新拉取成功；用模拟节点经热点 IP 验证，确认端口映射对外可见、ESP32 可连入。</w:t>
       </w:r>
     </w:p>
     <w:p>
-      <w:pPr>
-        <w:spacing w:before="80" w:after="40"/>
-      </w:pPr>
-      <w:r>
-        <w:rPr>
-          <w:rFonts w:ascii="Arial" w:hAnsi="Arial" w:eastAsia="黑体"/>
-          <w:b/>
-          <w:color w:val="000000"/>
-          <w:sz w:val="24"/>
+      <w:r>
+        <w:rPr>
+          <w:b/>
         </w:rPr>
         <w:t>5. 今日成果</w:t>
       </w:r>
     </w:p>
     <w:p>
       <w:pPr>
-        <w:spacing w:line="300" w:lineRule="auto" w:after="20"/>
-      </w:pPr>
-      <w:r>
-        <w:rPr>
-          <w:rFonts w:ascii="Times New Roman" w:hAnsi="Times New Roman" w:eastAsia="宋体"/>
-          <w:b w:val="0"/>
-          <w:color w:val="000000"/>
-          <w:sz w:val="24"/>
-        </w:rPr>
+        <w:spacing w:line="324" w:lineRule="auto"/>
+      </w:pPr>
+      <w:r>
         <w:t>① 完成本地 EMQX 5.8.9 的 Docker 部署、从设备到监控端的端到端联调验证，以及《EMQX 部署与联调说明》文档。</w:t>
       </w:r>
     </w:p>
     <w:p>
-      <w:pPr>
-        <w:spacing w:before="80" w:after="40"/>
-      </w:pPr>
-      <w:r>
-        <w:rPr>
-          <w:rFonts w:ascii="Arial" w:hAnsi="Arial" w:eastAsia="黑体"/>
-          <w:b/>
-          <w:color w:val="000000"/>
-          <w:sz w:val="24"/>
+      <w:r>
+        <w:rPr>
+          <w:b/>
         </w:rPr>
         <w:t>6. 明日计划</w:t>
       </w:r>
     </w:p>
     <w:p>
       <w:pPr>
-        <w:spacing w:line="300" w:lineRule="auto" w:after="20"/>
-      </w:pPr>
-      <w:r>
-        <w:rPr>
-          <w:rFonts w:ascii="Times New Roman" w:hAnsi="Times New Roman" w:eastAsia="宋体"/>
-          <w:b w:val="0"/>
-          <w:color w:val="000000"/>
-          <w:sz w:val="24"/>
-        </w:rPr>
+        <w:spacing w:line="324" w:lineRule="auto"/>
+      </w:pPr>
+      <w:r>
         <w:t>① 等硬件队友完成 ESP32 配网与 MQTT 上传后进行真机联调，并继续推进报告与答辩材料整理。</w:t>
       </w:r>
     </w:p>
     <w:p>
       <w:pPr>
+        <w:pBdr>
+          <w:bottom w:val="single" w:sz="6" w:space="1" w:color="auto"/>
+        </w:pBdr>
+        <w:spacing w:after="120"/>
+      </w:pPr>
+    </w:p>
+    <w:p>
+      <w:pPr>
         <w:pStyle w:val="3"/>
-        <w:spacing w:before="200" w:after="80"/>
-      </w:pPr>
-      <w:r>
-        <w:rPr>
-          <w:rFonts w:ascii="Arial" w:hAnsi="Arial" w:eastAsia="黑体"/>
-          <w:b/>
-          <w:color w:val="000000"/>
-          <w:sz w:val="26"/>
-        </w:rPr>
+      </w:pPr>
+      <w:r>
         <w:t>第 7 个工作日：ESP32 室外长测的服务器侧记录与分析</w:t>
       </w:r>
     </w:p>
     <w:p>
-      <w:pPr>
-        <w:spacing w:line="336" w:lineRule="auto" w:after="0"/>
-      </w:pPr>
-      <w:r>
-        <w:rPr>
-          <w:rFonts w:ascii="Times New Roman" w:hAnsi="Times New Roman" w:eastAsia="宋体"/>
-          <w:b w:val="0"/>
-          <w:color w:val="000000"/>
-          <w:sz w:val="24"/>
-        </w:rPr>
+      <w:r>
         <w:t>日期：2026年6月15日</w:t>
       </w:r>
     </w:p>
     <w:p>
-      <w:pPr>
-        <w:spacing w:before="80" w:after="40"/>
-      </w:pPr>
-      <w:r>
-        <w:rPr>
-          <w:rFonts w:ascii="Arial" w:hAnsi="Arial" w:eastAsia="黑体"/>
-          <w:b/>
-          <w:color w:val="000000"/>
-          <w:sz w:val="24"/>
+      <w:r>
+        <w:rPr>
+          <w:b/>
         </w:rPr>
         <w:t>1. 今日主要工作内容</w:t>
       </w:r>
     </w:p>
     <w:p>
       <w:pPr>
-        <w:spacing w:line="300" w:lineRule="auto" w:after="40"/>
-        <w:ind w:firstLine="480"/>
-      </w:pPr>
-      <w:r>
-        <w:rPr>
-          <w:rFonts w:ascii="Times New Roman" w:hAnsi="Times New Roman" w:eastAsia="宋体"/>
-          <w:b w:val="0"/>
-          <w:color w:val="000000"/>
-          <w:sz w:val="24"/>
-        </w:rPr>
+        <w:spacing w:line="324" w:lineRule="auto"/>
+      </w:pPr>
+      <w:r>
         <w:t>今天配合硬件队友的 ESP32 室外全天长测，负责服务器侧的数据记录与分析。在云端用持久会话记录器 7×24 接收并落盘，本地无需开机；事后对约 15 小时数据做到达率统计与曲线分析，并定位光照数据异常的根因（属硬件侧）。</w:t>
       </w:r>
     </w:p>
     <w:p>
-      <w:pPr>
-        <w:spacing w:before="80" w:after="40"/>
-      </w:pPr>
-      <w:r>
-        <w:rPr>
-          <w:rFonts w:ascii="Arial" w:hAnsi="Arial" w:eastAsia="黑体"/>
-          <w:b/>
-          <w:color w:val="000000"/>
-          <w:sz w:val="24"/>
+      <w:r>
+        <w:rPr>
+          <w:b/>
         </w:rPr>
         <w:t>2. 本人完成的具体任务</w:t>
       </w:r>
     </w:p>
     <w:p>
       <w:pPr>
-        <w:spacing w:line="300" w:lineRule="auto" w:after="20"/>
-      </w:pPr>
-      <w:r>
-        <w:rPr>
-          <w:rFonts w:ascii="Times New Roman" w:hAnsi="Times New Roman" w:eastAsia="宋体"/>
-          <w:b w:val="0"/>
-          <w:color w:val="000000"/>
-          <w:sz w:val="24"/>
-        </w:rPr>
+        <w:spacing w:line="324" w:lineRule="auto"/>
+      </w:pPr>
+      <w:r>
         <w:t>① 在云服务器部署 cloud_recorder.py（QoS 1、持久会话、systemd 常驻），持续记录 ESP32 上报数据。</w:t>
       </w:r>
     </w:p>
     <w:p>
       <w:pPr>
-        <w:spacing w:line="300" w:lineRule="auto" w:after="20"/>
-      </w:pPr>
-      <w:r>
-        <w:rPr>
-          <w:rFonts w:ascii="Times New Roman" w:hAnsi="Times New Roman" w:eastAsia="宋体"/>
-          <w:b w:val="0"/>
-          <w:color w:val="000000"/>
-          <w:sz w:val="24"/>
-        </w:rPr>
+        <w:spacing w:line="324" w:lineRule="auto"/>
+      </w:pPr>
+      <w:r>
         <w:t>② 统计到达率：全天约 8547 条、整体到达率 95.0%，期间 2 次网络中断；明确“网络短时中断计入、外部停机剔除”的口径。</w:t>
       </w:r>
     </w:p>
     <w:p>
       <w:pPr>
-        <w:spacing w:line="300" w:lineRule="auto" w:after="20"/>
-      </w:pPr>
-      <w:r>
-        <w:rPr>
-          <w:rFonts w:ascii="Times New Roman" w:hAnsi="Times New Roman" w:eastAsia="宋体"/>
-          <w:b w:val="0"/>
-          <w:color w:val="000000"/>
-          <w:sz w:val="24"/>
-        </w:rPr>
+        <w:spacing w:line="324" w:lineRule="auto"/>
+      </w:pPr>
+      <w:r>
         <w:t>③ 绘制温度、湿度、可燃气体、土壤湿度的全天曲线，核对其日变化形态与当日晴热天气吻合。</w:t>
       </w:r>
     </w:p>
     <w:p>
       <w:pPr>
-        <w:spacing w:line="300" w:lineRule="auto" w:after="20"/>
-      </w:pPr>
-      <w:r>
-        <w:rPr>
-          <w:rFonts w:ascii="Times New Roman" w:hAnsi="Times New Roman" w:eastAsia="宋体"/>
-          <w:b w:val="0"/>
-          <w:color w:val="000000"/>
-          <w:sz w:val="24"/>
-        </w:rPr>
+        <w:spacing w:line="324" w:lineRule="auto"/>
+      </w:pPr>
+      <w:r>
         <w:t>④ 定位光照 BH1750 异常（白天多为 -1）：经比对串口与订阅链路，排除监控/订阅侧，判断为 ESP32 端 I2C 接线接触不良（模块本身正常）。</w:t>
       </w:r>
     </w:p>
     <w:p>
       <w:pPr>
-        <w:spacing w:line="300" w:lineRule="auto" w:after="20"/>
-      </w:pPr>
-      <w:r>
-        <w:rPr>
-          <w:rFonts w:ascii="Times New Roman" w:hAnsi="Times New Roman" w:eastAsia="宋体"/>
-          <w:b w:val="0"/>
-          <w:color w:val="000000"/>
-          <w:sz w:val="24"/>
-        </w:rPr>
+        <w:spacing w:line="324" w:lineRule="auto"/>
+      </w:pPr>
+      <w:r>
         <w:t>⑤ 输出测试报告、全天曲线与记录/分析脚本并入库。</w:t>
       </w:r>
     </w:p>
     <w:p>
-      <w:pPr>
-        <w:spacing w:before="80" w:after="40"/>
-      </w:pPr>
-      <w:r>
-        <w:rPr>
-          <w:rFonts w:ascii="Arial" w:hAnsi="Arial" w:eastAsia="黑体"/>
-          <w:b/>
-          <w:color w:val="000000"/>
-          <w:sz w:val="24"/>
+      <w:r>
+        <w:rPr>
+          <w:b/>
         </w:rPr>
         <w:t>3. 遇到的问题</w:t>
       </w:r>
     </w:p>
     <w:p>
       <w:pPr>
-        <w:spacing w:line="300" w:lineRule="auto" w:after="20"/>
-      </w:pPr>
-      <w:r>
-        <w:rPr>
-          <w:rFonts w:ascii="Times New Roman" w:hAnsi="Times New Roman" w:eastAsia="宋体"/>
-          <w:b w:val="0"/>
-          <w:color w:val="000000"/>
-          <w:sz w:val="24"/>
-        </w:rPr>
+        <w:spacing w:line="324" w:lineRule="auto"/>
+      </w:pPr>
+      <w:r>
         <w:t>① 光照数据白天几乎全为无效值；本地不便 7×24 开机记录；需判断异常出在硬件端还是订阅/监控端。</w:t>
       </w:r>
     </w:p>
     <w:p>
-      <w:pPr>
-        <w:spacing w:before="80" w:after="40"/>
-      </w:pPr>
-      <w:r>
-        <w:rPr>
-          <w:rFonts w:ascii="Arial" w:hAnsi="Arial" w:eastAsia="黑体"/>
-          <w:b/>
-          <w:color w:val="000000"/>
-          <w:sz w:val="24"/>
+      <w:r>
+        <w:rPr>
+          <w:b/>
         </w:rPr>
         <w:t>4. 解决方法</w:t>
       </w:r>
     </w:p>
     <w:p>
       <w:pPr>
-        <w:spacing w:line="300" w:lineRule="auto" w:after="20"/>
-      </w:pPr>
-      <w:r>
-        <w:rPr>
-          <w:rFonts w:ascii="Times New Roman" w:hAnsi="Times New Roman" w:eastAsia="宋体"/>
-          <w:b w:val="0"/>
-          <w:color w:val="000000"/>
-          <w:sz w:val="24"/>
-        </w:rPr>
+        <w:spacing w:line="324" w:lineRule="auto"/>
+      </w:pPr>
+      <w:r>
         <w:t>① 用云端持久记录器常驻接收，避免本地长时间开机；比对串口与订阅链路排除监控端问题，定位为硬件端 I2C 接触不良；统计时区分网络中断与外部停机。</w:t>
       </w:r>
     </w:p>
     <w:p>
-      <w:pPr>
-        <w:spacing w:before="80" w:after="40"/>
-      </w:pPr>
-      <w:r>
-        <w:rPr>
-          <w:rFonts w:ascii="Arial" w:hAnsi="Arial" w:eastAsia="黑体"/>
-          <w:b/>
-          <w:color w:val="000000"/>
-          <w:sz w:val="24"/>
+      <w:r>
+        <w:rPr>
+          <w:b/>
         </w:rPr>
         <w:t>5. 今日成果</w:t>
       </w:r>
     </w:p>
     <w:p>
       <w:pPr>
-        <w:spacing w:line="300" w:lineRule="auto" w:after="20"/>
-      </w:pPr>
-      <w:r>
-        <w:rPr>
-          <w:rFonts w:ascii="Times New Roman" w:hAnsi="Times New Roman" w:eastAsia="宋体"/>
-          <w:b w:val="0"/>
-          <w:color w:val="000000"/>
-          <w:sz w:val="24"/>
-        </w:rPr>
+        <w:spacing w:line="324" w:lineRule="auto"/>
+      </w:pPr>
+      <w:r>
         <w:t>① 完成约 15 小时服务器侧记录与分析，四类数据合理、到达率 95.0% 达标，并定位光照问题为硬件端接线接触不良。</w:t>
       </w:r>
     </w:p>
     <w:p>
-      <w:pPr>
-        <w:spacing w:before="80" w:after="40"/>
-      </w:pPr>
-      <w:r>
-        <w:rPr>
-          <w:rFonts w:ascii="Arial" w:hAnsi="Arial" w:eastAsia="黑体"/>
-          <w:b/>
-          <w:color w:val="000000"/>
-          <w:sz w:val="24"/>
+      <w:r>
+        <w:rPr>
+          <w:b/>
         </w:rPr>
         <w:t>6. 明日计划</w:t>
       </w:r>
     </w:p>
     <w:p>
       <w:pPr>
-        <w:spacing w:line="300" w:lineRule="auto" w:after="20"/>
-      </w:pPr>
-      <w:r>
-        <w:rPr>
-          <w:rFonts w:ascii="Times New Roman" w:hAnsi="Times New Roman" w:eastAsia="宋体"/>
-          <w:b w:val="0"/>
-          <w:color w:val="000000"/>
-          <w:sz w:val="24"/>
-        </w:rPr>
+        <w:spacing w:line="324" w:lineRule="auto"/>
+      </w:pPr>
+      <w:r>
         <w:t>① 复核性能与协议实验数据；待硬件接线修复后补测光照；把云端记录器升级为持久服务。</w:t>
       </w:r>
     </w:p>
     <w:p>
       <w:pPr>
+        <w:pBdr>
+          <w:bottom w:val="single" w:sz="6" w:space="1" w:color="auto"/>
+        </w:pBdr>
+        <w:spacing w:after="120"/>
+      </w:pPr>
+    </w:p>
+    <w:p>
+      <w:pPr>
         <w:pStyle w:val="3"/>
-        <w:spacing w:before="200" w:after="80"/>
-      </w:pPr>
-      <w:r>
-        <w:rPr>
-          <w:rFonts w:ascii="Arial" w:hAnsi="Arial" w:eastAsia="黑体"/>
-          <w:b/>
-          <w:color w:val="000000"/>
-          <w:sz w:val="26"/>
-        </w:rPr>
+      </w:pPr>
+      <w:r>
         <w:t>第 8 个工作日：性能数据复核、光照修复与记录器持久化</w:t>
       </w:r>
     </w:p>
     <w:p>
-      <w:pPr>
-        <w:spacing w:line="336" w:lineRule="auto" w:after="0"/>
-      </w:pPr>
-      <w:r>
-        <w:rPr>
-          <w:rFonts w:ascii="Times New Roman" w:hAnsi="Times New Roman" w:eastAsia="宋体"/>
-          <w:b w:val="0"/>
-          <w:color w:val="000000"/>
-          <w:sz w:val="24"/>
-        </w:rPr>
+      <w:r>
         <w:t>日期：2026年6月16日</w:t>
       </w:r>
     </w:p>
     <w:p>
-      <w:pPr>
-        <w:spacing w:before="80" w:after="40"/>
-      </w:pPr>
-      <w:r>
-        <w:rPr>
-          <w:rFonts w:ascii="Arial" w:hAnsi="Arial" w:eastAsia="黑体"/>
-          <w:b/>
-          <w:color w:val="000000"/>
-          <w:sz w:val="24"/>
+      <w:r>
+        <w:rPr>
+          <w:b/>
         </w:rPr>
         <w:t>1. 今日主要工作内容</w:t>
       </w:r>
     </w:p>
     <w:p>
       <w:pPr>
-        <w:spacing w:line="300" w:lineRule="auto" w:after="40"/>
-        <w:ind w:firstLine="480"/>
-      </w:pPr>
-      <w:r>
-        <w:rPr>
-          <w:rFonts w:ascii="Times New Roman" w:hAnsi="Times New Roman" w:eastAsia="宋体"/>
-          <w:b w:val="0"/>
-          <w:color w:val="000000"/>
-          <w:sz w:val="24"/>
-        </w:rPr>
+        <w:spacing w:line="324" w:lineRule="auto"/>
+      </w:pPr>
+      <w:r>
         <w:t>今天复核已有性能与协议实验数据，配合硬件修复后补采光照数据并出曲线，并把云端记录器升级为持久服务，避免重启/欠费导致记录中断；同时梳理工程分析素材。</w:t>
       </w:r>
     </w:p>
     <w:p>
-      <w:pPr>
-        <w:spacing w:before="80" w:after="40"/>
-      </w:pPr>
-      <w:r>
-        <w:rPr>
-          <w:rFonts w:ascii="Arial" w:hAnsi="Arial" w:eastAsia="黑体"/>
-          <w:b/>
-          <w:color w:val="000000"/>
-          <w:sz w:val="24"/>
+      <w:r>
+        <w:rPr>
+          <w:b/>
         </w:rPr>
         <w:t>2. 本人完成的具体任务</w:t>
       </w:r>
     </w:p>
     <w:p>
       <w:pPr>
-        <w:spacing w:line="300" w:lineRule="auto" w:after="20"/>
-      </w:pPr>
-      <w:r>
-        <w:rPr>
-          <w:rFonts w:ascii="Times New Roman" w:hAnsi="Times New Roman" w:eastAsia="宋体"/>
-          <w:b w:val="0"/>
-          <w:color w:val="000000"/>
-          <w:sz w:val="24"/>
-        </w:rPr>
+        <w:spacing w:line="324" w:lineRule="auto"/>
+      </w:pPr>
+      <w:r>
         <w:t>① 复核协议开销、容量/吞吐、QoS × 丢包、公网延迟等实验数据与图表，确认与建模系数一致。</w:t>
       </w:r>
     </w:p>
     <w:p>
       <w:pPr>
-        <w:spacing w:line="300" w:lineRule="auto" w:after="20"/>
-      </w:pPr>
-      <w:r>
-        <w:rPr>
-          <w:rFonts w:ascii="Times New Roman" w:hAnsi="Times New Roman" w:eastAsia="宋体"/>
-          <w:b w:val="0"/>
-          <w:color w:val="000000"/>
-          <w:sz w:val="24"/>
-        </w:rPr>
+        <w:spacing w:line="324" w:lineRule="auto"/>
+      </w:pPr>
+      <w:r>
         <w:t>② 硬件队友重新接稳 BH1750 后，服务器侧记录到夜间至清晨连续约 6 小时有效光照（0 → 约 305 lux），并绘制夜晨曲线，佐证模块本身正常。</w:t>
       </w:r>
     </w:p>
     <w:p>
       <w:pPr>
-        <w:spacing w:line="300" w:lineRule="auto" w:after="20"/>
-      </w:pPr>
-      <w:r>
-        <w:rPr>
-          <w:rFonts w:ascii="Times New Roman" w:hAnsi="Times New Roman" w:eastAsia="宋体"/>
-          <w:b w:val="0"/>
-          <w:color w:val="000000"/>
-          <w:sz w:val="24"/>
-        </w:rPr>
+        <w:spacing w:line="324" w:lineRule="auto"/>
+      </w:pPr>
+      <w:r>
         <w:t>③ 把云端记录器从临时单元升级为 systemd 持久服务（Restart=always、开机自启），避免服务器重启或欠费后记录中断。</w:t>
       </w:r>
     </w:p>
     <w:p>
       <w:pPr>
-        <w:spacing w:line="300" w:lineRule="auto" w:after="20"/>
-      </w:pPr>
-      <w:r>
-        <w:rPr>
-          <w:rFonts w:ascii="Times New Roman" w:hAnsi="Times New Roman" w:eastAsia="宋体"/>
-          <w:b w:val="0"/>
-          <w:color w:val="000000"/>
-          <w:sz w:val="24"/>
-        </w:rPr>
+        <w:spacing w:line="324" w:lineRule="auto"/>
+      </w:pPr>
+      <w:r>
         <w:t>④ 梳理工程分析素材（实时性、可靠性、可扩展性、成本、可维护性）。</w:t>
       </w:r>
     </w:p>
     <w:p>
-      <w:pPr>
-        <w:spacing w:before="80" w:after="40"/>
-      </w:pPr>
-      <w:r>
-        <w:rPr>
-          <w:rFonts w:ascii="Arial" w:hAnsi="Arial" w:eastAsia="黑体"/>
-          <w:b/>
-          <w:color w:val="000000"/>
-          <w:sz w:val="24"/>
+      <w:r>
+        <w:rPr>
+          <w:b/>
         </w:rPr>
         <w:t>3. 遇到的问题</w:t>
       </w:r>
     </w:p>
     <w:p>
       <w:pPr>
-        <w:spacing w:line="300" w:lineRule="auto" w:after="20"/>
-      </w:pPr>
-      <w:r>
-        <w:rPr>
-          <w:rFonts w:ascii="Times New Roman" w:hAnsi="Times New Roman" w:eastAsia="宋体"/>
-          <w:b w:val="0"/>
-          <w:color w:val="000000"/>
-          <w:sz w:val="24"/>
-        </w:rPr>
+        <w:spacing w:line="324" w:lineRule="auto"/>
+      </w:pPr>
+      <w:r>
         <w:t>① 早期记录器为临时单元，服务器重启后会丢失；光照修复后需要一段干净曲线佐证 BH1750 本身正常。</w:t>
       </w:r>
     </w:p>
     <w:p>
-      <w:pPr>
-        <w:spacing w:before="80" w:after="40"/>
-      </w:pPr>
-      <w:r>
-        <w:rPr>
-          <w:rFonts w:ascii="Arial" w:hAnsi="Arial" w:eastAsia="黑体"/>
-          <w:b/>
-          <w:color w:val="000000"/>
-          <w:sz w:val="24"/>
+      <w:r>
+        <w:rPr>
+          <w:b/>
         </w:rPr>
         <w:t>4. 解决方法</w:t>
       </w:r>
     </w:p>
     <w:p>
       <w:pPr>
-        <w:spacing w:line="300" w:lineRule="auto" w:after="20"/>
-      </w:pPr>
-      <w:r>
-        <w:rPr>
-          <w:rFonts w:ascii="Times New Roman" w:hAnsi="Times New Roman" w:eastAsia="宋体"/>
-          <w:b w:val="0"/>
-          <w:color w:val="000000"/>
-          <w:sz w:val="24"/>
-        </w:rPr>
+        <w:spacing w:line="324" w:lineRule="auto"/>
+      </w:pPr>
+      <w:r>
         <w:t>① 将记录器改为 systemd 常驻服务并开机自启；利用夜间至清晨稳定时段采集连续有效光照数据并出图。</w:t>
       </w:r>
     </w:p>
     <w:p>
-      <w:pPr>
-        <w:spacing w:before="80" w:after="40"/>
-      </w:pPr>
-      <w:r>
-        <w:rPr>
-          <w:rFonts w:ascii="Arial" w:hAnsi="Arial" w:eastAsia="黑体"/>
-          <w:b/>
-          <w:color w:val="000000"/>
-          <w:sz w:val="24"/>
+      <w:r>
+        <w:rPr>
+          <w:b/>
         </w:rPr>
         <w:t>5. 今日成果</w:t>
       </w:r>
     </w:p>
     <w:p>
       <w:pPr>
-        <w:spacing w:line="300" w:lineRule="auto" w:after="20"/>
-      </w:pPr>
-      <w:r>
-        <w:rPr>
-          <w:rFonts w:ascii="Times New Roman" w:hAnsi="Times New Roman" w:eastAsia="宋体"/>
-          <w:b w:val="0"/>
-          <w:color w:val="000000"/>
-          <w:sz w:val="24"/>
-        </w:rPr>
+        <w:spacing w:line="324" w:lineRule="auto"/>
+      </w:pPr>
+      <w:r>
         <w:t>① 完成性能数据复核、光照夜晨曲线与记录器持久化，工程分析素材齐备。</w:t>
       </w:r>
     </w:p>
     <w:p>
-      <w:pPr>
-        <w:spacing w:before="80" w:after="40"/>
-      </w:pPr>
-      <w:r>
-        <w:rPr>
-          <w:rFonts w:ascii="Arial" w:hAnsi="Arial" w:eastAsia="黑体"/>
-          <w:b/>
-          <w:color w:val="000000"/>
-          <w:sz w:val="24"/>
+      <w:r>
+        <w:rPr>
+          <w:b/>
         </w:rPr>
         <w:t>6. 明日计划</w:t>
       </w:r>
     </w:p>
     <w:p>
       <w:pPr>
-        <w:spacing w:line="300" w:lineRule="auto" w:after="20"/>
-      </w:pPr>
-      <w:r>
-        <w:rPr>
-          <w:rFonts w:ascii="Times New Roman" w:hAnsi="Times New Roman" w:eastAsia="宋体"/>
-          <w:b w:val="0"/>
-          <w:color w:val="000000"/>
-          <w:sz w:val="24"/>
-        </w:rPr>
+        <w:spacing w:line="324" w:lineRule="auto"/>
+      </w:pPr>
+      <w:r>
         <w:t>① 补做 MQTT 与 HTTP 开销对比实验，完善监控端，撰写并扩充课程设计报告。</w:t>
       </w:r>
     </w:p>
     <w:p>
       <w:pPr>
+        <w:pBdr>
+          <w:bottom w:val="single" w:sz="6" w:space="1" w:color="auto"/>
+        </w:pBdr>
+        <w:spacing w:after="120"/>
+      </w:pPr>
+    </w:p>
+    <w:p>
+      <w:pPr>
         <w:pStyle w:val="3"/>
-        <w:spacing w:before="200" w:after="80"/>
-      </w:pPr>
-      <w:r>
-        <w:rPr>
-          <w:rFonts w:ascii="Arial" w:hAnsi="Arial" w:eastAsia="黑体"/>
-          <w:b/>
-          <w:color w:val="000000"/>
-          <w:sz w:val="26"/>
-        </w:rPr>
+      </w:pPr>
+      <w:r>
         <w:t>第 9 个工作日：MQTT/HTTP 对比实验、监控端完善与报告撰写</w:t>
       </w:r>
     </w:p>
     <w:p>
-      <w:pPr>
-        <w:spacing w:line="336" w:lineRule="auto" w:after="0"/>
-      </w:pPr>
-      <w:r>
-        <w:rPr>
-          <w:rFonts w:ascii="Times New Roman" w:hAnsi="Times New Roman" w:eastAsia="宋体"/>
-          <w:b w:val="0"/>
-          <w:color w:val="000000"/>
-          <w:sz w:val="24"/>
-        </w:rPr>
+      <w:r>
         <w:t>日期：2026年6月17日</w:t>
       </w:r>
     </w:p>
     <w:p>
-      <w:pPr>
-        <w:spacing w:before="80" w:after="40"/>
-      </w:pPr>
-      <w:r>
-        <w:rPr>
-          <w:rFonts w:ascii="Arial" w:hAnsi="Arial" w:eastAsia="黑体"/>
-          <w:b/>
-          <w:color w:val="000000"/>
-          <w:sz w:val="24"/>
+      <w:r>
+        <w:rPr>
+          <w:b/>
         </w:rPr>
         <w:t>1. 今日主要工作内容</w:t>
       </w:r>
     </w:p>
     <w:p>
       <w:pPr>
-        <w:spacing w:line="300" w:lineRule="auto" w:after="40"/>
-        <w:ind w:firstLine="480"/>
-      </w:pPr>
-      <w:r>
-        <w:rPr>
-          <w:rFonts w:ascii="Times New Roman" w:hAnsi="Times New Roman" w:eastAsia="宋体"/>
-          <w:b w:val="0"/>
-          <w:color w:val="000000"/>
-          <w:sz w:val="24"/>
-        </w:rPr>
+        <w:spacing w:line="324" w:lineRule="auto"/>
+      </w:pPr>
+      <w:r>
         <w:t>今天补做 MQTT 与 HTTP 的开销对比实验为协议选型提供量化依据；完善 Web 监控端（界面美化、选择订阅）；并撰写、扩充课程设计报告。</w:t>
       </w:r>
     </w:p>
     <w:p>
-      <w:pPr>
-        <w:spacing w:before="80" w:after="40"/>
-      </w:pPr>
-      <w:r>
-        <w:rPr>
-          <w:rFonts w:ascii="Arial" w:hAnsi="Arial" w:eastAsia="黑体"/>
-          <w:b/>
-          <w:color w:val="000000"/>
-          <w:sz w:val="24"/>
+      <w:r>
+        <w:rPr>
+          <w:b/>
         </w:rPr>
         <w:t>2. 本人完成的具体任务</w:t>
       </w:r>
     </w:p>
     <w:p>
       <w:pPr>
-        <w:spacing w:line="300" w:lineRule="auto" w:after="20"/>
-      </w:pPr>
-      <w:r>
-        <w:rPr>
-          <w:rFonts w:ascii="Times New Roman" w:hAnsi="Times New Roman" w:eastAsia="宋体"/>
-          <w:b w:val="0"/>
-          <w:color w:val="000000"/>
-          <w:sz w:val="24"/>
-        </w:rPr>
+        <w:spacing w:line="324" w:lineRule="auto"/>
+      </w:pPr>
+      <w:r>
         <w:t>① 编写 compare_mqtt_http.py，逐字节实测同一条数据经 MQTT 与 HTTP 上传的应用层开销（json/json-min/msgpack 各 200 次）：MQTT 比 HTTP 节省 65%~77%，协议头开销约为其 1/8。</w:t>
       </w:r>
     </w:p>
     <w:p>
       <w:pPr>
-        <w:spacing w:line="300" w:lineRule="auto" w:after="20"/>
-      </w:pPr>
-      <w:r>
-        <w:rPr>
-          <w:rFonts w:ascii="Times New Roman" w:hAnsi="Times New Roman" w:eastAsia="宋体"/>
-          <w:b w:val="0"/>
-          <w:color w:val="000000"/>
-          <w:sz w:val="24"/>
-        </w:rPr>
+        <w:spacing w:line="324" w:lineRule="auto"/>
+      </w:pPr>
+      <w:r>
         <w:t>② 美化 Web 监控端为深色仪表盘，新增“选择订阅”功能（按节点、按数据类型或全部过滤，后端按 MQTT 通配符对该连接的推送过滤），直观体现主题订阅机制。</w:t>
       </w:r>
     </w:p>
     <w:p>
       <w:pPr>
-        <w:spacing w:line="300" w:lineRule="auto" w:after="20"/>
-      </w:pPr>
-      <w:r>
-        <w:rPr>
-          <w:rFonts w:ascii="Times New Roman" w:hAnsi="Times New Roman" w:eastAsia="宋体"/>
-          <w:b w:val="0"/>
-          <w:color w:val="000000"/>
-          <w:sz w:val="24"/>
-        </w:rPr>
+        <w:spacing w:line="324" w:lineRule="auto"/>
+      </w:pPr>
+      <w:r>
         <w:t>③ 厘清 QoS 选型思路：TCP 兜底连接内丢包、QoS 解决连接断开，故选 QoS 1 + 持久会话，并用 seq 去重替代 QoS 2。</w:t>
       </w:r>
     </w:p>
     <w:p>
       <w:pPr>
-        <w:spacing w:line="300" w:lineRule="auto" w:after="20"/>
-      </w:pPr>
-      <w:r>
-        <w:rPr>
-          <w:rFonts w:ascii="Times New Roman" w:hAnsi="Times New Roman" w:eastAsia="宋体"/>
-          <w:b w:val="0"/>
-          <w:color w:val="000000"/>
-          <w:sz w:val="24"/>
-        </w:rPr>
+        <w:spacing w:line="324" w:lineRule="auto"/>
+      </w:pPr>
+      <w:r>
         <w:t>④ 撰写并大幅扩充课程设计报告：实现过程详写、测试证据闭环、典型问题与解决过程、设计指标达成汇总表、硬件约束与安全性、工程化总结。</w:t>
       </w:r>
     </w:p>
     <w:p>
-      <w:pPr>
-        <w:spacing w:before="80" w:after="40"/>
-      </w:pPr>
-      <w:r>
-        <w:rPr>
-          <w:rFonts w:ascii="Arial" w:hAnsi="Arial" w:eastAsia="黑体"/>
-          <w:b/>
-          <w:color w:val="000000"/>
-          <w:sz w:val="24"/>
+      <w:r>
+        <w:rPr>
+          <w:b/>
         </w:rPr>
         <w:t>3. 遇到的问题</w:t>
       </w:r>
     </w:p>
     <w:p>
       <w:pPr>
-        <w:spacing w:line="300" w:lineRule="auto" w:after="20"/>
-      </w:pPr>
-      <w:r>
-        <w:rPr>
-          <w:rFonts w:ascii="Times New Roman" w:hAnsi="Times New Roman" w:eastAsia="宋体"/>
-          <w:b w:val="0"/>
-          <w:color w:val="000000"/>
-          <w:sz w:val="24"/>
-        </w:rPr>
+        <w:spacing w:line="324" w:lineRule="auto"/>
+      </w:pPr>
+      <w:r>
         <w:t>① 需要量化“为什么选 MQTT 而不用 HTTP”；报告需补充实现细节、证据链与工程分析。</w:t>
       </w:r>
     </w:p>
     <w:p>
-      <w:pPr>
-        <w:spacing w:before="80" w:after="40"/>
-      </w:pPr>
-      <w:r>
-        <w:rPr>
-          <w:rFonts w:ascii="Arial" w:hAnsi="Arial" w:eastAsia="黑体"/>
-          <w:b/>
-          <w:color w:val="000000"/>
-          <w:sz w:val="24"/>
+      <w:r>
+        <w:rPr>
+          <w:b/>
         </w:rPr>
         <w:t>4. 解决方法</w:t>
       </w:r>
     </w:p>
     <w:p>
       <w:pPr>
-        <w:spacing w:line="300" w:lineRule="auto" w:after="20"/>
-      </w:pPr>
-      <w:r>
-        <w:rPr>
-          <w:rFonts w:ascii="Times New Roman" w:hAnsi="Times New Roman" w:eastAsia="宋体"/>
-          <w:b w:val="0"/>
-          <w:color w:val="000000"/>
-          <w:sz w:val="24"/>
-        </w:rPr>
+        <w:spacing w:line="324" w:lineRule="auto"/>
+      </w:pPr>
+      <w:r>
         <w:t>① 做逐字节对比实验拿到真实数据支撑选型；按“测试方法—测试结果—结果分析”补充图表与典型问题闭环。</w:t>
       </w:r>
     </w:p>
     <w:p>
-      <w:pPr>
-        <w:spacing w:before="80" w:after="40"/>
-      </w:pPr>
-      <w:r>
-        <w:rPr>
-          <w:rFonts w:ascii="Arial" w:hAnsi="Arial" w:eastAsia="黑体"/>
-          <w:b/>
-          <w:color w:val="000000"/>
-          <w:sz w:val="24"/>
+      <w:r>
+        <w:rPr>
+          <w:b/>
         </w:rPr>
         <w:t>5. 今日成果</w:t>
       </w:r>
     </w:p>
     <w:p>
       <w:pPr>
-        <w:spacing w:line="300" w:lineRule="auto" w:after="20"/>
-      </w:pPr>
-      <w:r>
-        <w:rPr>
-          <w:rFonts w:ascii="Times New Roman" w:hAnsi="Times New Roman" w:eastAsia="宋体"/>
-          <w:b w:val="0"/>
-          <w:color w:val="000000"/>
-          <w:sz w:val="24"/>
-        </w:rPr>
+        <w:spacing w:line="324" w:lineRule="auto"/>
+      </w:pPr>
+      <w:r>
         <w:t>① 完成 MQTT/HTTP 对比实验与数据归档、监控端“选择订阅”功能、以及课程设计报告的撰写与扩充。</w:t>
       </w:r>
     </w:p>
     <w:p>
-      <w:pPr>
-        <w:spacing w:before="80" w:after="40"/>
-      </w:pPr>
-      <w:r>
-        <w:rPr>
-          <w:rFonts w:ascii="Arial" w:hAnsi="Arial" w:eastAsia="黑体"/>
-          <w:b/>
-          <w:color w:val="000000"/>
-          <w:sz w:val="24"/>
+      <w:r>
+        <w:rPr>
+          <w:b/>
         </w:rPr>
         <w:t>6. 明日计划</w:t>
       </w:r>
     </w:p>
     <w:p>
       <w:pPr>
-        <w:spacing w:line="300" w:lineRule="auto" w:after="20"/>
-      </w:pPr>
-      <w:r>
-        <w:rPr>
-          <w:rFonts w:ascii="Times New Roman" w:hAnsi="Times New Roman" w:eastAsia="宋体"/>
-          <w:b w:val="0"/>
-          <w:color w:val="000000"/>
-          <w:sz w:val="24"/>
-        </w:rPr>
+        <w:spacing w:line="324" w:lineRule="auto"/>
+      </w:pPr>
+      <w:r>
         <w:t>① 制作答辩 PPT 的协议与硬件部分，合并队友材料并提交全部成果。</w:t>
       </w:r>
     </w:p>
     <w:p>
       <w:pPr>
+        <w:pBdr>
+          <w:bottom w:val="single" w:sz="6" w:space="1" w:color="auto"/>
+        </w:pBdr>
+        <w:spacing w:after="120"/>
+      </w:pPr>
+    </w:p>
+    <w:p>
+      <w:pPr>
         <w:pStyle w:val="3"/>
-        <w:spacing w:before="200" w:after="80"/>
-      </w:pPr>
-      <w:r>
-        <w:rPr>
-          <w:rFonts w:ascii="Arial" w:hAnsi="Arial" w:eastAsia="黑体"/>
-          <w:b/>
-          <w:color w:val="000000"/>
-          <w:sz w:val="26"/>
-        </w:rPr>
+      </w:pPr>
+      <w:r>
         <w:t>第 10 个工作日：答辩 PPT 制作与成果提交</w:t>
       </w:r>
     </w:p>
     <w:p>
-      <w:pPr>
-        <w:spacing w:line="336" w:lineRule="auto" w:after="0"/>
-      </w:pPr>
-      <w:r>
-        <w:rPr>
-          <w:rFonts w:ascii="Times New Roman" w:hAnsi="Times New Roman" w:eastAsia="宋体"/>
-          <w:b w:val="0"/>
-          <w:color w:val="000000"/>
-          <w:sz w:val="24"/>
-        </w:rPr>
+      <w:r>
         <w:t>日期：2026年6月17日</w:t>
       </w:r>
     </w:p>
     <w:p>
-      <w:pPr>
-        <w:spacing w:before="80" w:after="40"/>
-      </w:pPr>
-      <w:r>
-        <w:rPr>
-          <w:rFonts w:ascii="Arial" w:hAnsi="Arial" w:eastAsia="黑体"/>
-          <w:b/>
-          <w:color w:val="000000"/>
-          <w:sz w:val="24"/>
+      <w:r>
+        <w:rPr>
+          <w:b/>
         </w:rPr>
         <w:t>1. 今日主要工作内容</w:t>
       </w:r>
     </w:p>
     <w:p>
       <w:pPr>
-        <w:spacing w:line="300" w:lineRule="auto" w:after="40"/>
-        <w:ind w:firstLine="480"/>
-      </w:pPr>
-      <w:r>
-        <w:rPr>
-          <w:rFonts w:ascii="Times New Roman" w:hAnsi="Times New Roman" w:eastAsia="宋体"/>
-          <w:b w:val="0"/>
-          <w:color w:val="000000"/>
-          <w:sz w:val="24"/>
-        </w:rPr>
+        <w:spacing w:line="324" w:lineRule="auto"/>
+      </w:pPr>
+      <w:r>
         <w:t>今天完善答辩 PPT，合入硬件队友材料，统一接线口径，并整理、提交全部课程设计成果，完成项目闭环。</w:t>
       </w:r>
     </w:p>
     <w:p>
-      <w:pPr>
-        <w:spacing w:before="80" w:after="40"/>
-      </w:pPr>
-      <w:r>
-        <w:rPr>
-          <w:rFonts w:ascii="Arial" w:hAnsi="Arial" w:eastAsia="黑体"/>
-          <w:b/>
-          <w:color w:val="000000"/>
-          <w:sz w:val="24"/>
+      <w:r>
+        <w:rPr>
+          <w:b/>
         </w:rPr>
         <w:t>2. 本人完成的具体任务</w:t>
       </w:r>
     </w:p>
     <w:p>
       <w:pPr>
-        <w:spacing w:line="300" w:lineRule="auto" w:after="20"/>
-      </w:pPr>
-      <w:r>
-        <w:rPr>
-          <w:rFonts w:ascii="Times New Roman" w:hAnsi="Times New Roman" w:eastAsia="宋体"/>
-          <w:b w:val="0"/>
-          <w:color w:val="000000"/>
-          <w:sz w:val="24"/>
-        </w:rPr>
+        <w:spacing w:line="324" w:lineRule="auto"/>
+      </w:pPr>
+      <w:r>
         <w:t>① 完善答辩 PPT：新增“为什么选 MQTT（对比 HTTP 实测）”页、重构 QoS 论证页（讲清 TCP 与 QoS 分工）、把 2 万连接压测移到校园案例作为实验支撑、新增两页 ESP32 硬件页（组成与传感器接入、Wi-Fi 配网）。</w:t>
       </w:r>
     </w:p>
     <w:p>
       <w:pPr>
-        <w:spacing w:line="300" w:lineRule="auto" w:after="20"/>
-      </w:pPr>
-      <w:r>
-        <w:rPr>
-          <w:rFonts w:ascii="Times New Roman" w:hAnsi="Times New Roman" w:eastAsia="宋体"/>
-          <w:b w:val="0"/>
-          <w:color w:val="000000"/>
-          <w:sz w:val="24"/>
-        </w:rPr>
+        <w:spacing w:line="324" w:lineRule="auto"/>
+      </w:pPr>
+      <w:r>
         <w:t>② 合并硬件队友的固件、测试记录与图片等 PR，统一接线口径（光照以串口/固件为准，即 BH1750）。</w:t>
       </w:r>
     </w:p>
     <w:p>
       <w:pPr>
-        <w:spacing w:line="300" w:lineRule="auto" w:after="20"/>
-      </w:pPr>
-      <w:r>
-        <w:rPr>
-          <w:rFonts w:ascii="Times New Roman" w:hAnsi="Times New Roman" w:eastAsia="宋体"/>
-          <w:b w:val="0"/>
-          <w:color w:val="000000"/>
-          <w:sz w:val="24"/>
-        </w:rPr>
+        <w:spacing w:line="324" w:lineRule="auto"/>
+      </w:pPr>
+      <w:r>
         <w:t>③ 核对课程设计报告、源代码、汇报 PPT、个人日志与测试附件齐备。</w:t>
       </w:r>
     </w:p>
     <w:p>
       <w:pPr>
-        <w:spacing w:line="300" w:lineRule="auto" w:after="20"/>
-      </w:pPr>
-      <w:r>
-        <w:rPr>
-          <w:rFonts w:ascii="Times New Roman" w:hAnsi="Times New Roman" w:eastAsia="宋体"/>
-          <w:b w:val="0"/>
-          <w:color w:val="000000"/>
-          <w:sz w:val="24"/>
-        </w:rPr>
+        <w:spacing w:line="324" w:lineRule="auto"/>
+      </w:pPr>
+      <w:r>
         <w:t>④ 用 Git 分模块提交并推送，保持过程留痕。</w:t>
       </w:r>
     </w:p>
     <w:p>
-      <w:pPr>
-        <w:spacing w:before="80" w:after="40"/>
-      </w:pPr>
-      <w:r>
-        <w:rPr>
-          <w:rFonts w:ascii="Arial" w:hAnsi="Arial" w:eastAsia="黑体"/>
-          <w:b/>
-          <w:color w:val="000000"/>
-          <w:sz w:val="24"/>
+      <w:r>
+        <w:rPr>
+          <w:b/>
         </w:rPr>
         <w:t>3. 遇到的问题</w:t>
       </w:r>
     </w:p>
     <w:p>
       <w:pPr>
-        <w:spacing w:line="300" w:lineRule="auto" w:after="20"/>
-      </w:pPr>
-      <w:r>
-        <w:rPr>
-          <w:rFonts w:ascii="Times New Roman" w:hAnsi="Times New Roman" w:eastAsia="宋体"/>
-          <w:b w:val="0"/>
-          <w:color w:val="000000"/>
-          <w:sz w:val="24"/>
-        </w:rPr>
+        <w:spacing w:line="324" w:lineRule="auto"/>
+      </w:pPr>
+      <w:r>
         <w:t>① 硬件接线图中光照模块标注与实际（BH1750）不一致；多份材料需统一并提交。</w:t>
       </w:r>
     </w:p>
     <w:p>
-      <w:pPr>
-        <w:spacing w:before="80" w:after="40"/>
-      </w:pPr>
-      <w:r>
-        <w:rPr>
-          <w:rFonts w:ascii="Arial" w:hAnsi="Arial" w:eastAsia="黑体"/>
-          <w:b/>
-          <w:color w:val="000000"/>
-          <w:sz w:val="24"/>
+      <w:r>
+        <w:rPr>
+          <w:b/>
         </w:rPr>
         <w:t>4. 解决方法</w:t>
       </w:r>
     </w:p>
     <w:p>
       <w:pPr>
-        <w:spacing w:line="300" w:lineRule="auto" w:after="20"/>
-      </w:pPr>
-      <w:r>
-        <w:rPr>
-          <w:rFonts w:ascii="Times New Roman" w:hAnsi="Times New Roman" w:eastAsia="宋体"/>
-          <w:b w:val="0"/>
-          <w:color w:val="000000"/>
-          <w:sz w:val="24"/>
-        </w:rPr>
+        <w:spacing w:line="324" w:lineRule="auto"/>
+      </w:pPr>
+      <w:r>
         <w:t>① 统一以串口/固件为准（BH1750），并提 Issue 请硬件队友更正接线图；分模块清点并提交全部成果。</w:t>
       </w:r>
     </w:p>
     <w:p>
-      <w:pPr>
-        <w:spacing w:before="80" w:after="40"/>
-      </w:pPr>
-      <w:r>
-        <w:rPr>
-          <w:rFonts w:ascii="Arial" w:hAnsi="Arial" w:eastAsia="黑体"/>
-          <w:b/>
-          <w:color w:val="000000"/>
-          <w:sz w:val="24"/>
+      <w:r>
+        <w:rPr>
+          <w:b/>
         </w:rPr>
         <w:t>5. 今日成果</w:t>
       </w:r>
     </w:p>
     <w:p>
       <w:pPr>
-        <w:spacing w:line="300" w:lineRule="auto" w:after="20"/>
-      </w:pPr>
-      <w:r>
-        <w:rPr>
-          <w:rFonts w:ascii="Times New Roman" w:hAnsi="Times New Roman" w:eastAsia="宋体"/>
-          <w:b w:val="0"/>
-          <w:color w:val="000000"/>
-          <w:sz w:val="24"/>
-        </w:rPr>
+        <w:spacing w:line="324" w:lineRule="auto"/>
+      </w:pPr>
+      <w:r>
         <w:t>① 完成答辩 PPT、材料合并与成果提交，课程设计形成完整闭环。</w:t>
       </w:r>
     </w:p>
     <w:p>
-      <w:pPr>
-        <w:spacing w:before="80" w:after="40"/>
-      </w:pPr>
-      <w:r>
-        <w:rPr>
-          <w:rFonts w:ascii="Arial" w:hAnsi="Arial" w:eastAsia="黑体"/>
-          <w:b/>
-          <w:color w:val="000000"/>
-          <w:sz w:val="24"/>
+      <w:r>
+        <w:rPr>
+          <w:b/>
         </w:rPr>
         <w:t>6. 明日计划</w:t>
       </w:r>
     </w:p>
     <w:p>
       <w:pPr>
-        <w:spacing w:line="300" w:lineRule="auto" w:after="20"/>
-      </w:pPr>
-      <w:r>
-        <w:rPr>
-          <w:rFonts w:ascii="Times New Roman" w:hAnsi="Times New Roman" w:eastAsia="宋体"/>
-          <w:b w:val="0"/>
-          <w:color w:val="000000"/>
-          <w:sz w:val="24"/>
-        </w:rPr>
+        <w:spacing w:line="324" w:lineRule="auto"/>
+      </w:pPr>
+      <w:r>
         <w:t>① 参加课程设计答辩演示。</w:t>
       </w:r>
     </w:p>
     <w:p>
       <w:pPr>
+        <w:pBdr>
+          <w:bottom w:val="single" w:sz="6" w:space="1" w:color="auto"/>
+        </w:pBdr>
+        <w:spacing w:after="120"/>
+      </w:pPr>
+    </w:p>
+    <w:p>
+      <w:pPr>
         <w:pStyle w:val="3"/>
-        <w:spacing w:before="200" w:after="80"/>
-      </w:pPr>
-      <w:r>
-        <w:rPr>
-          <w:rFonts w:ascii="Arial" w:hAnsi="Arial" w:eastAsia="黑体"/>
-          <w:b/>
-          <w:color w:val="000000"/>
-          <w:sz w:val="26"/>
-        </w:rPr>
+      </w:pPr>
+      <w:r>
         <w:t>个人总结</w:t>
       </w:r>
     </w:p>
     <w:p>
-      <w:pPr>
-        <w:spacing w:before="80" w:after="40"/>
-      </w:pPr>
-      <w:r>
-        <w:rPr>
-          <w:rFonts w:ascii="Arial" w:hAnsi="Arial" w:eastAsia="黑体"/>
-          <w:b/>
-          <w:color w:val="000000"/>
-          <w:sz w:val="24"/>
+      <w:r>
+        <w:rPr>
+          <w:b/>
         </w:rPr>
         <w:t>1. 本人在课程设计中的主要贡献</w:t>
       </w:r>
     </w:p>
     <w:p>
       <w:pPr>
-        <w:spacing w:line="300" w:lineRule="auto" w:after="40"/>
-        <w:ind w:firstLine="480"/>
-      </w:pPr>
-      <w:r>
-        <w:rPr>
-          <w:rFonts w:ascii="Times New Roman" w:hAnsi="Times New Roman" w:eastAsia="宋体"/>
-          <w:b w:val="0"/>
-          <w:color w:val="000000"/>
-          <w:sz w:val="24"/>
-        </w:rPr>
+        <w:spacing w:line="324" w:lineRule="auto"/>
+      </w:pPr>
+      <w:r>
         <w:t>负责软件侧与项目流程推进，主要包括：需求分析与 MQTT 主题/消息格式设计；PC 模拟节点与 Web 监控端实现；网络负载与服务器配置成本建模；MQTT 5.0 方案升级与 EMQX 选型；协议开销抓包、容量/吞吐压测、QoS×丢包与跨公网延迟等性能实验；需求-成本计算器；MQTT 与 HTTP 开销对比实验；ESP32 室外长测的服务器侧记录与分析；课程设计报告与答辩 PPT 的撰写制作。同时主导 GitHub 协作流程与项目进度推进。</w:t>
       </w:r>
     </w:p>
     <w:p>
-      <w:pPr>
-        <w:spacing w:before="80" w:after="40"/>
-      </w:pPr>
-      <w:r>
-        <w:rPr>
-          <w:rFonts w:ascii="Arial" w:hAnsi="Arial" w:eastAsia="黑体"/>
-          <w:b/>
-          <w:color w:val="000000"/>
-          <w:sz w:val="24"/>
+      <w:r>
+        <w:rPr>
+          <w:b/>
         </w:rPr>
         <w:t>2. 掌握的主要知识和技能</w:t>
       </w:r>
     </w:p>
     <w:p>
       <w:pPr>
-        <w:spacing w:line="300" w:lineRule="auto" w:after="40"/>
-        <w:ind w:firstLine="480"/>
-      </w:pPr>
-      <w:r>
-        <w:rPr>
-          <w:rFonts w:ascii="Times New Roman" w:hAnsi="Times New Roman" w:eastAsia="宋体"/>
-          <w:b w:val="0"/>
-          <w:color w:val="000000"/>
-          <w:sz w:val="24"/>
-        </w:rPr>
+        <w:spacing w:line="324" w:lineRule="auto"/>
+      </w:pPr>
+      <w:r>
         <w:t>MQTT 发布/订阅、主题设计、QoS 与持久会话；TCP 的可靠传输与重传；Wireshark 抓包与协议开销分析；EMQX 部署、压测与系统调优；Flask + SSE 实时 Web；网络负载与服务器容量、成本建模；Git 分支协作与 Issue/PR 评审。</w:t>
       </w:r>
     </w:p>
     <w:p>
-      <w:pPr>
-        <w:spacing w:before="80" w:after="40"/>
-      </w:pPr>
-      <w:r>
-        <w:rPr>
-          <w:rFonts w:ascii="Arial" w:hAnsi="Arial" w:eastAsia="黑体"/>
-          <w:b/>
-          <w:color w:val="000000"/>
-          <w:sz w:val="24"/>
+      <w:r>
+        <w:rPr>
+          <w:b/>
         </w:rPr>
         <w:t>3. 遇到的主要问题及解决过程</w:t>
       </w:r>
     </w:p>
     <w:p>
       <w:pPr>
-        <w:spacing w:line="300" w:lineRule="auto" w:after="40"/>
-        <w:ind w:firstLine="480"/>
-      </w:pPr>
-      <w:r>
-        <w:rPr>
-          <w:rFonts w:ascii="Times New Roman" w:hAnsi="Times New Roman" w:eastAsia="宋体"/>
-          <w:b w:val="0"/>
-          <w:color w:val="000000"/>
-          <w:sz w:val="24"/>
-        </w:rPr>
+        <w:spacing w:line="324" w:lineRule="auto"/>
+      </w:pPr>
+      <w:r>
         <w:t>中期反馈要求“需求驱动、考虑成本”，据此建立通用计算模型与需求计算器；内存单一系数估算不准，补满负载爬坡实验改为双模型；QoS 与 TCP 的关系易混淆，用 QoS×丢包实验厘清 QoS 价值在断连；演示 Broker 一致性问题，统一改用本地 EMQX；光照数据异常，经比对定位为硬件端 I2C 接触不良并配合修复。</w:t>
       </w:r>
     </w:p>
     <w:p>
-      <w:pPr>
-        <w:spacing w:before="80" w:after="40"/>
-      </w:pPr>
-      <w:r>
-        <w:rPr>
-          <w:rFonts w:ascii="Arial" w:hAnsi="Arial" w:eastAsia="黑体"/>
-          <w:b/>
-          <w:color w:val="000000"/>
-          <w:sz w:val="24"/>
+      <w:r>
+        <w:rPr>
+          <w:b/>
         </w:rPr>
         <w:t>4. 对系统设计的认识</w:t>
       </w:r>
     </w:p>
     <w:p>
       <w:pPr>
-        <w:spacing w:line="300" w:lineRule="auto" w:after="40"/>
-        <w:ind w:firstLine="480"/>
-      </w:pPr>
-      <w:r>
-        <w:rPr>
-          <w:rFonts w:ascii="Times New Roman" w:hAnsi="Times New Roman" w:eastAsia="宋体"/>
-          <w:b w:val="0"/>
-          <w:color w:val="000000"/>
-          <w:sz w:val="24"/>
-        </w:rPr>
+        <w:spacing w:line="324" w:lineRule="auto"/>
+      </w:pPr>
+      <w:r>
         <w:t>好的方案应由需求驱动、用实验量化、求一个有约束的最小成本，而非一味追求最强；软硬件采用同构接口、分层设计，并以完整的“需求—设计—实现—测试—分析”证据链支撑结论。</w:t>
       </w:r>
     </w:p>
     <w:p>
-      <w:pPr>
-        <w:spacing w:before="80" w:after="40"/>
-      </w:pPr>
-      <w:r>
-        <w:rPr>
-          <w:rFonts w:ascii="Arial" w:hAnsi="Arial" w:eastAsia="黑体"/>
-          <w:b/>
-          <w:color w:val="000000"/>
-          <w:sz w:val="24"/>
+      <w:r>
+        <w:rPr>
+          <w:b/>
         </w:rPr>
         <w:t>5. 不足与改进方向</w:t>
       </w:r>
     </w:p>
     <w:p>
       <w:pPr>
-        <w:spacing w:line="300" w:lineRule="auto" w:after="40"/>
-        <w:ind w:firstLine="480"/>
-      </w:pPr>
-      <w:r>
-        <w:rPr>
-          <w:rFonts w:ascii="Times New Roman" w:hAnsi="Times New Roman" w:eastAsia="宋体"/>
-          <w:b w:val="0"/>
-          <w:color w:val="000000"/>
-          <w:sz w:val="24"/>
-        </w:rPr>
+        <w:spacing w:line="324" w:lineRule="auto"/>
+      </w:pPr>
+      <w:r>
         <w:t>现场供网稳定性不足、下行带宽随订阅端数放大、缺少数据持久化与告警、Broker 尚未启用认证与加密、硬件可靠性与 OTA 维护等，均为后续可改进的方向。</w:t>
       </w:r>
     </w:p>
     <w:p>
       <w:pPr>
         <w:pStyle w:val="3"/>
-        <w:spacing w:before="200" w:after="80"/>
-      </w:pPr>
-      <w:r>
-        <w:rPr>
-          <w:rFonts w:ascii="Arial" w:hAnsi="Arial" w:eastAsia="黑体"/>
-          <w:b/>
-          <w:color w:val="000000"/>
-          <w:sz w:val="26"/>
-        </w:rPr>
+      </w:pPr>
+      <w:r>
         <w:t>附：测试与提交记录</w:t>
       </w:r>
     </w:p>
     <w:p>
-      <w:pPr>
-        <w:spacing w:before="80" w:after="40"/>
-      </w:pPr>
-      <w:r>
-        <w:rPr>
-          <w:rFonts w:ascii="Arial" w:hAnsi="Arial" w:eastAsia="黑体"/>
-          <w:b/>
-          <w:color w:val="000000"/>
-          <w:sz w:val="24"/>
+      <w:r>
+        <w:rPr>
+          <w:b/>
         </w:rPr>
         <w:t>表 1  软件侧性能与协议测试结果</w:t>
       </w:r>
@@ -3805,7 +2562,7 @@
                 <w:rFonts w:ascii="Arial" w:hAnsi="Arial" w:eastAsia="黑体"/>
                 <w:b/>
                 <w:color w:val="000000"/>
-                <w:sz w:val="21"/>
+                <w:sz w:val="18"/>
               </w:rPr>
               <w:t>测试项目</w:t>
             </w:r>
@@ -3824,7 +2581,7 @@
                 <w:rFonts w:ascii="Arial" w:hAnsi="Arial" w:eastAsia="黑体"/>
                 <w:b/>
                 <w:color w:val="000000"/>
-                <w:sz w:val="21"/>
+                <w:sz w:val="18"/>
               </w:rPr>
               <w:t>测试方法</w:t>
             </w:r>
@@ -3843,7 +2600,7 @@
                 <w:rFonts w:ascii="Arial" w:hAnsi="Arial" w:eastAsia="黑体"/>
                 <w:b/>
                 <w:color w:val="000000"/>
-                <w:sz w:val="21"/>
+                <w:sz w:val="18"/>
               </w:rPr>
               <w:t>测试结果</w:t>
             </w:r>
@@ -3862,7 +2619,7 @@
                 <w:rFonts w:ascii="Arial" w:hAnsi="Arial" w:eastAsia="黑体"/>
                 <w:b/>
                 <w:color w:val="000000"/>
-                <w:sz w:val="21"/>
+                <w:sz w:val="18"/>
               </w:rPr>
               <w:t>是否通过</w:t>
             </w:r>
@@ -3881,7 +2638,7 @@
                 <w:rFonts w:ascii="Arial" w:hAnsi="Arial" w:eastAsia="黑体"/>
                 <w:b/>
                 <w:color w:val="000000"/>
-                <w:sz w:val="21"/>
+                <w:sz w:val="18"/>
               </w:rPr>
               <w:t>备注</w:t>
             </w:r>
@@ -3899,7 +2656,7 @@
                 <w:rFonts w:ascii="Times New Roman" w:hAnsi="Times New Roman" w:eastAsia="宋体"/>
                 <w:b w:val="0"/>
                 <w:color w:val="000000"/>
-                <w:sz w:val="21"/>
+                <w:sz w:val="18"/>
               </w:rPr>
               <w:t>功能连通性</w:t>
             </w:r>
@@ -3915,7 +2672,7 @@
                 <w:rFonts w:ascii="Times New Roman" w:hAnsi="Times New Roman" w:eastAsia="宋体"/>
                 <w:b w:val="0"/>
                 <w:color w:val="000000"/>
-                <w:sz w:val="21"/>
+                <w:sz w:val="18"/>
               </w:rPr>
               <w:t>双节点并发上传，按 seq 逐条对照</w:t>
             </w:r>
@@ -3931,7 +2688,7 @@
                 <w:rFonts w:ascii="Times New Roman" w:hAnsi="Times New Roman" w:eastAsia="宋体"/>
                 <w:b w:val="0"/>
                 <w:color w:val="000000"/>
-                <w:sz w:val="21"/>
+                <w:sz w:val="18"/>
               </w:rPr>
               <w:t>到达率 100%（48/48），重连约 7 s，QoS 1 离线 12 条全部补发</w:t>
             </w:r>
@@ -3947,7 +2704,7 @@
                 <w:rFonts w:ascii="Times New Roman" w:hAnsi="Times New Roman" w:eastAsia="宋体"/>
                 <w:b w:val="0"/>
                 <w:color w:val="000000"/>
-                <w:sz w:val="21"/>
+                <w:sz w:val="18"/>
               </w:rPr>
               <w:t>通过</w:t>
             </w:r>
@@ -3963,7 +2720,7 @@
                 <w:rFonts w:ascii="Times New Roman" w:hAnsi="Times New Roman" w:eastAsia="宋体"/>
                 <w:b w:val="0"/>
                 <w:color w:val="000000"/>
-                <w:sz w:val="21"/>
+                <w:sz w:val="18"/>
               </w:rPr>
               <w:t>软件链路完整</w:t>
             </w:r>
@@ -3981,7 +2738,7 @@
                 <w:rFonts w:ascii="Times New Roman" w:hAnsi="Times New Roman" w:eastAsia="宋体"/>
                 <w:b w:val="0"/>
                 <w:color w:val="000000"/>
-                <w:sz w:val="21"/>
+                <w:sz w:val="18"/>
               </w:rPr>
               <w:t>协议开销（抓包）</w:t>
             </w:r>
@@ -3997,7 +2754,7 @@
                 <w:rFonts w:ascii="Times New Roman" w:hAnsi="Times New Roman" w:eastAsia="宋体"/>
                 <w:b w:val="0"/>
                 <w:color w:val="000000"/>
-                <w:sz w:val="21"/>
+                <w:sz w:val="18"/>
               </w:rPr>
               <w:t>Wireshark 抓不同 QoS/格式/Alias/版本</w:t>
             </w:r>
@@ -4013,7 +2770,7 @@
                 <w:rFonts w:ascii="Times New Roman" w:hAnsi="Times New Roman" w:eastAsia="宋体"/>
                 <w:b w:val="0"/>
                 <w:color w:val="000000"/>
-                <w:sz w:val="21"/>
+                <w:sz w:val="18"/>
               </w:rPr>
               <w:t>单条 json/json-min/msgpack = 261.9/203.0/185.9 B，Alias 每条省 21.3 B</w:t>
             </w:r>
@@ -4029,7 +2786,7 @@
                 <w:rFonts w:ascii="Times New Roman" w:hAnsi="Times New Roman" w:eastAsia="宋体"/>
                 <w:b w:val="0"/>
                 <w:color w:val="000000"/>
-                <w:sz w:val="21"/>
+                <w:sz w:val="18"/>
               </w:rPr>
               <w:t>通过</w:t>
             </w:r>
@@ -4045,7 +2802,7 @@
                 <w:rFonts w:ascii="Times New Roman" w:hAnsi="Times New Roman" w:eastAsia="宋体"/>
                 <w:b w:val="0"/>
                 <w:color w:val="000000"/>
-                <w:sz w:val="21"/>
+                <w:sz w:val="18"/>
               </w:rPr>
               <w:t>作为带宽系数</w:t>
             </w:r>
@@ -4063,7 +2820,7 @@
                 <w:rFonts w:ascii="Times New Roman" w:hAnsi="Times New Roman" w:eastAsia="宋体"/>
                 <w:b w:val="0"/>
                 <w:color w:val="000000"/>
-                <w:sz w:val="21"/>
+                <w:sz w:val="18"/>
               </w:rPr>
               <w:t>容量压测（EMQX）</w:t>
             </w:r>
@@ -4079,7 +2836,7 @@
                 <w:rFonts w:ascii="Times New Roman" w:hAnsi="Times New Roman" w:eastAsia="宋体"/>
                 <w:b w:val="0"/>
                 <w:color w:val="000000"/>
-                <w:sz w:val="21"/>
+                <w:sz w:val="18"/>
               </w:rPr>
               <w:t>连接爬坡至 5 万</w:t>
             </w:r>
@@ -4095,7 +2852,7 @@
                 <w:rFonts w:ascii="Times New Roman" w:hAnsi="Times New Roman" w:eastAsia="宋体"/>
                 <w:b w:val="0"/>
                 <w:color w:val="000000"/>
-                <w:sz w:val="21"/>
+                <w:sz w:val="18"/>
               </w:rPr>
               <w:t>5 万连接约 1.05 GB（15.75 KB/连），满载 38.76 KB/连（2.46×）</w:t>
             </w:r>
@@ -4111,7 +2868,7 @@
                 <w:rFonts w:ascii="Times New Roman" w:hAnsi="Times New Roman" w:eastAsia="宋体"/>
                 <w:b w:val="0"/>
                 <w:color w:val="000000"/>
-                <w:sz w:val="21"/>
+                <w:sz w:val="18"/>
               </w:rPr>
               <w:t>通过</w:t>
             </w:r>
@@ -4127,7 +2884,7 @@
                 <w:rFonts w:ascii="Times New Roman" w:hAnsi="Times New Roman" w:eastAsia="宋体"/>
                 <w:b w:val="0"/>
                 <w:color w:val="000000"/>
-                <w:sz w:val="21"/>
+                <w:sz w:val="18"/>
               </w:rPr>
               <w:t>选型按满载上界</w:t>
             </w:r>
@@ -4145,7 +2902,7 @@
                 <w:rFonts w:ascii="Times New Roman" w:hAnsi="Times New Roman" w:eastAsia="宋体"/>
                 <w:b w:val="0"/>
                 <w:color w:val="000000"/>
-                <w:sz w:val="21"/>
+                <w:sz w:val="18"/>
               </w:rPr>
               <w:t>吞吐压测（EMQX）</w:t>
             </w:r>
@@ -4161,7 +2918,7 @@
                 <w:rFonts w:ascii="Times New Roman" w:hAnsi="Times New Roman" w:eastAsia="宋体"/>
                 <w:b w:val="0"/>
                 <w:color w:val="000000"/>
-                <w:sz w:val="21"/>
+                <w:sz w:val="18"/>
               </w:rPr>
               <w:t>消息吞吐压测</w:t>
             </w:r>
@@ -4177,7 +2934,7 @@
                 <w:rFonts w:ascii="Times New Roman" w:hAnsi="Times New Roman" w:eastAsia="宋体"/>
                 <w:b w:val="0"/>
                 <w:color w:val="000000"/>
-                <w:sz w:val="21"/>
+                <w:sz w:val="18"/>
               </w:rPr>
               <w:t>5 万条/秒约 3.2 核（约 1.9 万条/核·秒）</w:t>
             </w:r>
@@ -4193,7 +2950,7 @@
                 <w:rFonts w:ascii="Times New Roman" w:hAnsi="Times New Roman" w:eastAsia="宋体"/>
                 <w:b w:val="0"/>
                 <w:color w:val="000000"/>
-                <w:sz w:val="21"/>
+                <w:sz w:val="18"/>
               </w:rPr>
               <w:t>通过</w:t>
             </w:r>
@@ -4209,7 +2966,7 @@
                 <w:rFonts w:ascii="Times New Roman" w:hAnsi="Times New Roman" w:eastAsia="宋体"/>
                 <w:b w:val="0"/>
                 <w:color w:val="000000"/>
-                <w:sz w:val="21"/>
+                <w:sz w:val="18"/>
               </w:rPr>
               <w:t>对照 amqtt 千级即单核饱和</w:t>
             </w:r>
@@ -4227,7 +2984,7 @@
                 <w:rFonts w:ascii="Times New Roman" w:hAnsi="Times New Roman" w:eastAsia="宋体"/>
                 <w:b w:val="0"/>
                 <w:color w:val="000000"/>
-                <w:sz w:val="21"/>
+                <w:sz w:val="18"/>
               </w:rPr>
               <w:t>QoS × 丢包</w:t>
             </w:r>
@@ -4243,7 +3000,7 @@
                 <w:rFonts w:ascii="Times New Roman" w:hAnsi="Times New Roman" w:eastAsia="宋体"/>
                 <w:b w:val="0"/>
                 <w:color w:val="000000"/>
-                <w:sz w:val="21"/>
+                <w:sz w:val="18"/>
               </w:rPr>
               <w:t>0–15% 人为丢包测三种 QoS</w:t>
             </w:r>
@@ -4259,7 +3016,7 @@
                 <w:rFonts w:ascii="Times New Roman" w:hAnsi="Times New Roman" w:eastAsia="宋体"/>
                 <w:b w:val="0"/>
                 <w:color w:val="000000"/>
-                <w:sz w:val="21"/>
+                <w:sz w:val="18"/>
               </w:rPr>
               <w:t>三种 QoS 到达率均 100%（TCP 重传），延迟随丢包率上升</w:t>
             </w:r>
@@ -4275,7 +3032,7 @@
                 <w:rFonts w:ascii="Times New Roman" w:hAnsi="Times New Roman" w:eastAsia="宋体"/>
                 <w:b w:val="0"/>
                 <w:color w:val="000000"/>
-                <w:sz w:val="21"/>
+                <w:sz w:val="18"/>
               </w:rPr>
               <w:t>通过</w:t>
             </w:r>
@@ -4291,7 +3048,7 @@
                 <w:rFonts w:ascii="Times New Roman" w:hAnsi="Times New Roman" w:eastAsia="宋体"/>
                 <w:b w:val="0"/>
                 <w:color w:val="000000"/>
-                <w:sz w:val="21"/>
+                <w:sz w:val="18"/>
               </w:rPr>
               <w:t>QoS 价值在断连</w:t>
             </w:r>
@@ -4309,7 +3066,7 @@
                 <w:rFonts w:ascii="Times New Roman" w:hAnsi="Times New Roman" w:eastAsia="宋体"/>
                 <w:b w:val="0"/>
                 <w:color w:val="000000"/>
-                <w:sz w:val="21"/>
+                <w:sz w:val="18"/>
               </w:rPr>
               <w:t>跨公网延迟</w:t>
             </w:r>
@@ -4325,7 +3082,7 @@
                 <w:rFonts w:ascii="Times New Roman" w:hAnsi="Times New Roman" w:eastAsia="宋体"/>
                 <w:b w:val="0"/>
                 <w:color w:val="000000"/>
-                <w:sz w:val="21"/>
+                <w:sz w:val="18"/>
               </w:rPr>
               <w:t>节点经公网发布、监控端订阅</w:t>
             </w:r>
@@ -4341,7 +3098,7 @@
                 <w:rFonts w:ascii="Times New Roman" w:hAnsi="Times New Roman" w:eastAsia="宋体"/>
                 <w:b w:val="0"/>
                 <w:color w:val="000000"/>
-                <w:sz w:val="21"/>
+                <w:sz w:val="18"/>
               </w:rPr>
               <w:t>平均 44.7 ms、到达率 100%、断线重连 5.2 s</w:t>
             </w:r>
@@ -4357,7 +3114,7 @@
                 <w:rFonts w:ascii="Times New Roman" w:hAnsi="Times New Roman" w:eastAsia="宋体"/>
                 <w:b w:val="0"/>
                 <w:color w:val="000000"/>
-                <w:sz w:val="21"/>
+                <w:sz w:val="18"/>
               </w:rPr>
               <w:t>通过</w:t>
             </w:r>
@@ -4373,7 +3130,7 @@
                 <w:rFonts w:ascii="Times New Roman" w:hAnsi="Times New Roman" w:eastAsia="宋体"/>
                 <w:b w:val="0"/>
                 <w:color w:val="000000"/>
-                <w:sz w:val="21"/>
+                <w:sz w:val="18"/>
               </w:rPr>
               <w:t>满足 ≤ 1 s</w:t>
             </w:r>
@@ -4391,7 +3148,7 @@
                 <w:rFonts w:ascii="Times New Roman" w:hAnsi="Times New Roman" w:eastAsia="宋体"/>
                 <w:b w:val="0"/>
                 <w:color w:val="000000"/>
-                <w:sz w:val="21"/>
+                <w:sz w:val="18"/>
               </w:rPr>
               <w:t>实景压测</w:t>
             </w:r>
@@ -4407,7 +3164,7 @@
                 <w:rFonts w:ascii="Times New Roman" w:hAnsi="Times New Roman" w:eastAsia="宋体"/>
                 <w:b w:val="0"/>
                 <w:color w:val="000000"/>
-                <w:sz w:val="21"/>
+                <w:sz w:val="18"/>
               </w:rPr>
               <w:t>2 万连接、30 分钟、10 路转发</w:t>
             </w:r>
@@ -4423,7 +3180,7 @@
                 <w:rFonts w:ascii="Times New Roman" w:hAnsi="Times New Roman" w:eastAsia="宋体"/>
                 <w:b w:val="0"/>
                 <w:color w:val="000000"/>
-                <w:sz w:val="21"/>
+                <w:sz w:val="18"/>
               </w:rPr>
               <w:t>连接零掉线，转发送达 99.96%，CPU 约 1.1 核、内存约 1.5 GB</w:t>
             </w:r>
@@ -4439,7 +3196,7 @@
                 <w:rFonts w:ascii="Times New Roman" w:hAnsi="Times New Roman" w:eastAsia="宋体"/>
                 <w:b w:val="0"/>
                 <w:color w:val="000000"/>
-                <w:sz w:val="21"/>
+                <w:sz w:val="18"/>
               </w:rPr>
               <w:t>通过</w:t>
             </w:r>
@@ -4455,7 +3212,7 @@
                 <w:rFonts w:ascii="Times New Roman" w:hAnsi="Times New Roman" w:eastAsia="宋体"/>
                 <w:b w:val="0"/>
                 <w:color w:val="000000"/>
-                <w:sz w:val="21"/>
+                <w:sz w:val="18"/>
               </w:rPr>
               <w:t>与计算器预测吻合</w:t>
             </w:r>
@@ -4473,7 +3230,7 @@
                 <w:rFonts w:ascii="Times New Roman" w:hAnsi="Times New Roman" w:eastAsia="宋体"/>
                 <w:b w:val="0"/>
                 <w:color w:val="000000"/>
-                <w:sz w:val="21"/>
+                <w:sz w:val="18"/>
               </w:rPr>
               <w:t>MQTT vs HTTP</w:t>
             </w:r>
@@ -4489,7 +3246,7 @@
                 <w:rFonts w:ascii="Times New Roman" w:hAnsi="Times New Roman" w:eastAsia="宋体"/>
                 <w:b w:val="0"/>
                 <w:color w:val="000000"/>
-                <w:sz w:val="21"/>
+                <w:sz w:val="18"/>
               </w:rPr>
               <w:t>同一条数据逐字节对比</w:t>
             </w:r>
@@ -4505,7 +3262,7 @@
                 <w:rFonts w:ascii="Times New Roman" w:hAnsi="Times New Roman" w:eastAsia="宋体"/>
                 <w:b w:val="0"/>
                 <w:color w:val="000000"/>
-                <w:sz w:val="21"/>
+                <w:sz w:val="18"/>
               </w:rPr>
               <w:t>MQTT 比 HTTP 省 65%~77%，协议头约为其 1/8</w:t>
             </w:r>
@@ -4521,7 +3278,7 @@
                 <w:rFonts w:ascii="Times New Roman" w:hAnsi="Times New Roman" w:eastAsia="宋体"/>
                 <w:b w:val="0"/>
                 <w:color w:val="000000"/>
-                <w:sz w:val="21"/>
+                <w:sz w:val="18"/>
               </w:rPr>
               <w:t>通过</w:t>
             </w:r>
@@ -4537,7 +3294,7 @@
                 <w:rFonts w:ascii="Times New Roman" w:hAnsi="Times New Roman" w:eastAsia="宋体"/>
                 <w:b w:val="0"/>
                 <w:color w:val="000000"/>
-                <w:sz w:val="21"/>
+                <w:sz w:val="18"/>
               </w:rPr>
               <w:t>支撑协议选型</w:t>
             </w:r>
@@ -4551,15 +3308,9 @@
       </w:pPr>
     </w:p>
     <w:p>
-      <w:pPr>
-        <w:spacing w:before="80" w:after="40"/>
-      </w:pPr>
-      <w:r>
-        <w:rPr>
-          <w:rFonts w:ascii="Arial" w:hAnsi="Arial" w:eastAsia="黑体"/>
-          <w:b/>
-          <w:color w:val="000000"/>
-          <w:sz w:val="24"/>
+      <w:r>
+        <w:rPr>
+          <w:b/>
         </w:rPr>
         <w:t>表 2  关键指标实测</w:t>
       </w:r>
@@ -4598,7 +3349,7 @@
                 <w:rFonts w:ascii="Arial" w:hAnsi="Arial" w:eastAsia="黑体"/>
                 <w:b/>
                 <w:color w:val="000000"/>
-                <w:sz w:val="21"/>
+                <w:sz w:val="18"/>
               </w:rPr>
               <w:t>测试指标</w:t>
             </w:r>
@@ -4617,7 +3368,7 @@
                 <w:rFonts w:ascii="Arial" w:hAnsi="Arial" w:eastAsia="黑体"/>
                 <w:b/>
                 <w:color w:val="000000"/>
-                <w:sz w:val="21"/>
+                <w:sz w:val="18"/>
               </w:rPr>
               <w:t>测试条件</w:t>
             </w:r>
@@ -4636,7 +3387,7 @@
                 <w:rFonts w:ascii="Arial" w:hAnsi="Arial" w:eastAsia="黑体"/>
                 <w:b/>
                 <w:color w:val="000000"/>
-                <w:sz w:val="21"/>
+                <w:sz w:val="18"/>
               </w:rPr>
               <w:t>测试结果</w:t>
             </w:r>
@@ -4655,7 +3406,7 @@
                 <w:rFonts w:ascii="Arial" w:hAnsi="Arial" w:eastAsia="黑体"/>
                 <w:b/>
                 <w:color w:val="000000"/>
-                <w:sz w:val="21"/>
+                <w:sz w:val="18"/>
               </w:rPr>
               <w:t>结果分析</w:t>
             </w:r>
@@ -4673,7 +3424,7 @@
                 <w:rFonts w:ascii="Times New Roman" w:hAnsi="Times New Roman" w:eastAsia="宋体"/>
                 <w:b w:val="0"/>
                 <w:color w:val="000000"/>
-                <w:sz w:val="21"/>
+                <w:sz w:val="18"/>
               </w:rPr>
               <w:t>消息到达率</w:t>
             </w:r>
@@ -4689,7 +3440,7 @@
                 <w:rFonts w:ascii="Times New Roman" w:hAnsi="Times New Roman" w:eastAsia="宋体"/>
                 <w:b w:val="0"/>
                 <w:color w:val="000000"/>
-                <w:sz w:val="21"/>
+                <w:sz w:val="18"/>
               </w:rPr>
               <w:t>按 seq 逐条统计实收/应收</w:t>
             </w:r>
@@ -4705,7 +3456,7 @@
                 <w:rFonts w:ascii="Times New Roman" w:hAnsi="Times New Roman" w:eastAsia="宋体"/>
                 <w:b w:val="0"/>
                 <w:color w:val="000000"/>
-                <w:sz w:val="21"/>
+                <w:sz w:val="18"/>
               </w:rPr>
               <w:t>功能测试 100%，ESP32 真机 15 h 为 95.0%</w:t>
             </w:r>
@@ -4721,7 +3472,7 @@
                 <w:rFonts w:ascii="Times New Roman" w:hAnsi="Times New Roman" w:eastAsia="宋体"/>
                 <w:b w:val="0"/>
                 <w:color w:val="000000"/>
-                <w:sz w:val="21"/>
+                <w:sz w:val="18"/>
               </w:rPr>
               <w:t>网络短时中断计入仍达标（≥ 95%）</w:t>
             </w:r>
@@ -4739,7 +3490,7 @@
                 <w:rFonts w:ascii="Times New Roman" w:hAnsi="Times New Roman" w:eastAsia="宋体"/>
                 <w:b w:val="0"/>
                 <w:color w:val="000000"/>
-                <w:sz w:val="21"/>
+                <w:sz w:val="18"/>
               </w:rPr>
               <w:t>平均传输延迟</w:t>
             </w:r>
@@ -4755,7 +3506,7 @@
                 <w:rFonts w:ascii="Times New Roman" w:hAnsi="Times New Roman" w:eastAsia="宋体"/>
                 <w:b w:val="0"/>
                 <w:color w:val="000000"/>
-                <w:sz w:val="21"/>
+                <w:sz w:val="18"/>
               </w:rPr>
               <w:t>跨公网 MQTT 发布/订阅</w:t>
             </w:r>
@@ -4771,7 +3522,7 @@
                 <w:rFonts w:ascii="Times New Roman" w:hAnsi="Times New Roman" w:eastAsia="宋体"/>
                 <w:b w:val="0"/>
                 <w:color w:val="000000"/>
-                <w:sz w:val="21"/>
+                <w:sz w:val="18"/>
               </w:rPr>
               <w:t>平均 44.7 ms（P95 约 85 ms）</w:t>
             </w:r>
@@ -4787,7 +3538,7 @@
                 <w:rFonts w:ascii="Times New Roman" w:hAnsi="Times New Roman" w:eastAsia="宋体"/>
                 <w:b w:val="0"/>
                 <w:color w:val="000000"/>
-                <w:sz w:val="21"/>
+                <w:sz w:val="18"/>
               </w:rPr>
               <w:t>远优于 ≤ 1 s，适合环境监测</w:t>
             </w:r>
@@ -4805,7 +3556,7 @@
                 <w:rFonts w:ascii="Times New Roman" w:hAnsi="Times New Roman" w:eastAsia="宋体"/>
                 <w:b w:val="0"/>
                 <w:color w:val="000000"/>
-                <w:sz w:val="21"/>
+                <w:sz w:val="18"/>
               </w:rPr>
               <w:t>断线重连恢复</w:t>
             </w:r>
@@ -4821,7 +3572,7 @@
                 <w:rFonts w:ascii="Times New Roman" w:hAnsi="Times New Roman" w:eastAsia="宋体"/>
                 <w:b w:val="0"/>
                 <w:color w:val="000000"/>
-                <w:sz w:val="21"/>
+                <w:sz w:val="18"/>
               </w:rPr>
               <w:t>断网后自动恢复并续传</w:t>
             </w:r>
@@ -4837,7 +3588,7 @@
                 <w:rFonts w:ascii="Times New Roman" w:hAnsi="Times New Roman" w:eastAsia="宋体"/>
                 <w:b w:val="0"/>
                 <w:color w:val="000000"/>
-                <w:sz w:val="21"/>
+                <w:sz w:val="18"/>
               </w:rPr>
               <w:t>EMQX 约 5.2 s，节点功能测试约 7 s</w:t>
             </w:r>
@@ -4853,7 +3604,7 @@
                 <w:rFonts w:ascii="Times New Roman" w:hAnsi="Times New Roman" w:eastAsia="宋体"/>
                 <w:b w:val="0"/>
                 <w:color w:val="000000"/>
-                <w:sz w:val="21"/>
+                <w:sz w:val="18"/>
               </w:rPr>
               <w:t>满足 ≤ 10 s</w:t>
             </w:r>
@@ -4871,7 +3622,7 @@
                 <w:rFonts w:ascii="Times New Roman" w:hAnsi="Times New Roman" w:eastAsia="宋体"/>
                 <w:b w:val="0"/>
                 <w:color w:val="000000"/>
-                <w:sz w:val="21"/>
+                <w:sz w:val="18"/>
               </w:rPr>
               <w:t>单机容量</w:t>
             </w:r>
@@ -4887,7 +3638,7 @@
                 <w:rFonts w:ascii="Times New Roman" w:hAnsi="Times New Roman" w:eastAsia="宋体"/>
                 <w:b w:val="0"/>
                 <w:color w:val="000000"/>
-                <w:sz w:val="21"/>
+                <w:sz w:val="18"/>
               </w:rPr>
               <w:t>EMQX 连接爬坡</w:t>
             </w:r>
@@ -4903,7 +3654,7 @@
                 <w:rFonts w:ascii="Times New Roman" w:hAnsi="Times New Roman" w:eastAsia="宋体"/>
                 <w:b w:val="0"/>
                 <w:color w:val="000000"/>
-                <w:sz w:val="21"/>
+                <w:sz w:val="18"/>
               </w:rPr>
               <w:t>5 万连接约 1 GB 内存，远未触顶</w:t>
             </w:r>
@@ -4919,7 +3670,7 @@
                 <w:rFonts w:ascii="Times New Roman" w:hAnsi="Times New Roman" w:eastAsia="宋体"/>
                 <w:b w:val="0"/>
                 <w:color w:val="000000"/>
-                <w:sz w:val="21"/>
+                <w:sz w:val="18"/>
               </w:rPr>
               <w:t>万级场景余量大，可横向扩展</w:t>
             </w:r>
@@ -4937,7 +3688,7 @@
                 <w:rFonts w:ascii="Times New Roman" w:hAnsi="Times New Roman" w:eastAsia="宋体"/>
                 <w:b w:val="0"/>
                 <w:color w:val="000000"/>
-                <w:sz w:val="21"/>
+                <w:sz w:val="18"/>
               </w:rPr>
               <w:t>处理吞吐</w:t>
             </w:r>
@@ -4953,7 +3704,7 @@
                 <w:rFonts w:ascii="Times New Roman" w:hAnsi="Times New Roman" w:eastAsia="宋体"/>
                 <w:b w:val="0"/>
                 <w:color w:val="000000"/>
-                <w:sz w:val="21"/>
+                <w:sz w:val="18"/>
               </w:rPr>
               <w:t>EMQX 消息压测</w:t>
             </w:r>
@@ -4969,7 +3720,7 @@
                 <w:rFonts w:ascii="Times New Roman" w:hAnsi="Times New Roman" w:eastAsia="宋体"/>
                 <w:b w:val="0"/>
                 <w:color w:val="000000"/>
-                <w:sz w:val="21"/>
+                <w:sz w:val="18"/>
               </w:rPr>
               <w:t>5 万条/秒约 3.2 核</w:t>
             </w:r>
@@ -4985,7 +3736,7 @@
                 <w:rFonts w:ascii="Times New Roman" w:hAnsi="Times New Roman" w:eastAsia="宋体"/>
                 <w:b w:val="0"/>
                 <w:color w:val="000000"/>
-                <w:sz w:val="21"/>
+                <w:sz w:val="18"/>
               </w:rPr>
               <w:t>单节点压力远低于此，瓶颈在带宽/存储</w:t>
             </w:r>
@@ -5003,7 +3754,7 @@
                 <w:rFonts w:ascii="Times New Roman" w:hAnsi="Times New Roman" w:eastAsia="宋体"/>
                 <w:b w:val="0"/>
                 <w:color w:val="000000"/>
-                <w:sz w:val="21"/>
+                <w:sz w:val="18"/>
               </w:rPr>
               <w:t>连续运行稳定性</w:t>
             </w:r>
@@ -5019,7 +3770,7 @@
                 <w:rFonts w:ascii="Times New Roman" w:hAnsi="Times New Roman" w:eastAsia="宋体"/>
                 <w:b w:val="0"/>
                 <w:color w:val="000000"/>
-                <w:sz w:val="21"/>
+                <w:sz w:val="18"/>
               </w:rPr>
               <w:t>2 万连接 30 min + 真机约 15 h</w:t>
             </w:r>
@@ -5035,7 +3786,7 @@
                 <w:rFonts w:ascii="Times New Roman" w:hAnsi="Times New Roman" w:eastAsia="宋体"/>
                 <w:b w:val="0"/>
                 <w:color w:val="000000"/>
-                <w:sz w:val="21"/>
+                <w:sz w:val="18"/>
               </w:rPr>
               <w:t>零掉线、形成完整曲线</w:t>
             </w:r>
@@ -5051,7 +3802,7 @@
                 <w:rFonts w:ascii="Times New Roman" w:hAnsi="Times New Roman" w:eastAsia="宋体"/>
                 <w:b w:val="0"/>
                 <w:color w:val="000000"/>
-                <w:sz w:val="21"/>
+                <w:sz w:val="18"/>
               </w:rPr>
               <w:t>长时间稳定达标</w:t>
             </w:r>
@@ -5065,15 +3816,9 @@
       </w:pPr>
     </w:p>
     <w:p>
-      <w:pPr>
-        <w:spacing w:before="80" w:after="40"/>
-      </w:pPr>
-      <w:r>
-        <w:rPr>
-          <w:rFonts w:ascii="Arial" w:hAnsi="Arial" w:eastAsia="黑体"/>
-          <w:b/>
-          <w:color w:val="000000"/>
-          <w:sz w:val="24"/>
+      <w:r>
+        <w:rPr>
+          <w:b/>
         </w:rPr>
         <w:t>表 3  提交材料清单</w:t>
       </w:r>
@@ -5111,7 +3856,7 @@
                 <w:rFonts w:ascii="Arial" w:hAnsi="Arial" w:eastAsia="黑体"/>
                 <w:b/>
                 <w:color w:val="000000"/>
-                <w:sz w:val="21"/>
+                <w:sz w:val="18"/>
               </w:rPr>
               <w:t>材料名称</w:t>
             </w:r>
@@ -5130,7 +3875,7 @@
                 <w:rFonts w:ascii="Arial" w:hAnsi="Arial" w:eastAsia="黑体"/>
                 <w:b/>
                 <w:color w:val="000000"/>
-                <w:sz w:val="21"/>
+                <w:sz w:val="18"/>
               </w:rPr>
               <w:t>是否提交</w:t>
             </w:r>
@@ -5149,7 +3894,7 @@
                 <w:rFonts w:ascii="Arial" w:hAnsi="Arial" w:eastAsia="黑体"/>
                 <w:b/>
                 <w:color w:val="000000"/>
-                <w:sz w:val="21"/>
+                <w:sz w:val="18"/>
               </w:rPr>
               <w:t>备注</w:t>
             </w:r>
@@ -5167,7 +3912,7 @@
                 <w:rFonts w:ascii="Times New Roman" w:hAnsi="Times New Roman" w:eastAsia="宋体"/>
                 <w:b w:val="0"/>
                 <w:color w:val="000000"/>
-                <w:sz w:val="21"/>
+                <w:sz w:val="18"/>
               </w:rPr>
               <w:t>课程设计报告</w:t>
             </w:r>
@@ -5183,7 +3928,7 @@
                 <w:rFonts w:ascii="Times New Roman" w:hAnsi="Times New Roman" w:eastAsia="宋体"/>
                 <w:b w:val="0"/>
                 <w:color w:val="000000"/>
-                <w:sz w:val="21"/>
+                <w:sz w:val="18"/>
               </w:rPr>
               <w:t>☑ 是　□ 否</w:t>
             </w:r>
@@ -5199,7 +3944,7 @@
                 <w:rFonts w:ascii="Times New Roman" w:hAnsi="Times New Roman" w:eastAsia="宋体"/>
                 <w:b w:val="0"/>
                 <w:color w:val="000000"/>
-                <w:sz w:val="21"/>
+                <w:sz w:val="18"/>
               </w:rPr>
               <w:t>docs/project_outputs/课程设计报告/</w:t>
             </w:r>
@@ -5217,7 +3962,7 @@
                 <w:rFonts w:ascii="Times New Roman" w:hAnsi="Times New Roman" w:eastAsia="宋体"/>
                 <w:b w:val="0"/>
                 <w:color w:val="000000"/>
-                <w:sz w:val="21"/>
+                <w:sz w:val="18"/>
               </w:rPr>
               <w:t>源代码 / 仿真文件</w:t>
             </w:r>
@@ -5233,7 +3978,7 @@
                 <w:rFonts w:ascii="Times New Roman" w:hAnsi="Times New Roman" w:eastAsia="宋体"/>
                 <w:b w:val="0"/>
                 <w:color w:val="000000"/>
-                <w:sz w:val="21"/>
+                <w:sz w:val="18"/>
               </w:rPr>
               <w:t>☑ 是　□ 否</w:t>
             </w:r>
@@ -5249,7 +3994,7 @@
                 <w:rFonts w:ascii="Times New Roman" w:hAnsi="Times New Roman" w:eastAsia="宋体"/>
                 <w:b w:val="0"/>
                 <w:color w:val="000000"/>
-                <w:sz w:val="21"/>
+                <w:sz w:val="18"/>
               </w:rPr>
               <w:t>src/、scripts/、hardware/</w:t>
             </w:r>
@@ -5267,7 +4012,7 @@
                 <w:rFonts w:ascii="Times New Roman" w:hAnsi="Times New Roman" w:eastAsia="宋体"/>
                 <w:b w:val="0"/>
                 <w:color w:val="000000"/>
-                <w:sz w:val="21"/>
+                <w:sz w:val="18"/>
               </w:rPr>
               <w:t>汇报 PPT</w:t>
             </w:r>
@@ -5283,7 +4028,7 @@
                 <w:rFonts w:ascii="Times New Roman" w:hAnsi="Times New Roman" w:eastAsia="宋体"/>
                 <w:b w:val="0"/>
                 <w:color w:val="000000"/>
-                <w:sz w:val="21"/>
+                <w:sz w:val="18"/>
               </w:rPr>
               <w:t>☑ 是　□ 否</w:t>
             </w:r>
@@ -5299,7 +4044,7 @@
                 <w:rFonts w:ascii="Times New Roman" w:hAnsi="Times New Roman" w:eastAsia="宋体"/>
                 <w:b w:val="0"/>
                 <w:color w:val="000000"/>
-                <w:sz w:val="21"/>
+                <w:sz w:val="18"/>
               </w:rPr>
               <w:t>期末答辩 Beamer 幻灯片</w:t>
             </w:r>
@@ -5317,7 +4062,7 @@
                 <w:rFonts w:ascii="Times New Roman" w:hAnsi="Times New Roman" w:eastAsia="宋体"/>
                 <w:b w:val="0"/>
                 <w:color w:val="000000"/>
-                <w:sz w:val="21"/>
+                <w:sz w:val="18"/>
               </w:rPr>
               <w:t>个人日志</w:t>
             </w:r>
@@ -5333,7 +4078,7 @@
                 <w:rFonts w:ascii="Times New Roman" w:hAnsi="Times New Roman" w:eastAsia="宋体"/>
                 <w:b w:val="0"/>
                 <w:color w:val="000000"/>
-                <w:sz w:val="21"/>
+                <w:sz w:val="18"/>
               </w:rPr>
               <w:t>☑ 是　□ 否</w:t>
             </w:r>
@@ -5349,7 +4094,7 @@
                 <w:rFonts w:ascii="Times New Roman" w:hAnsi="Times New Roman" w:eastAsia="宋体"/>
                 <w:b w:val="0"/>
                 <w:color w:val="000000"/>
-                <w:sz w:val="21"/>
+                <w:sz w:val="18"/>
               </w:rPr>
               <w:t>本文件</w:t>
             </w:r>
@@ -5367,7 +4112,7 @@
                 <w:rFonts w:ascii="Times New Roman" w:hAnsi="Times New Roman" w:eastAsia="宋体"/>
                 <w:b w:val="0"/>
                 <w:color w:val="000000"/>
-                <w:sz w:val="21"/>
+                <w:sz w:val="18"/>
               </w:rPr>
               <w:t>测试数据/抓包文件/截图</w:t>
             </w:r>
@@ -5383,7 +4128,7 @@
                 <w:rFonts w:ascii="Times New Roman" w:hAnsi="Times New Roman" w:eastAsia="宋体"/>
                 <w:b w:val="0"/>
                 <w:color w:val="000000"/>
-                <w:sz w:val="21"/>
+                <w:sz w:val="18"/>
               </w:rPr>
               <w:t>☑ 是　□ 否</w:t>
             </w:r>
@@ -5399,7 +4144,7 @@
                 <w:rFonts w:ascii="Times New Roman" w:hAnsi="Times New Roman" w:eastAsia="宋体"/>
                 <w:b w:val="0"/>
                 <w:color w:val="000000"/>
-                <w:sz w:val="21"/>
+                <w:sz w:val="18"/>
               </w:rPr>
               <w:t>captures/、docs/project_outputs/测试证据/</w:t>
             </w:r>

</xml_diff>

<commit_message>
docs: expand 胡艺瀚 log content (per-day detail, tables, summary)
</commit_message>
<xml_diff>
--- a/docs/team/daily/胡艺瀚_课程设计日志.docx
+++ b/docs/team/daily/胡艺瀚_课程设计日志.docx
@@ -815,7 +815,15 @@
         <w:spacing w:line="324" w:lineRule="auto"/>
       </w:pPr>
       <w:r>
-        <w:t>今天主要完成课程设计项目的启动与整体规划。上午认真听取老师对课程设计的讲解，了解整体安排、工作日进度、阶段检查、报告结构、答辩方式和测试证据要求；老师强调要体现工程思维，从需求分析、方案设计、协议选择、测试验证到过程记录完整说明设计依据。课后对本组选题进行分析，组织并参与第一次小组会议，讨论应用场景、技术路线、分工与性能目标。</w:t>
+        <w:t>今天是课程设计的第一个工作日，主要完成项目的启动与整体规划。上午认真听取了老师对本次课程设计的讲解，了解了整体安排、工作日进度要求、阶段检查的时间节点、报告结构、答辩与演示方式以及测试证据要求。老师特别强调课程设计要体现工程思维——不能停留在“能跑通”，而要从需求分析、方案设计、协议选择、测试验证到过程记录完整说明每一步的设计依据。这让我意识到本项目不仅要实现功能，更要讲清楚“为什么这样做”。</w:t>
+      </w:r>
+    </w:p>
+    <w:p>
+      <w:pPr>
+        <w:spacing w:line="324" w:lineRule="auto"/>
+      </w:pPr>
+      <w:r>
+        <w:t>课后我对本组选题《基于 MQTT 的多节点环境监测系统设计》进行了分析，并组织、主持了第一次小组会议。会上讨论了系统的应用场景（智慧校园环境监测）、整体技术路线（先用 PC 模拟节点打通通信链路、再接入 ESP32 真实硬件节点）、小组分工与性能目标，并确定了“一个模块一个模块推进、全程基于 GitHub 留痕”的工作方式。作为软件侧与流程负责人，我牵头搭建了项目骨架，并起草了需求分析与协议设计文档。</w:t>
       </w:r>
     </w:p>
     <w:p>
@@ -831,47 +839,47 @@
         <w:spacing w:line="324" w:lineRule="auto"/>
       </w:pPr>
       <w:r>
-        <w:t>① 梳理课程设计的阶段要求、提交材料和答辩重点。</w:t>
-      </w:r>
-    </w:p>
-    <w:p>
-      <w:pPr>
-        <w:spacing w:line="324" w:lineRule="auto"/>
-      </w:pPr>
-      <w:r>
-        <w:t>② 主导构建项目整体推进流程，确定“一个模块一个模块推进”的方式。</w:t>
-      </w:r>
-    </w:p>
-    <w:p>
-      <w:pPr>
-        <w:spacing w:line="324" w:lineRule="auto"/>
-      </w:pPr>
-      <w:r>
-        <w:t>③ 规划 GitHub 协作流程，通过 Issue、commit、README 进度和文档进行过程留痕。</w:t>
-      </w:r>
-    </w:p>
-    <w:p>
-      <w:pPr>
-        <w:spacing w:line="324" w:lineRule="auto"/>
-      </w:pPr>
-      <w:r>
-        <w:t>④ 组织第一次小组会议，明确分工：本人和曾家豪负责软件侧，孙博宇和韦煜城负责硬件侧。</w:t>
-      </w:r>
-    </w:p>
-    <w:p>
-      <w:pPr>
-        <w:spacing w:line="324" w:lineRule="auto"/>
-      </w:pPr>
-      <w:r>
-        <w:t>⑤ 完成项目基础目录结构搭建、课程资料归档与 README 初版。</w:t>
-      </w:r>
-    </w:p>
-    <w:p>
-      <w:pPr>
-        <w:spacing w:line="324" w:lineRule="auto"/>
-      </w:pPr>
-      <w:r>
-        <w:t>⑥ 完成《需求分析与设计指标》初稿，以及《MQTT 主题与消息格式设计》文档（Topic 命名、JSON 字段与中文显示映射）。</w:t>
+        <w:t>① 系统梳理课程设计的阶段要求、提交材料清单与答辩重点，形成本组的工作节奏安排，明确每个工作日的目标产出。</w:t>
+      </w:r>
+    </w:p>
+    <w:p>
+      <w:pPr>
+        <w:spacing w:line="324" w:lineRule="auto"/>
+      </w:pPr>
+      <w:r>
+        <w:t>② 主导确定项目整体推进流程，采用“一次只做一个模块”的方式，每次围绕当前模块完成设计、实现、验证与提交，避免一次性铺开导致进度失控。</w:t>
+      </w:r>
+    </w:p>
+    <w:p>
+      <w:pPr>
+        <w:spacing w:line="324" w:lineRule="auto"/>
+      </w:pPr>
+      <w:r>
+        <w:t>③ 规划 GitHub 协作流程，约定“先建 Issue、再开分支提 PR、审查后合并”，并用 README 进度表、commit 信息与文档持续留痕，保证整个设计过程可追溯。</w:t>
+      </w:r>
+    </w:p>
+    <w:p>
+      <w:pPr>
+        <w:spacing w:line="324" w:lineRule="auto"/>
+      </w:pPr>
+      <w:r>
+        <w:t>④ 组织并主持第一次小组会议，明确分工：本人与曾家豪负责软件侧（协议、建模、监控端、计算器、压测），孙博宇与韦煜城负责硬件侧（ESP32 传感器、固件、配网）。</w:t>
+      </w:r>
+    </w:p>
+    <w:p>
+      <w:pPr>
+        <w:spacing w:line="324" w:lineRule="auto"/>
+      </w:pPr>
+      <w:r>
+        <w:t>⑤ 完成项目基础目录结构搭建与课程资料归档，并编写 README 初版，记录项目简介、成员信息、目录结构与当前进度。</w:t>
+      </w:r>
+    </w:p>
+    <w:p>
+      <w:pPr>
+        <w:spacing w:line="324" w:lineRule="auto"/>
+      </w:pPr>
+      <w:r>
+        <w:t>⑥ 完成《需求分析与设计指标》初稿（明确应用场景、功能需求、性能指标与验证方式），以及《MQTT 主题与消息格式设计》文档（确定 Topic 命名规则、JSON 字段与中文显示映射）。</w:t>
       </w:r>
     </w:p>
     <w:p>
@@ -887,15 +895,23 @@
         <w:spacing w:line="324" w:lineRule="auto"/>
       </w:pPr>
       <w:r>
-        <w:t>① 项目初期任务较多，一次性规划过大容易导致后续执行压力过大。</w:t>
-      </w:r>
-    </w:p>
-    <w:p>
-      <w:pPr>
-        <w:spacing w:line="324" w:lineRule="auto"/>
-      </w:pPr>
-      <w:r>
-        <w:t>② 设计 MQTT Topic 和 JSON 字段时，需要判断是否可使用中文命名。</w:t>
+        <w:t>① 项目初期任务繁多，若一次性把所有模块都展开规划，后续执行容易顾此失彼、压力过大。</w:t>
+      </w:r>
+    </w:p>
+    <w:p>
+      <w:pPr>
+        <w:spacing w:line="324" w:lineRule="auto"/>
+      </w:pPr>
+      <w:r>
+        <w:t>② 在设计 MQTT Topic 与 JSON 字段时，纠结于是否可以使用中文命名，担心编码兼容与后续抓包分析时出现乱码。</w:t>
+      </w:r>
+    </w:p>
+    <w:p>
+      <w:pPr>
+        <w:spacing w:line="324" w:lineRule="auto"/>
+      </w:pPr>
+      <w:r>
+        <w:t>③ 小组四人软硬件背景不同，硬件节点与软件链路如何在接口上保持一致，需要在一开始就约定清楚，否则后期联调会反复返工。</w:t>
       </w:r>
     </w:p>
     <w:p>
@@ -911,15 +927,23 @@
         <w:spacing w:line="324" w:lineRule="auto"/>
       </w:pPr>
       <w:r>
-        <w:t>① 采用“一个模块一个模块推进”的流程，每次只围绕当前模块完成设计、实现和提交。</w:t>
-      </w:r>
-    </w:p>
-    <w:p>
-      <w:pPr>
-        <w:spacing w:line="324" w:lineRule="auto"/>
-      </w:pPr>
-      <w:r>
-        <w:t>② 确定文档和页面展示用中文，但 Topic、JSON 字段和代码变量统一用英文，减少编码兼容与抓包分析问题。</w:t>
+        <w:t>① 采用“一个模块一个模块推进”的流程，把大任务拆成可交付的小步骤，每步都有明确产出与验证，降低执行风险。</w:t>
+      </w:r>
+    </w:p>
+    <w:p>
+      <w:pPr>
+        <w:spacing w:line="324" w:lineRule="auto"/>
+      </w:pPr>
+      <w:r>
+        <w:t>② 确定“展示用中文、底层用英文”的原则：文档与页面显示用中文，而 Topic、JSON 字段名和代码变量统一使用英文，从源头避免编码兼容与抓包乱码问题。</w:t>
+      </w:r>
+    </w:p>
+    <w:p>
+      <w:pPr>
+        <w:spacing w:line="324" w:lineRule="auto"/>
+      </w:pPr>
+      <w:r>
+        <w:t>③ 在需求与协议文档中统一约定主题结构 env_monitor/{node_id}/{data_type} 与消息字段，作为软硬件双方共同遵循的接口规范。</w:t>
       </w:r>
     </w:p>
     <w:p>
@@ -935,15 +959,23 @@
         <w:spacing w:line="324" w:lineRule="auto"/>
       </w:pPr>
       <w:r>
-        <w:t>① 完成项目仓库初始结构、README 初版，以及需求分析与 MQTT 协议设计文档。</w:t>
-      </w:r>
-    </w:p>
-    <w:p>
-      <w:pPr>
-        <w:spacing w:line="324" w:lineRule="auto"/>
-      </w:pPr>
-      <w:r>
-        <w:t>② 主导确定项目整体流程与小组分工，并整理第一次会议记录。</w:t>
+        <w:t>① 完成项目仓库初始结构与 README 初版，以及《需求分析与设计指标》《MQTT 主题与消息格式设计》两份设计文档。</w:t>
+      </w:r>
+    </w:p>
+    <w:p>
+      <w:pPr>
+        <w:spacing w:line="324" w:lineRule="auto"/>
+      </w:pPr>
+      <w:r>
+        <w:t>② 主导确定了项目整体推进流程与小组分工，并整理形成第一次会议记录。</w:t>
+      </w:r>
+    </w:p>
+    <w:p>
+      <w:pPr>
+        <w:spacing w:line="324" w:lineRule="auto"/>
+      </w:pPr>
+      <w:r>
+        <w:t>③ 明确了“先软件打通链路、再接入硬件”的技术路线，为后续开发奠定了基础。</w:t>
       </w:r>
     </w:p>
     <w:p>
@@ -959,15 +991,15 @@
         <w:spacing w:line="324" w:lineRule="auto"/>
       </w:pPr>
       <w:r>
-        <w:t>① 推进 GitHub 协作流程规范。</w:t>
-      </w:r>
-    </w:p>
-    <w:p>
-      <w:pPr>
-        <w:spacing w:line="324" w:lineRule="auto"/>
-      </w:pPr>
-      <w:r>
-        <w:t>② 进行本地 MQTT Broker 方案调研，为 PC 模拟节点和监控端开发做准备。</w:t>
+        <w:t>① 进一步规范 GitHub 协作流程，审查队友提交的 Issue 与 PR。</w:t>
+      </w:r>
+    </w:p>
+    <w:p>
+      <w:pPr>
+        <w:spacing w:line="324" w:lineRule="auto"/>
+      </w:pPr>
+      <w:r>
+        <w:t>② 调研本地 MQTT Broker 方案并编写发布订阅测试脚本，为 PC 模拟节点与 Web 监控端开发做准备。</w:t>
       </w:r>
     </w:p>
     <w:p>
@@ -1004,7 +1036,15 @@
         <w:spacing w:line="324" w:lineRule="auto"/>
       </w:pPr>
       <w:r>
-        <w:t>今天主要围绕 GitHub 协作流程规范和软件侧开发准备开展工作。对小组成员提交的 Issue 和 PR 进行审查，进一步规范“先 Issue、再 PR、审查后合并”的流程；并编写本地 MQTT Broker 与发布订阅测试脚本，为 PC 模拟节点和 Web 监控端开发打基础。</w:t>
+        <w:t>今天主要围绕 GitHub 协作流程规范和软件侧开发准备开展工作。一方面，对小组成员提交的 Issue 与 PR 进行审查，进一步把“先 Issue、再 PR、审查后合并”的协作流程落到实处；另一方面，搭建本地 MQTT Broker 并编写发布订阅测试脚本，先在最小环境下验证 MQTT 通信是否通畅，为后续 PC 模拟节点和 Web 监控端的开发打好基础。</w:t>
+      </w:r>
+    </w:p>
+    <w:p>
+      <w:pPr>
+        <w:spacing w:line="324" w:lineRule="auto"/>
+      </w:pPr>
+      <w:r>
+        <w:t>作为流程负责人，我把关每一次合并：队友的提交先经我审查、在评论区给出可直接照做的修改建议，再由对应负责人改完合并，这样既保证仓库规范统一，又保留了各自的工作过程与署名。</w:t>
       </w:r>
     </w:p>
     <w:p>
@@ -1020,39 +1060,47 @@
         <w:spacing w:line="324" w:lineRule="auto"/>
       </w:pPr>
       <w:r>
-        <w:t>① 审查队友提交的 ESP32 硬件节点设计、工程化分析等 Issue 和 PR，整理可复制到评论区的修改建议（文件名补 .md、PR 关联 Issue、文档范围压缩、协议一致性检查等）。</w:t>
-      </w:r>
-    </w:p>
-    <w:p>
-      <w:pPr>
-        <w:spacing w:line="324" w:lineRule="auto"/>
-      </w:pPr>
-      <w:r>
-        <w:t>② 处理 GitHub 分支同步与推送问题，熟悉 fetch、pull --ff-only、merge、push 等操作。</w:t>
-      </w:r>
-    </w:p>
-    <w:p>
-      <w:pPr>
-        <w:spacing w:line="324" w:lineRule="auto"/>
-      </w:pPr>
-      <w:r>
-        <w:t>③ 新增 requirements.txt，记录 paho-mqtt 与 amqtt 依赖。</w:t>
-      </w:r>
-    </w:p>
-    <w:p>
-      <w:pPr>
-        <w:spacing w:line="324" w:lineRule="auto"/>
-      </w:pPr>
-      <w:r>
-        <w:t>④ 编写 scripts/mqtt_broker.py 启动本地轻量 Broker，以及发布/订阅测试脚本。</w:t>
-      </w:r>
-    </w:p>
-    <w:p>
-      <w:pPr>
-        <w:spacing w:line="324" w:lineRule="auto"/>
-      </w:pPr>
-      <w:r>
-        <w:t>⑤ 用 Python 脚本完成 2 个节点、4 类环境数据共 8 条消息的发布订阅验证。</w:t>
+        <w:t>① 审查队友提交的 ESP32 硬件节点设计、工程化分析等 Issue 与 PR，针对其中的问题整理可复制到评论区的修改建议，包括文件名补 .md 后缀、PR 关联对应 Issue、文档范围适当压缩、协议字段与全局规范保持一致等。</w:t>
+      </w:r>
+    </w:p>
+    <w:p>
+      <w:pPr>
+        <w:spacing w:line="324" w:lineRule="auto"/>
+      </w:pPr>
+      <w:r>
+        <w:t>② 处理 GitHub 分支同步与推送问题，进一步熟悉 fetch、pull --ff-only、merge、push 等操作的差异与适用场景。</w:t>
+      </w:r>
+    </w:p>
+    <w:p>
+      <w:pPr>
+        <w:spacing w:line="324" w:lineRule="auto"/>
+      </w:pPr>
+      <w:r>
+        <w:t>③ 新增 requirements.txt，记录 paho-mqtt 与 amqtt 等依赖，方便组员一键安装统一环境。</w:t>
+      </w:r>
+    </w:p>
+    <w:p>
+      <w:pPr>
+        <w:spacing w:line="324" w:lineRule="auto"/>
+      </w:pPr>
+      <w:r>
+        <w:t>④ 编写 scripts/mqtt_broker.py，用 amqtt 启动一个本地轻量 MQTT Broker，供本地开发与最小验证使用。</w:t>
+      </w:r>
+    </w:p>
+    <w:p>
+      <w:pPr>
+        <w:spacing w:line="324" w:lineRule="auto"/>
+      </w:pPr>
+      <w:r>
+        <w:t>⑤ 编写 scripts/mqtt_pub_test.py 与 scripts/mqtt_sub_test.py 两个发布、订阅测试脚本，用于快速验证主题匹配与消息收发。</w:t>
+      </w:r>
+    </w:p>
+    <w:p>
+      <w:pPr>
+        <w:spacing w:line="324" w:lineRule="auto"/>
+      </w:pPr>
+      <w:r>
+        <w:t>⑥ 用 Python 脚本完成 2 个节点、4 类环境数据共 8 条消息的发布订阅验证，确认 Broker 转发与通配符订阅工作正常。</w:t>
       </w:r>
     </w:p>
     <w:p>
@@ -1068,15 +1116,15 @@
         <w:spacing w:line="324" w:lineRule="auto"/>
       </w:pPr>
       <w:r>
-        <w:t>① 本地 main 与远程 main 存在差异，直接 push 被拒绝。</w:t>
-      </w:r>
-    </w:p>
-    <w:p>
-      <w:pPr>
-        <w:spacing w:line="324" w:lineRule="auto"/>
-      </w:pPr>
-      <w:r>
-        <w:t>② 队友的 Issue 和 PR 存在任务范围偏大、文件名缺后缀、PR 与 Issue 未关联等问题。</w:t>
+        <w:t>① 本地 main 与远程 main 存在差异，直接 push 被拒绝，一开始没理解原因。</w:t>
+      </w:r>
+    </w:p>
+    <w:p>
+      <w:pPr>
+        <w:spacing w:line="324" w:lineRule="auto"/>
+      </w:pPr>
+      <w:r>
+        <w:t>② 队友的 Issue 与 PR 存在任务范围偏大、文件名缺少后缀、PR 与 Issue 未关联等不规范问题，若直接合并会让仓库变乱。</w:t>
       </w:r>
     </w:p>
     <w:p>
@@ -1092,15 +1140,15 @@
         <w:spacing w:line="324" w:lineRule="auto"/>
       </w:pPr>
       <w:r>
-        <w:t>① 先 fetch 再用 pull --ff-only 将本地快进到远程最新，理解了远程更新时不能直接推送的原因。</w:t>
-      </w:r>
-    </w:p>
-    <w:p>
-      <w:pPr>
-        <w:spacing w:line="324" w:lineRule="auto"/>
-      </w:pPr>
-      <w:r>
-        <w:t>② 采用先审查、再评论建议、最后由对应负责人修改的方式处理队友 PR，既规范又保留各自工作过程。</w:t>
+        <w:t>① 先 fetch 获取远程更新，再用 pull --ff-only 把本地分支快进到远程最新状态，由此真正理解了“远程比本地新时不能直接推送、需先合并或快进”的原因。</w:t>
+      </w:r>
+    </w:p>
+    <w:p>
+      <w:pPr>
+        <w:spacing w:line="324" w:lineRule="auto"/>
+      </w:pPr>
+      <w:r>
+        <w:t>② 采用“先审查、再在评论区给修改建议、最后由对应负责人修改后合并”的方式处理队友 PR，既维护规范，又不抢占队友的工作过程。</w:t>
       </w:r>
     </w:p>
     <w:p>
@@ -1116,15 +1164,15 @@
         <w:spacing w:line="324" w:lineRule="auto"/>
       </w:pPr>
       <w:r>
-        <w:t>① 完成 Issue 与 PR 审查，明确队友 PR 合并前需修改的问题。</w:t>
-      </w:r>
-    </w:p>
-    <w:p>
-      <w:pPr>
-        <w:spacing w:line="324" w:lineRule="auto"/>
-      </w:pPr>
-      <w:r>
-        <w:t>② 完成本地 Broker 与发布订阅测试脚本，成功收发 8 条测试消息。</w:t>
+        <w:t>① 完成 Issue 与 PR 审查，明确队友 PR 合并前需要修改的具体问题并给出建议。</w:t>
+      </w:r>
+    </w:p>
+    <w:p>
+      <w:pPr>
+        <w:spacing w:line="324" w:lineRule="auto"/>
+      </w:pPr>
+      <w:r>
+        <w:t>② 完成本地 MQTT Broker 脚本与发布、订阅测试脚本，成功收发 8 条测试消息，验证最小通信链路可用。</w:t>
       </w:r>
     </w:p>
     <w:p>
@@ -1140,15 +1188,15 @@
         <w:spacing w:line="324" w:lineRule="auto"/>
       </w:pPr>
       <w:r>
-        <w:t>① 实现 PC 模拟环境监测节点。</w:t>
-      </w:r>
-    </w:p>
-    <w:p>
-      <w:pPr>
-        <w:spacing w:line="324" w:lineRule="auto"/>
-      </w:pPr>
-      <w:r>
-        <w:t>② 实现 Web 监控端订阅显示功能。</w:t>
+        <w:t>① 实现 PC 模拟环境监测节点，支持多类数据与多种参数配置。</w:t>
+      </w:r>
+    </w:p>
+    <w:p>
+      <w:pPr>
+        <w:spacing w:line="324" w:lineRule="auto"/>
+      </w:pPr>
+      <w:r>
+        <w:t>② 实现 Web 监控端的订阅与实时显示功能。</w:t>
       </w:r>
     </w:p>
     <w:p>
@@ -1185,7 +1233,15 @@
         <w:spacing w:line="324" w:lineRule="auto"/>
       </w:pPr>
       <w:r>
-        <w:t>今天是中期检查前的最后一个工作日，主要完成软件侧两个核心模块——PC 模拟节点和 Web 监控端，并审查合并队友的 ESP32 设计文档。目标是让“模拟节点 → Broker → 监控端显示”的完整软件链路真正跑起来，为中期检查提供可演示、可验证的成果。</w:t>
+        <w:t>今天是中期检查前的最后一个工作日，目标是让“模拟节点 → MQTT Broker → 监控端显示”的完整软件链路真正跑起来，为中期检查提供可演示、可验证的成果。我集中实现了软件侧两个核心模块——PC 模拟环境监测节点和 Web 监控端，并审查、合并了队友提交的 ESP32 硬件设计文档。</w:t>
+      </w:r>
+    </w:p>
+    <w:p>
+      <w:pPr>
+        <w:spacing w:line="324" w:lineRule="auto"/>
+      </w:pPr>
+      <w:r>
+        <w:t>在实现中我特别关注两点：一是模拟数据要平滑、贴近真实环境，不能是无规律的乱跳；二是监控端要能在不刷新页面的情况下实时更新。这两点直接决定了演示效果与后续真机接入的体验。</w:t>
       </w:r>
     </w:p>
     <w:p>
@@ -1201,47 +1257,47 @@
         <w:spacing w:line="324" w:lineRule="auto"/>
       </w:pPr>
       <w:r>
-        <w:t>① 实现 PC 模拟节点 sim_node.py，支持节点编号、数据类型、上传周期和 QoS 等命令行配置。</w:t>
-      </w:r>
-    </w:p>
-    <w:p>
-      <w:pPr>
-        <w:spacing w:line="324" w:lineRule="auto"/>
-      </w:pPr>
-      <w:r>
-        <w:t>② 采用均值回归随机游走生成温湿度、光照、噪声等数据，使其平滑变化、贴近真实环境。</w:t>
-      </w:r>
-    </w:p>
-    <w:p>
-      <w:pPr>
-        <w:spacing w:line="324" w:lineRule="auto"/>
-      </w:pPr>
-      <w:r>
-        <w:t>③ 实现断线自动重连与 QoS 1 离线排队补发，经双节点并发与 Broker 重启验证重连能力。</w:t>
-      </w:r>
-    </w:p>
-    <w:p>
-      <w:pPr>
-        <w:spacing w:line="324" w:lineRule="auto"/>
-      </w:pPr>
-      <w:r>
-        <w:t>④ 实现 Web 监控端 web_monitor.py，基于 Flask + SSE 网页实时刷新，无需手动刷新。</w:t>
-      </w:r>
-    </w:p>
-    <w:p>
-      <w:pPr>
-        <w:spacing w:line="324" w:lineRule="auto"/>
-      </w:pPr>
-      <w:r>
-        <w:t>⑤ 实现节点编号、数据类型中文映射、数值、单位、上传/接收时间显示，记录毫秒级接收日志，15 秒无数据自动标记离线。</w:t>
-      </w:r>
-    </w:p>
-    <w:p>
-      <w:pPr>
-        <w:spacing w:line="324" w:lineRule="auto"/>
-      </w:pPr>
-      <w:r>
-        <w:t>⑥ 编写两模块的运行验证文档；审查并合并队友孙博宇的两个 ESP32 设计 PR，合并前指出文件名与数据类型口径问题。</w:t>
+        <w:t>① 实现 PC 模拟节点模块 sim_node.py，支持节点编号、数据类型、上传周期、QoS 与消息格式等命令行参数配置，便于灵活模拟不同场景。</w:t>
+      </w:r>
+    </w:p>
+    <w:p>
+      <w:pPr>
+        <w:spacing w:line="324" w:lineRule="auto"/>
+      </w:pPr>
+      <w:r>
+        <w:t>② 采用均值回归随机游走算法生成温度、湿度、光照、噪声等模拟数据：每一步数据向基准值回归并叠加高斯噪声，使其在合理范围内平滑漂移、贴近真实环境。</w:t>
+      </w:r>
+    </w:p>
+    <w:p>
+      <w:pPr>
+        <w:spacing w:line="324" w:lineRule="auto"/>
+      </w:pPr>
+      <w:r>
+        <w:t>③ 实现断线自动重连与 QoS 1 离线消息排队补发，并通过双节点并发上传、Broker 重启等场景验证了重连与补发能力。</w:t>
+      </w:r>
+    </w:p>
+    <w:p>
+      <w:pPr>
+        <w:spacing w:line="324" w:lineRule="auto"/>
+      </w:pPr>
+      <w:r>
+        <w:t>④ 实现 Web 监控端模块 web_monitor.py，基于 Flask 提供页面、用 paho-mqtt 订阅 env_monitor/+/+，通过 SSE 把更新实时推送到浏览器，页面无需手动刷新即可更新。</w:t>
+      </w:r>
+    </w:p>
+    <w:p>
+      <w:pPr>
+        <w:spacing w:line="324" w:lineRule="auto"/>
+      </w:pPr>
+      <w:r>
+        <w:t>⑤ 实现节点编号、数据类型中文映射、数值、单位、上传与接收时间的实时显示，记录毫秒级接收日志，并对超过 15 秒无数据的条目自动标记为离线/过期。</w:t>
+      </w:r>
+    </w:p>
+    <w:p>
+      <w:pPr>
+        <w:spacing w:line="324" w:lineRule="auto"/>
+      </w:pPr>
+      <w:r>
+        <w:t>⑥ 编写 PC 模拟节点与 Web 监控端的运行验证文档；审查并合并队友孙博宇提交的两个 ESP32 设计 PR，合并前指出文件名与数据类型口径问题。</w:t>
       </w:r>
     </w:p>
     <w:p>
@@ -1257,15 +1313,15 @@
         <w:spacing w:line="324" w:lineRule="auto"/>
       </w:pPr>
       <w:r>
-        <w:t>① 纯随机数生成的模拟数据会无规律剧烈跳变，不像真实环境数据。</w:t>
-      </w:r>
-    </w:p>
-    <w:p>
-      <w:pPr>
-        <w:spacing w:line="324" w:lineRule="auto"/>
-      </w:pPr>
-      <w:r>
-        <w:t>② 监控端需要在不刷新页面的情况下实时更新数据。</w:t>
+        <w:t>① 最初用纯随机数生成模拟数据，曲线无规律剧烈跳变，完全不像真实环境数据，演示效果差。</w:t>
+      </w:r>
+    </w:p>
+    <w:p>
+      <w:pPr>
+        <w:spacing w:line="324" w:lineRule="auto"/>
+      </w:pPr>
+      <w:r>
+        <w:t>② Web 监控端需要在不刷新页面的前提下实时更新各节点数据，普通的定时刷新既不实时又浪费请求。</w:t>
       </w:r>
     </w:p>
     <w:p>
@@ -1281,15 +1337,15 @@
         <w:spacing w:line="324" w:lineRule="auto"/>
       </w:pPr>
       <w:r>
-        <w:t>① 采用均值回归随机游走，每步向基准值回归并叠加高斯噪声，使数据在合理范围内平滑漂移。</w:t>
-      </w:r>
-    </w:p>
-    <w:p>
-      <w:pPr>
-        <w:spacing w:line="324" w:lineRule="auto"/>
-      </w:pPr>
-      <w:r>
-        <w:t>② 采用 SSE，由后端在收到新消息时主动推送到浏览器。</w:t>
+        <w:t>① 改用均值回归随机游走模型，引入基准值与回归系数，使每一步数据围绕基准平滑变化，曲线自然、接近真实采集。</w:t>
+      </w:r>
+    </w:p>
+    <w:p>
+      <w:pPr>
+        <w:spacing w:line="324" w:lineRule="auto"/>
+      </w:pPr>
+      <w:r>
+        <w:t>② 采用 SSE（Server-Sent Events）服务器推送技术，由后端在收到新消息时主动把数据推给浏览器，实现真正的实时更新且开销很小。</w:t>
       </w:r>
     </w:p>
     <w:p>
@@ -1305,15 +1361,23 @@
         <w:spacing w:line="324" w:lineRule="auto"/>
       </w:pPr>
       <w:r>
-        <w:t>① 完成 PC 模拟节点（Issue #16）与 Web 监控端（Issue #18）及验证文档。</w:t>
-      </w:r>
-    </w:p>
-    <w:p>
-      <w:pPr>
-        <w:spacing w:line="324" w:lineRule="auto"/>
-      </w:pPr>
-      <w:r>
-        <w:t>② 打通“模拟节点 → Broker → 监控端网页显示”完整软件链路，并完成队友两个 ESP32 PR 的审查合并。</w:t>
+        <w:t>① 完成 PC 模拟节点模块及验证文档（Issue #16）、Web 监控端模块及验证文档（Issue #18）。</w:t>
+      </w:r>
+    </w:p>
+    <w:p>
+      <w:pPr>
+        <w:spacing w:line="324" w:lineRule="auto"/>
+      </w:pPr>
+      <w:r>
+        <w:t>② 打通了“模拟节点 → Broker → 监控端网页显示”的完整软件链路，可用于中期检查演示。</w:t>
+      </w:r>
+    </w:p>
+    <w:p>
+      <w:pPr>
+        <w:spacing w:line="324" w:lineRule="auto"/>
+      </w:pPr>
+      <w:r>
+        <w:t>③ 完成队友两个 ESP32 设计 PR 的审查与合并，保证硬件文档与软件口径一致。</w:t>
       </w:r>
     </w:p>
     <w:p>
@@ -1329,15 +1393,15 @@
         <w:spacing w:line="324" w:lineRule="auto"/>
       </w:pPr>
       <w:r>
-        <w:t>① 参加课程设计中期检查。</w:t>
-      </w:r>
-    </w:p>
-    <w:p>
-      <w:pPr>
-        <w:spacing w:line="324" w:lineRule="auto"/>
-      </w:pPr>
-      <w:r>
-        <w:t>② 根据老师检查意见调整后续方案。</w:t>
+        <w:t>① 参加课程设计中期检查，汇报当前进展与软件链路成果。</w:t>
+      </w:r>
+    </w:p>
+    <w:p>
+      <w:pPr>
+        <w:spacing w:line="324" w:lineRule="auto"/>
+      </w:pPr>
+      <w:r>
+        <w:t>② 根据老师的检查意见调整后续方案与重点。</w:t>
       </w:r>
     </w:p>
     <w:p>
@@ -1374,7 +1438,15 @@
         <w:spacing w:line="324" w:lineRule="auto"/>
       </w:pPr>
       <w:r>
-        <w:t>今天上午参加中期检查。老师指出当前方案功能完整，但还需体现“方案要由需求驱动”和“要充分考虑成本”。下午围绕反馈重新梳理工作，确定“需求建模 → 实验验证 → 需求计算器”的新主线，并开始密集推进网络负载建模、Broker 升级与性能实验。</w:t>
+        <w:t>今天上午参加了课程设计中期检查。老师指出当前方案虽然功能完整，但还需进一步体现“方案要由需求驱动”和“要充分考虑成本”两点要求，不能一味追求最强。这让我重新审视项目：与其堆功能，不如回答一个更有工程意义的问题——在满足采集需求与服务质量的前提下，网络层服务器所需的最小资源、也就是最低成本是多少。</w:t>
+      </w:r>
+    </w:p>
+    <w:p>
+      <w:pPr>
+        <w:spacing w:line="324" w:lineRule="auto"/>
+      </w:pPr>
+      <w:r>
+        <w:t>下午围绕老师的反馈重新梳理了后续工作，确定了“需求建模 → 实验验证 → 需求计算器”的新主线，并开始密集推进网络负载建模、Broker 方案升级与性能实验。由于本地 Windows 笔记本不适合做几万连接的压测，我还租用了一台阿里云服务器作为实验台架。</w:t>
       </w:r>
     </w:p>
     <w:p>
@@ -1390,55 +1462,55 @@
         <w:spacing w:line="324" w:lineRule="auto"/>
       </w:pPr>
       <w:r>
-        <w:t>① 完成中期检查汇报。</w:t>
-      </w:r>
-    </w:p>
-    <w:p>
-      <w:pPr>
-        <w:spacing w:line="324" w:lineRule="auto"/>
-      </w:pPr>
-      <w:r>
-        <w:t>② 建立“需求参数 → 网络负载 → 服务器配置 → 成本”的通用计算方法，完成《网络负载与服务器配置计算方法建模》（Issue #24）。</w:t>
-      </w:r>
-    </w:p>
-    <w:p>
-      <w:pPr>
-        <w:spacing w:line="324" w:lineRule="auto"/>
-      </w:pPr>
-      <w:r>
-        <w:t>③ 完成 MQTT 方案升级（Issue #25）：Broker 由实验性 amqtt 升级为生产级 EMQX 5.8.9，客户端升级 MQTT 5.0（Topic Alias、会话过期），新增 json / json-min / msgpack 三种 payload 格式。</w:t>
-      </w:r>
-    </w:p>
-    <w:p>
-      <w:pPr>
-        <w:spacing w:line="324" w:lineRule="auto"/>
-      </w:pPr>
-      <w:r>
-        <w:t>④ 因本地 Windows 不便做大规模压测，租用一台阿里云服务器作为实验台架，部署 EMQX 与 emqtt_bench。</w:t>
-      </w:r>
-    </w:p>
-    <w:p>
-      <w:pPr>
-        <w:spacing w:line="324" w:lineRule="auto"/>
-      </w:pPr>
-      <w:r>
-        <w:t>⑤ 完成性能实验（Issue #27）：协议开销抓包矩阵、EMQX 容量与吞吐压测（5 万连接 / 5 万条每秒）、amqtt 对照、跨公网延迟实测，并把实测系数回填建模文档。</w:t>
-      </w:r>
-    </w:p>
-    <w:p>
-      <w:pPr>
-        <w:spacing w:line="324" w:lineRule="auto"/>
-      </w:pPr>
-      <w:r>
-        <w:t>⑥ 完成需求计算器（Issue #33）：监控端新增 /calculator 页面，输入需求即输出负载、配置与成本。</w:t>
-      </w:r>
-    </w:p>
-    <w:p>
-      <w:pPr>
-        <w:spacing w:line="324" w:lineRule="auto"/>
-      </w:pPr>
-      <w:r>
-        <w:t>⑦ 补充场景实景压测与稳定性验证：2 万连接 30 分钟零掉线、转发送达 99.96%、断线重连 5.2 秒。</w:t>
+        <w:t>① 完成中期检查汇报，并根据老师反馈确定后续主线，建立“需求参数 → 网络负载 → 服务器配置 → 成本”的通用计算方法。</w:t>
+      </w:r>
+    </w:p>
+    <w:p>
+      <w:pPr>
+        <w:spacing w:line="324" w:lineRule="auto"/>
+      </w:pPr>
+      <w:r>
+        <w:t>② 完成《网络负载与服务器配置计算方法建模》文档（Issue #24），建立计算公式、六场景参数表与待实验校准的系数清单，把“选多大服务器”变成可由需求推导的过程。</w:t>
+      </w:r>
+    </w:p>
+    <w:p>
+      <w:pPr>
+        <w:spacing w:line="324" w:lineRule="auto"/>
+      </w:pPr>
+      <w:r>
+        <w:t>③ 完成 MQTT 方案升级（Issue #25）：Broker 由实验性的 amqtt 升级为生产级 EMQX 5.8.9，客户端升级到 MQTT 5.0（启用 Topic Alias、会话过期），并新增 json、json-min、msgpack 三种 payload 格式以研究带宽与成本。</w:t>
+      </w:r>
+    </w:p>
+    <w:p>
+      <w:pPr>
+        <w:spacing w:line="324" w:lineRule="auto"/>
+      </w:pPr>
+      <w:r>
+        <w:t>④ 租用一台阿里云服务器（8 核 32 GB）作为实验台架，部署 EMQX 与压测工具 emqtt_bench，并完成文件句柄上限等系统调优。</w:t>
+      </w:r>
+    </w:p>
+    <w:p>
+      <w:pPr>
+        <w:spacing w:line="324" w:lineRule="auto"/>
+      </w:pPr>
+      <w:r>
+        <w:t>⑤ 完成性能实验（Issue #27）：协议开销抓包矩阵、EMQX 容量与吞吐压测（5 万连接、5 万条每秒）、amqtt 对照实验、跨公网延迟实测，并把实测系数回填到建模文档。</w:t>
+      </w:r>
+    </w:p>
+    <w:p>
+      <w:pPr>
+        <w:spacing w:line="324" w:lineRule="auto"/>
+      </w:pPr>
+      <w:r>
+        <w:t>⑥ 完成需求计算器初版（Issue #33）：在监控端新增 /calculator 页面，输入需求参数即可输出网络负载、服务器配置与网络侧成本，与建模算例互验一致。</w:t>
+      </w:r>
+    </w:p>
+    <w:p>
+      <w:pPr>
+        <w:spacing w:line="324" w:lineRule="auto"/>
+      </w:pPr>
+      <w:r>
+        <w:t>⑦ 补充场景实景压测与稳定性验证：2 万连接持续 30 分钟零掉线、转发送达 99.96%，断线重连约 5.2 秒。</w:t>
       </w:r>
     </w:p>
     <w:p>
@@ -1454,15 +1526,15 @@
         <w:spacing w:line="324" w:lineRule="auto"/>
       </w:pPr>
       <w:r>
-        <w:t>① 老师指出原方案缺少明确的需求依据与成本分析。</w:t>
-      </w:r>
-    </w:p>
-    <w:p>
-      <w:pPr>
-        <w:spacing w:line="324" w:lineRule="auto"/>
-      </w:pPr>
-      <w:r>
-        <w:t>② 本地笔记本不适合做几万连接压测，作为容量基准也不具备“可购买配置”的代表性。</w:t>
+        <w:t>① 老师指出原方案缺少明确的需求依据与成本分析，停留在“能用”的层面，工程性不足。</w:t>
+      </w:r>
+    </w:p>
+    <w:p>
+      <w:pPr>
+        <w:spacing w:line="324" w:lineRule="auto"/>
+      </w:pPr>
+      <w:r>
+        <w:t>② 本地 Windows 笔记本既不适合做几万连接的压测，作为容量基准也不具备“可购买配置”的代表性，结论难以服人。</w:t>
       </w:r>
     </w:p>
     <w:p>
@@ -1478,15 +1550,23 @@
         <w:spacing w:line="324" w:lineRule="auto"/>
       </w:pPr>
       <w:r>
-        <w:t>① 建立通用计算模型，把方案选择变成可由需求参数推导的过程，而非拍脑袋决定。</w:t>
-      </w:r>
-    </w:p>
-    <w:p>
-      <w:pPr>
-        <w:spacing w:line="324" w:lineRule="auto"/>
-      </w:pPr>
-      <w:r>
-        <w:t>② 用 amqtt 作对照组同条件压测，用数据对比说明 EMQX 的容量与吞吐优势；租用配置明确的云服务器，使容量曲线可对应“什么配置支撑多少节点、成本多少”。</w:t>
+        <w:t>① 建立通用计算模型，把方案选择变成可由需求参数推导的过程，而不是拍脑袋决定，从而把“做系统”转化为“求一个有约束的最小成本”。</w:t>
+      </w:r>
+    </w:p>
+    <w:p>
+      <w:pPr>
+        <w:spacing w:line="324" w:lineRule="auto"/>
+      </w:pPr>
+      <w:r>
+        <w:t>② 引入 amqtt 作为对照组，与 EMQX 在相同条件下压测，用数据对比客观说明 EMQX 的容量与吞吐优势。</w:t>
+      </w:r>
+    </w:p>
+    <w:p>
+      <w:pPr>
+        <w:spacing w:line="324" w:lineRule="auto"/>
+      </w:pPr>
+      <w:r>
+        <w:t>③ 租用配置明确的阿里云服务器作为实验台架，使容量曲线可以直接对应“什么配置能支撑多少节点、成本是多少”。</w:t>
       </w:r>
     </w:p>
     <w:p>
@@ -1502,7 +1582,31 @@
         <w:spacing w:line="324" w:lineRule="auto"/>
       </w:pPr>
       <w:r>
-        <w:t>① 完成中期汇报、负载与成本建模文档、MQTT 升级、性能实验（抓包/压测/对照/延迟并校准系数）与需求计算器初版。</w:t>
+        <w:t>① 完成中期检查汇报与《网络负载与成本建模》文档。</w:t>
+      </w:r>
+    </w:p>
+    <w:p>
+      <w:pPr>
+        <w:spacing w:line="324" w:lineRule="auto"/>
+      </w:pPr>
+      <w:r>
+        <w:t>② 完成 MQTT 方案升级到 EMQX 5.8.9 与 MQTT 5.0、三种消息格式。</w:t>
+      </w:r>
+    </w:p>
+    <w:p>
+      <w:pPr>
+        <w:spacing w:line="324" w:lineRule="auto"/>
+      </w:pPr>
+      <w:r>
+        <w:t>③ 完成协议开销、容量、吞吐、对照与延迟等性能实验，取得数据并校准模型系数。</w:t>
+      </w:r>
+    </w:p>
+    <w:p>
+      <w:pPr>
+        <w:spacing w:line="324" w:lineRule="auto"/>
+      </w:pPr>
+      <w:r>
+        <w:t>④ 完成需求计算器初版，实现需求到配置、成本的自动估算。</w:t>
       </w:r>
     </w:p>
     <w:p>
@@ -1518,15 +1622,15 @@
         <w:spacing w:line="324" w:lineRule="auto"/>
       </w:pPr>
       <w:r>
-        <w:t>① 补充满负载与 QoS 丢包实验，使内存建模更严谨。</w:t>
-      </w:r>
-    </w:p>
-    <w:p>
-      <w:pPr>
-        <w:spacing w:line="324" w:lineRule="auto"/>
-      </w:pPr>
-      <w:r>
-        <w:t>② 进一步完善需求计算器的展示与可视化。</w:t>
+        <w:t>① 补充满负载爬坡与 QoS×丢包实验，使内存建模与可靠性分析更严谨。</w:t>
+      </w:r>
+    </w:p>
+    <w:p>
+      <w:pPr>
+        <w:spacing w:line="324" w:lineRule="auto"/>
+      </w:pPr>
+      <w:r>
+        <w:t>② 进一步完善需求计算器的展示与可视化效果。</w:t>
       </w:r>
     </w:p>
     <w:p>
@@ -1542,7 +1646,7 @@
         <w:pStyle w:val="3"/>
       </w:pPr>
       <w:r>
-        <w:t>第 5 个工作日：补充性能实验与计算器升级</w:t>
+        <w:t>第 5 个工作日：补充性能实验与需求计算器升级</w:t>
       </w:r>
     </w:p>
     <w:p>
@@ -1563,7 +1667,15 @@
         <w:spacing w:line="324" w:lineRule="auto"/>
       </w:pPr>
       <w:r>
-        <w:t>今天主要做两方面：一是补充完善性能实验使建模更严谨；二是为 ESP32 硬件节点接入做网络侧准备与对接规范。</w:t>
+        <w:t>今天主要做两方面工作：一是补充和完善性能实验，使建模更严谨、经得起追问；二是为 ESP32 硬件节点接入做网络侧的准备与对接规范。前者解决“估算是否准确”的问题，后者打通“硬件如何接进来”的问题。</w:t>
+      </w:r>
+    </w:p>
+    <w:p>
+      <w:pPr>
+        <w:spacing w:line="324" w:lineRule="auto"/>
+      </w:pPr>
+      <w:r>
+        <w:t>在实验中我重点验证了内存随负载的变化规律，并据此改进了计算器的内存模型；同时把硬件接入所需的类型映射、容量约束与对接规范都补齐，让负责硬件的队友可以照着实现 MQTT 上传。</w:t>
       </w:r>
     </w:p>
     <w:p>
@@ -1579,47 +1691,47 @@
         <w:spacing w:line="324" w:lineRule="auto"/>
       </w:pPr>
       <w:r>
-        <w:t>① 补充满负载连接爬坡实验，发现满负载每连接内存约为空闲的 2.46 倍，说明单一安全系数估算内存不够。</w:t>
-      </w:r>
-    </w:p>
-    <w:p>
-      <w:pPr>
-        <w:spacing w:line="324" w:lineRule="auto"/>
-      </w:pPr>
-      <w:r>
-        <w:t>② 补充 QoS × 丢包实验，发现 MQTT 跑在 TCP 之上、由 TCP 重传兜底，三种 QoS 在持续连接下到达率都接近 100%，代价是延迟随丢包率上升。</w:t>
-      </w:r>
-    </w:p>
-    <w:p>
-      <w:pPr>
-        <w:spacing w:line="324" w:lineRule="auto"/>
-      </w:pPr>
-      <w:r>
-        <w:t>③ 将连接爬坡加密到 10 个档位，使内存拟合曲线更扎实。</w:t>
-      </w:r>
-    </w:p>
-    <w:p>
-      <w:pPr>
-        <w:spacing w:line="324" w:lineRule="auto"/>
-      </w:pPr>
-      <w:r>
-        <w:t>④ 升级需求计算器：内存估算改为“空闲下界 ~ 满负载上界”双模型，前端改为深色仪表盘并用图表展示模型与实测对照。</w:t>
-      </w:r>
-    </w:p>
-    <w:p>
-      <w:pPr>
-        <w:spacing w:line="324" w:lineRule="auto"/>
-      </w:pPr>
-      <w:r>
-        <w:t>⑤ 完成 ESP32 接入网络侧准备（Issue #34）：监控端与模拟节点新增可燃气体、土壤湿度类型映射，建模文档新增接入层容量约束，计算器新增所需 AP 数输出，并整理 ESP32 到网络端对接规范。</w:t>
-      </w:r>
-    </w:p>
-    <w:p>
-      <w:pPr>
-        <w:spacing w:line="324" w:lineRule="auto"/>
-      </w:pPr>
-      <w:r>
-        <w:t>⑥ 针对队友反馈的 ESP32 配网网页不稳定（Issue #35），分析原因并建议改用成熟的 WiFiManager 库。</w:t>
+        <w:t>① 补充满负载连接爬坡实验，发现满负载下每连接内存约为空闲时的 2.46 倍，说明此前用单一安全系数估算内存偏乐观、不够稳妥。</w:t>
+      </w:r>
+    </w:p>
+    <w:p>
+      <w:pPr>
+        <w:spacing w:line="324" w:lineRule="auto"/>
+      </w:pPr>
+      <w:r>
+        <w:t>② 补充 QoS×丢包率实验：在 0~15% 人为丢包下测三种 QoS 的到达率与延迟，发现 MQTT 跑在 TCP 之上、由 TCP 重传兜底，三种 QoS 在持续连接下到达率都接近 100%，代价是延迟随丢包率上升。</w:t>
+      </w:r>
+    </w:p>
+    <w:p>
+      <w:pPr>
+        <w:spacing w:line="324" w:lineRule="auto"/>
+      </w:pPr>
+      <w:r>
+        <w:t>③ 把连接爬坡实验加密到 10 个档位，使内存拟合曲线更扎实、外推更可信。</w:t>
+      </w:r>
+    </w:p>
+    <w:p>
+      <w:pPr>
+        <w:spacing w:line="324" w:lineRule="auto"/>
+      </w:pPr>
+      <w:r>
+        <w:t>④ 升级需求计算器：内存估算从单一模型改为“空闲下界 ~ 满负载上界”双模型，选型按满负载上界并留安全系数；前端改为深色仪表盘，用图表直观展示模型曲线与实测散点的对照。</w:t>
+      </w:r>
+    </w:p>
+    <w:p>
+      <w:pPr>
+        <w:spacing w:line="324" w:lineRule="auto"/>
+      </w:pPr>
+      <w:r>
+        <w:t>⑤ 完成 ESP32 接入的网络侧准备（Issue #34）：在监控端与模拟节点新增可燃气体、土壤湿度类型映射，建模文档新增接入层容量约束，计算器新增所需 Wi-Fi AP 数输出。</w:t>
+      </w:r>
+    </w:p>
+    <w:p>
+      <w:pPr>
+        <w:spacing w:line="324" w:lineRule="auto"/>
+      </w:pPr>
+      <w:r>
+        <w:t>⑥ 整理 ESP32 到网络端的对接规范，明确主题、QoS、格式与字段，供负责硬件的队友实现 MQTT 上传时直接参照；并针对队友反馈的配网网页不稳定问题（Issue #35）分析原因、建议改用成熟的 WiFiManager 库。</w:t>
       </w:r>
     </w:p>
     <w:p>
@@ -1635,15 +1747,15 @@
         <w:spacing w:line="324" w:lineRule="auto"/>
       </w:pPr>
       <w:r>
-        <w:t>① 早期内存模型用单一安全系数估算，与满负载实测差距较大。</w:t>
-      </w:r>
-    </w:p>
-    <w:p>
-      <w:pPr>
-        <w:spacing w:line="324" w:lineRule="auto"/>
-      </w:pPr>
-      <w:r>
-        <w:t>② 队友 ESP32 固件采集的传感器类型与监控端原有类型不一致。</w:t>
+        <w:t>① 早期内存模型用单一安全系数估算，与满负载实测差距较大，可能导致选型偏小、上线后内存吃紧。</w:t>
+      </w:r>
+    </w:p>
+    <w:p>
+      <w:pPr>
+        <w:spacing w:line="324" w:lineRule="auto"/>
+      </w:pPr>
+      <w:r>
+        <w:t>② 队友 ESP32 固件采集的传感器类型与监控端原有的数据类型不一致，直接上传会显示异常或无法识别。</w:t>
       </w:r>
     </w:p>
     <w:p>
@@ -1659,15 +1771,15 @@
         <w:spacing w:line="324" w:lineRule="auto"/>
       </w:pPr>
       <w:r>
-        <w:t>① 专门做满负载爬坡实验得到满负载内存曲线，把计算器升级为空闲~满负载双模型，选型按满负载上界取值。</w:t>
-      </w:r>
-    </w:p>
-    <w:p>
-      <w:pPr>
-        <w:spacing w:line="324" w:lineRule="auto"/>
-      </w:pPr>
-      <w:r>
-        <w:t>② 在监控端与模拟节点补充对应类型映射与单位，使队友数据正确显示。</w:t>
+        <w:t>① 专门做满负载爬坡实验得到满负载内存曲线，把计算器内存升级为“空闲~满负载”双模型，选型按满负载上界取值，避免低估。</w:t>
+      </w:r>
+    </w:p>
+    <w:p>
+      <w:pPr>
+        <w:spacing w:line="324" w:lineRule="auto"/>
+      </w:pPr>
+      <w:r>
+        <w:t>② 在监控端与模拟节点补充对应的类型映射与默认单位，并形成统一对接规范，使队友的数据能被正确解析与显示。</w:t>
       </w:r>
     </w:p>
     <w:p>
@@ -1683,7 +1795,23 @@
         <w:spacing w:line="324" w:lineRule="auto"/>
       </w:pPr>
       <w:r>
-        <w:t>① 完成满负载爬坡与 QoS 丢包两项补充实验、计算器内存双模型与可视化升级、ESP32 接入网络侧准备与对接规范。</w:t>
+        <w:t>① 完成满负载爬坡与 QoS×丢包两项补充实验，新增相应实验图表。</w:t>
+      </w:r>
+    </w:p>
+    <w:p>
+      <w:pPr>
+        <w:spacing w:line="324" w:lineRule="auto"/>
+      </w:pPr>
+      <w:r>
+        <w:t>② 完成需求计算器的内存双模型升级与前端可视化改进。</w:t>
+      </w:r>
+    </w:p>
+    <w:p>
+      <w:pPr>
+        <w:spacing w:line="324" w:lineRule="auto"/>
+      </w:pPr>
+      <w:r>
+        <w:t>③ 完成 ESP32 接入的网络侧准备与对接规范，扫清硬件接入的软件侧障碍。</w:t>
       </w:r>
     </w:p>
     <w:p>
@@ -1699,7 +1827,15 @@
         <w:spacing w:line="324" w:lineRule="auto"/>
       </w:pPr>
       <w:r>
-        <w:t>① 搭建 ESP32 联调所需的服务器环境，验证从硬件节点到监控端的完整链路。</w:t>
+        <w:t>① 搭建 ESP32 联调所需的服务器侧环境。</w:t>
+      </w:r>
+    </w:p>
+    <w:p>
+      <w:pPr>
+        <w:spacing w:line="324" w:lineRule="auto"/>
+      </w:pPr>
+      <w:r>
+        <w:t>② 用模拟节点端到端验证从设备到监控端的完整链路。</w:t>
       </w:r>
     </w:p>
     <w:p>
@@ -1736,7 +1872,15 @@
         <w:spacing w:line="324" w:lineRule="auto"/>
       </w:pPr>
       <w:r>
-        <w:t>今天主要搭建并验证 ESP32 接入所需的服务器侧环境。考虑到方案主线是 EMQX，为使演示与报告一致，在本地用 Docker 部署 EMQX 5.8.9（与压测同版本），由笔记本扮演“未来自建部署的服务器”，并用模拟节点完整验证从设备到监控端的链路。</w:t>
+        <w:t>今天主要搭建并验证 ESP32 接入所需的服务器侧环境。考虑到项目方案的主线 Broker 是 EMQX，为了让演示与报告保持一致，我在本地用 Docker 部署了与压测同版本的 EMQX 5.8.9，由笔记本扮演“未来自建部署的服务器”，并用 PC 模拟节点完整验证了从设备到监控端的链路。</w:t>
+      </w:r>
+    </w:p>
+    <w:p>
+      <w:pPr>
+        <w:spacing w:line="324" w:lineRule="auto"/>
+      </w:pPr>
+      <w:r>
+        <w:t>这一天的关键是“演示环境与方案叙事保持一致”：之前为图方便用过 Mosquitto，但报告里讲的是 EMQX，若演示用另一套会前后矛盾。因此我把演示也统一到 EMQX，并把部署、联调、排错过程写成文档，方便答辩复现。</w:t>
       </w:r>
     </w:p>
     <w:p>
@@ -1752,31 +1896,31 @@
         <w:spacing w:line="324" w:lineRule="auto"/>
       </w:pPr>
       <w:r>
-        <w:t>① 在本地用 Docker 部署 EMQX 5.8.9，映射 MQTT 端口 1883 与 Dashboard 端口 18083。</w:t>
-      </w:r>
-    </w:p>
-    <w:p>
-      <w:pPr>
-        <w:spacing w:line="324" w:lineRule="auto"/>
-      </w:pPr>
-      <w:r>
-        <w:t>② 配置 Windows 移动热点组网，使 ESP32 与笔记本同处一个局域网，笔记本固定 IP 192.168.137.1 作为 Broker 地址。</w:t>
-      </w:r>
-    </w:p>
-    <w:p>
-      <w:pPr>
-        <w:spacing w:line="324" w:lineRule="auto"/>
-      </w:pPr>
-      <w:r>
-        <w:t>③ 用 PC 模拟节点模拟 ESP32（完整 JSON、MQTT 3.1.1）经热点 IP 连接 EMQX，端到端验证服务器侧链路全通，监控端正确显示四类数据。</w:t>
-      </w:r>
-    </w:p>
-    <w:p>
-      <w:pPr>
-        <w:spacing w:line="324" w:lineRule="auto"/>
-      </w:pPr>
-      <w:r>
-        <w:t>④ 编写《EMQX 部署与联调说明》，记录部署、启停、联调、验证流程与常见问题排查。</w:t>
+        <w:t>① 在本地用 Docker 部署 EMQX 5.8.9，映射 MQTT 端口 1883 与 Dashboard 端口 18083，与云端压测同版本，保持方案一致并自带可视化面板。</w:t>
+      </w:r>
+    </w:p>
+    <w:p>
+      <w:pPr>
+        <w:spacing w:line="324" w:lineRule="auto"/>
+      </w:pPr>
+      <w:r>
+        <w:t>② 配置 Windows 移动热点组网，使 ESP32 与笔记本处于同一局域网，笔记本在热点网络中的固定 IP 192.168.137.1 作为 Broker 地址。</w:t>
+      </w:r>
+    </w:p>
+    <w:p>
+      <w:pPr>
+        <w:spacing w:line="324" w:lineRule="auto"/>
+      </w:pPr>
+      <w:r>
+        <w:t>③ 用 PC 模拟节点模拟 ESP32（完整 JSON 格式、MQTT 3.1.1），经移动热点 IP 连接 EMQX，端到端验证服务器侧链路全部跑通，监控端正确显示温度、湿度、可燃气体与土壤湿度。</w:t>
+      </w:r>
+    </w:p>
+    <w:p>
+      <w:pPr>
+        <w:spacing w:line="324" w:lineRule="auto"/>
+      </w:pPr>
+      <w:r>
+        <w:t>④ 编写《EMQX 部署与联调说明》文档，记录首次部署、日常启停、联调准备、验证流程与常见问题排查，便于队友与答辩时照做。</w:t>
       </w:r>
     </w:p>
     <w:p>
@@ -1792,7 +1936,23 @@
         <w:spacing w:line="324" w:lineRule="auto"/>
       </w:pPr>
       <w:r>
-        <w:t>① 演示用本地 Mosquitto 还是 EMQX 的一致性问题；Docker 拉取镜像报错；担心 Docker 端口映射只绑本机导致 ESP32 连不上。</w:t>
+        <w:t>① 演示到底用本地 Mosquitto 还是 EMQX 的一致性问题：之前为方便用了 Mosquitto，但报告主线讲的是 EMQX。</w:t>
+      </w:r>
+    </w:p>
+    <w:p>
+      <w:pPr>
+        <w:spacing w:line="324" w:lineRule="auto"/>
+      </w:pPr>
+      <w:r>
+        <w:t>② 用 Docker 拉取 EMQX 镜像时报错，国内访问 Docker Hub 不稳定。</w:t>
+      </w:r>
+    </w:p>
+    <w:p>
+      <w:pPr>
+        <w:spacing w:line="324" w:lineRule="auto"/>
+      </w:pPr>
+      <w:r>
+        <w:t>③ 担心 Docker 端口映射只绑定本机回环，导致 ESP32 经移动热点连不上 Broker。</w:t>
       </w:r>
     </w:p>
     <w:p>
@@ -1808,7 +1968,23 @@
         <w:spacing w:line="324" w:lineRule="auto"/>
       </w:pPr>
       <w:r>
-        <w:t>① 演示统一改用与压测同版本的 EMQX 5.8.9（Docker），自带 Dashboard 便于答辩；登录 Docker Hub 后重新拉取成功；用模拟节点经热点 IP 验证，确认端口映射对外可见、ESP32 可连入。</w:t>
+        <w:t>① 决定演示也统一用 EMQX，用 Docker 在本地部署与压测同版本的 EMQX 5.8.9，既保持方案一致，又自带 Dashboard 便于答辩展示。</w:t>
+      </w:r>
+    </w:p>
+    <w:p>
+      <w:pPr>
+        <w:spacing w:line="324" w:lineRule="auto"/>
+      </w:pPr>
+      <w:r>
+        <w:t>② 登录 Docker Hub 后重新拉取镜像成功，解决了访问不稳定的问题。</w:t>
+      </w:r>
+    </w:p>
+    <w:p>
+      <w:pPr>
+        <w:spacing w:line="324" w:lineRule="auto"/>
+      </w:pPr>
+      <w:r>
+        <w:t>③ 用模拟节点经移动热点 IP（192.168.137.1）连接验证，确认 Docker 端口映射对外可见、外部设备能够连入。</w:t>
       </w:r>
     </w:p>
     <w:p>
@@ -1824,7 +2000,23 @@
         <w:spacing w:line="324" w:lineRule="auto"/>
       </w:pPr>
       <w:r>
-        <w:t>① 完成本地 EMQX 5.8.9 的 Docker 部署、从设备到监控端的端到端联调验证，以及《EMQX 部署与联调说明》文档。</w:t>
+        <w:t>① 完成本地 EMQX 5.8.9 的 Docker 部署，演示环境与方案、压测版本保持一致。</w:t>
+      </w:r>
+    </w:p>
+    <w:p>
+      <w:pPr>
+        <w:spacing w:line="324" w:lineRule="auto"/>
+      </w:pPr>
+      <w:r>
+        <w:t>② 完成从设备到监控端的端到端联调验证，服务器侧链路全部跑通。</w:t>
+      </w:r>
+    </w:p>
+    <w:p>
+      <w:pPr>
+        <w:spacing w:line="324" w:lineRule="auto"/>
+      </w:pPr>
+      <w:r>
+        <w:t>③ 完成《EMQX 部署与联调说明》文档，沉淀部署与排错经验。</w:t>
       </w:r>
     </w:p>
     <w:p>
@@ -1840,7 +2032,15 @@
         <w:spacing w:line="324" w:lineRule="auto"/>
       </w:pPr>
       <w:r>
-        <w:t>① 等硬件队友完成 ESP32 配网与 MQTT 上传后进行真机联调，并继续推进报告与答辩材料整理。</w:t>
+        <w:t>① 等负责硬件的队友完成 ESP32 配网与 MQTT 上传后，进行真机联调。</w:t>
+      </w:r>
+    </w:p>
+    <w:p>
+      <w:pPr>
+        <w:spacing w:line="324" w:lineRule="auto"/>
+      </w:pPr>
+      <w:r>
+        <w:t>② 继续推进课程设计报告与答辩材料的整理。</w:t>
       </w:r>
     </w:p>
     <w:p>
@@ -1877,7 +2077,15 @@
         <w:spacing w:line="324" w:lineRule="auto"/>
       </w:pPr>
       <w:r>
-        <w:t>今天配合硬件队友的 ESP32 室外全天长测，负责服务器侧的数据记录与分析。在云端用持久会话记录器 7×24 接收并落盘，本地无需开机；事后对约 15 小时数据做到达率统计与曲线分析，并定位光照数据异常的根因（属硬件侧）。</w:t>
+        <w:t>今天配合硬件队友的 ESP32 室外全天长测，负责服务器侧的数据记录与分析。考虑到真机测试需要从早到晚持续接收、而本地不便长时间开机，我在云服务器上用持久会话记录器 7×24 接收并落盘，事后再对约 15 小时的数据做到达率统计与曲线分析。</w:t>
+      </w:r>
+    </w:p>
+    <w:p>
+      <w:pPr>
+        <w:spacing w:line="324" w:lineRule="auto"/>
+      </w:pPr>
+      <w:r>
+        <w:t>这一天的重点不只是“收到数据”，更是“把数据讲清楚”：要统计到达率、画出各类数据的全天曲线、核对其是否符合当天天气与传感器特性，并定位光照数据异常到底出在硬件端还是订阅端。</w:t>
       </w:r>
     </w:p>
     <w:p>
@@ -1893,39 +2101,39 @@
         <w:spacing w:line="324" w:lineRule="auto"/>
       </w:pPr>
       <w:r>
-        <w:t>① 在云服务器部署 cloud_recorder.py（QoS 1、持久会话、systemd 常驻），持续记录 ESP32 上报数据。</w:t>
-      </w:r>
-    </w:p>
-    <w:p>
-      <w:pPr>
-        <w:spacing w:line="324" w:lineRule="auto"/>
-      </w:pPr>
-      <w:r>
-        <w:t>② 统计到达率：全天约 8547 条、整体到达率 95.0%，期间 2 次网络中断；明确“网络短时中断计入、外部停机剔除”的口径。</w:t>
-      </w:r>
-    </w:p>
-    <w:p>
-      <w:pPr>
-        <w:spacing w:line="324" w:lineRule="auto"/>
-      </w:pPr>
-      <w:r>
-        <w:t>③ 绘制温度、湿度、可燃气体、土壤湿度的全天曲线，核对其日变化形态与当日晴热天气吻合。</w:t>
-      </w:r>
-    </w:p>
-    <w:p>
-      <w:pPr>
-        <w:spacing w:line="324" w:lineRule="auto"/>
-      </w:pPr>
-      <w:r>
-        <w:t>④ 定位光照 BH1750 异常（白天多为 -1）：经比对串口与订阅链路，排除监控/订阅侧，判断为 ESP32 端 I2C 接线接触不良（模块本身正常）。</w:t>
-      </w:r>
-    </w:p>
-    <w:p>
-      <w:pPr>
-        <w:spacing w:line="324" w:lineRule="auto"/>
-      </w:pPr>
-      <w:r>
-        <w:t>⑤ 输出测试报告、全天曲线与记录/分析脚本并入库。</w:t>
+        <w:t>① 在云服务器部署 cloud_recorder.py（QoS 1、持久会话、systemd 常驻接收），持续记录 ESP32 上报的全部主题数据，避免漏收。</w:t>
+      </w:r>
+    </w:p>
+    <w:p>
+      <w:pPr>
+        <w:spacing w:line="324" w:lineRule="auto"/>
+      </w:pPr>
+      <w:r>
+        <w:t>② 统计全天到达率：约 15 小时共上报 8547 条，整体到达率 95.0%，期间发生 2 次网络中断；并明确“网络短时中断计入、外部停机剔除”的统计口径。</w:t>
+      </w:r>
+    </w:p>
+    <w:p>
+      <w:pPr>
+        <w:spacing w:line="324" w:lineRule="auto"/>
+      </w:pPr>
+      <w:r>
+        <w:t>③ 绘制温度、湿度、可燃气体、土壤湿度四类数据的全天曲线，核对其日变化形态——温度清晨约 26℃、午后峰值约 39℃、傍晚回落，与当日西安晴热高温天气高度吻合，验证了数据真实性。</w:t>
+      </w:r>
+    </w:p>
+    <w:p>
+      <w:pPr>
+        <w:spacing w:line="324" w:lineRule="auto"/>
+      </w:pPr>
+      <w:r>
+        <w:t>④ 定位光照 BH1750 异常（白天约 99% 读数为 -1）：通过比对串口输出与服务器订阅记录，排除监控端与订阅链路的问题，判断为 ESP32 端 I2C 接线接触不良所致（模块本身正常）。</w:t>
+      </w:r>
+    </w:p>
+    <w:p>
+      <w:pPr>
+        <w:spacing w:line="324" w:lineRule="auto"/>
+      </w:pPr>
+      <w:r>
+        <w:t>⑤ 整理并入库测试报告、全天曲线图与记录、分析脚本，形成完整的服务器侧测试证据。</w:t>
       </w:r>
     </w:p>
     <w:p>
@@ -1941,7 +2149,23 @@
         <w:spacing w:line="324" w:lineRule="auto"/>
       </w:pPr>
       <w:r>
-        <w:t>① 光照数据白天几乎全为无效值；本地不便 7×24 开机记录；需判断异常出在硬件端还是订阅/监控端。</w:t>
+        <w:t>① 光照数据白天几乎全为无效值（-1），夜间能连续读数十分钟后又掉，规律异常。</w:t>
+      </w:r>
+    </w:p>
+    <w:p>
+      <w:pPr>
+        <w:spacing w:line="324" w:lineRule="auto"/>
+      </w:pPr>
+      <w:r>
+        <w:t>② 真机测试需从早到晚持续接收，本地笔记本不便 7×24 长时间开机记录。</w:t>
+      </w:r>
+    </w:p>
+    <w:p>
+      <w:pPr>
+        <w:spacing w:line="324" w:lineRule="auto"/>
+      </w:pPr>
+      <w:r>
+        <w:t>③ 光照异常需要判断到底出在硬件采集端，还是出在 Broker 转发或监控端订阅。</w:t>
       </w:r>
     </w:p>
     <w:p>
@@ -1957,7 +2181,23 @@
         <w:spacing w:line="324" w:lineRule="auto"/>
       </w:pPr>
       <w:r>
-        <w:t>① 用云端持久记录器常驻接收，避免本地长时间开机；比对串口与订阅链路排除监控端问题，定位为硬件端 I2C 接触不良；统计时区分网络中断与外部停机。</w:t>
+        <w:t>① 在云端部署持久会话记录器常驻接收并落盘，本地无需开机，保证长测期间不漏收数据。</w:t>
+      </w:r>
+    </w:p>
+    <w:p>
+      <w:pPr>
+        <w:spacing w:line="324" w:lineRule="auto"/>
+      </w:pPr>
+      <w:r>
+        <w:t>② 通过比对串口原始读数与服务器订阅到的数据，确认监控端、订阅链路均正常，从而把问题定位到 ESP32 端 I2C 接触不良。</w:t>
+      </w:r>
+    </w:p>
+    <w:p>
+      <w:pPr>
+        <w:spacing w:line="324" w:lineRule="auto"/>
+      </w:pPr>
+      <w:r>
+        <w:t>③ 在统计到达率时区分“网络短时中断”（计入、靠 QoS1+重连扛住）与“外部停机”（剔除），使到达率口径客观合理。</w:t>
       </w:r>
     </w:p>
     <w:p>
@@ -1973,7 +2213,23 @@
         <w:spacing w:line="324" w:lineRule="auto"/>
       </w:pPr>
       <w:r>
-        <w:t>① 完成约 15 小时服务器侧记录与分析，四类数据合理、到达率 95.0% 达标，并定位光照问题为硬件端接线接触不良。</w:t>
+        <w:t>① 完成约 15 小时的服务器侧记录与分析，四类数据合理、整体到达率 95.0% 达标。</w:t>
+      </w:r>
+    </w:p>
+    <w:p>
+      <w:pPr>
+        <w:spacing w:line="324" w:lineRule="auto"/>
+      </w:pPr>
+      <w:r>
+        <w:t>② 定位了光照异常的根因为硬件端接线接触不良，为后续修复指明方向。</w:t>
+      </w:r>
+    </w:p>
+    <w:p>
+      <w:pPr>
+        <w:spacing w:line="324" w:lineRule="auto"/>
+      </w:pPr>
+      <w:r>
+        <w:t>③ 输出测试报告、全天曲线与记录/分析脚本，形成可复现的测试证据。</w:t>
       </w:r>
     </w:p>
     <w:p>
@@ -1989,7 +2245,15 @@
         <w:spacing w:line="324" w:lineRule="auto"/>
       </w:pPr>
       <w:r>
-        <w:t>① 复核性能与协议实验数据；待硬件接线修复后补测光照；把云端记录器升级为持久服务。</w:t>
+        <w:t>① 复核已有的性能与协议实验数据，确保与建模系数一致。</w:t>
+      </w:r>
+    </w:p>
+    <w:p>
+      <w:pPr>
+        <w:spacing w:line="324" w:lineRule="auto"/>
+      </w:pPr>
+      <w:r>
+        <w:t>② 待硬件接线修复后补测光照数据，并把云端记录器升级为持久服务。</w:t>
       </w:r>
     </w:p>
     <w:p>
@@ -2026,7 +2290,15 @@
         <w:spacing w:line="324" w:lineRule="auto"/>
       </w:pPr>
       <w:r>
-        <w:t>今天复核已有性能与协议实验数据，配合硬件修复后补采光照数据并出曲线，并把云端记录器升级为持久服务，避免重启/欠费导致记录中断；同时梳理工程分析素材。</w:t>
+        <w:t>今天主要做三件事：复核已有的性能与协议实验数据使结论扎实；配合硬件修复后补采光照数据并绘制曲线，证明传感器本身正常；把云端记录器升级为持久服务，避免服务器重启或欠费导致记录中断。同时为报告的工程分析章节梳理素材。</w:t>
+      </w:r>
+    </w:p>
+    <w:p>
+      <w:pPr>
+        <w:spacing w:line="324" w:lineRule="auto"/>
+      </w:pPr>
+      <w:r>
+        <w:t>其中记录器持久化是一个容易被忽视但很关键的工程细节——之前用临时方式启动，服务器一重启记录就丢了。把它做成开机自启、异常自动重启的常驻服务后，长测的可靠性才真正有保障。</w:t>
       </w:r>
     </w:p>
     <w:p>
@@ -2042,31 +2314,31 @@
         <w:spacing w:line="324" w:lineRule="auto"/>
       </w:pPr>
       <w:r>
-        <w:t>① 复核协议开销、容量/吞吐、QoS × 丢包、公网延迟等实验数据与图表，确认与建模系数一致。</w:t>
-      </w:r>
-    </w:p>
-    <w:p>
-      <w:pPr>
-        <w:spacing w:line="324" w:lineRule="auto"/>
-      </w:pPr>
-      <w:r>
-        <w:t>② 硬件队友重新接稳 BH1750 后，服务器侧记录到夜间至清晨连续约 6 小时有效光照（0 → 约 305 lux），并绘制夜晨曲线，佐证模块本身正常。</w:t>
-      </w:r>
-    </w:p>
-    <w:p>
-      <w:pPr>
-        <w:spacing w:line="324" w:lineRule="auto"/>
-      </w:pPr>
-      <w:r>
-        <w:t>③ 把云端记录器从临时单元升级为 systemd 持久服务（Restart=always、开机自启），避免服务器重启或欠费后记录中断。</w:t>
-      </w:r>
-    </w:p>
-    <w:p>
-      <w:pPr>
-        <w:spacing w:line="324" w:lineRule="auto"/>
-      </w:pPr>
-      <w:r>
-        <w:t>④ 梳理工程分析素材（实时性、可靠性、可扩展性、成本、可维护性）。</w:t>
+        <w:t>① 复核协议开销、容量与吞吐、QoS×丢包、跨公网延迟等实验的数据与图表，确认它们与建模文档中的系数一致、可相互印证。</w:t>
+      </w:r>
+    </w:p>
+    <w:p>
+      <w:pPr>
+        <w:spacing w:line="324" w:lineRule="auto"/>
+      </w:pPr>
+      <w:r>
+        <w:t>② 在硬件队友重新接稳 BH1750 后，于服务器侧记录到夜间至清晨连续约 6 小时的有效光照数据（夜间 0 lux、日出后平滑爬升至约 305 lux），并绘制夜晨曲线，佐证模块本身正常、问题确在接线。</w:t>
+      </w:r>
+    </w:p>
+    <w:p>
+      <w:pPr>
+        <w:spacing w:line="324" w:lineRule="auto"/>
+      </w:pPr>
+      <w:r>
+        <w:t>③ 把云端记录器从临时单元升级为 systemd 持久服务（开机自启、异常自动重启），避免服务器重启或欠费停机后记录中断。</w:t>
+      </w:r>
+    </w:p>
+    <w:p>
+      <w:pPr>
+        <w:spacing w:line="324" w:lineRule="auto"/>
+      </w:pPr>
+      <w:r>
+        <w:t>④ 梳理报告所需的工程分析素材，从实时性、可靠性、可扩展性、成本与可维护性五个维度归纳系统特性与约束。</w:t>
       </w:r>
     </w:p>
     <w:p>
@@ -2082,7 +2354,15 @@
         <w:spacing w:line="324" w:lineRule="auto"/>
       </w:pPr>
       <w:r>
-        <w:t>① 早期记录器为临时单元，服务器重启后会丢失；光照修复后需要一段干净曲线佐证 BH1750 本身正常。</w:t>
+        <w:t>① 早期记录器以临时方式启动，服务器一旦重启或欠费停机，记录进程就会丢失、数据出现缺口。</w:t>
+      </w:r>
+    </w:p>
+    <w:p>
+      <w:pPr>
+        <w:spacing w:line="324" w:lineRule="auto"/>
+      </w:pPr>
+      <w:r>
+        <w:t>② 光照修复后，需要一段干净、连续的有效数据来佐证“BH1750 本身正常、之前是接线问题”。</w:t>
       </w:r>
     </w:p>
     <w:p>
@@ -2098,7 +2378,15 @@
         <w:spacing w:line="324" w:lineRule="auto"/>
       </w:pPr>
       <w:r>
-        <w:t>① 将记录器改为 systemd 常驻服务并开机自启；利用夜间至清晨稳定时段采集连续有效光照数据并出图。</w:t>
+        <w:t>① 把记录器改为 systemd 常驻服务并设置开机自启与失败自动重启，从机制上保证长测期间记录不中断。</w:t>
+      </w:r>
+    </w:p>
+    <w:p>
+      <w:pPr>
+        <w:spacing w:line="324" w:lineRule="auto"/>
+      </w:pPr>
+      <w:r>
+        <w:t>② 利用夜间至清晨光照平稳、便于连续观察的时段采集数据，得到一段完整且连续有效的光照曲线作为佐证。</w:t>
       </w:r>
     </w:p>
     <w:p>
@@ -2114,7 +2402,23 @@
         <w:spacing w:line="324" w:lineRule="auto"/>
       </w:pPr>
       <w:r>
-        <w:t>① 完成性能数据复核、光照夜晨曲线与记录器持久化，工程分析素材齐备。</w:t>
+        <w:t>① 完成性能与协议实验数据的复核，确认结论扎实、可相互印证。</w:t>
+      </w:r>
+    </w:p>
+    <w:p>
+      <w:pPr>
+        <w:spacing w:line="324" w:lineRule="auto"/>
+      </w:pPr>
+      <w:r>
+        <w:t>② 取得连续约 6 小时的有效光照夜晨曲线，证明 BH1750 修复后采集正常。</w:t>
+      </w:r>
+    </w:p>
+    <w:p>
+      <w:pPr>
+        <w:spacing w:line="324" w:lineRule="auto"/>
+      </w:pPr>
+      <w:r>
+        <w:t>③ 完成云端记录器的持久化升级，并备齐了工程分析章节的素材。</w:t>
       </w:r>
     </w:p>
     <w:p>
@@ -2130,7 +2434,15 @@
         <w:spacing w:line="324" w:lineRule="auto"/>
       </w:pPr>
       <w:r>
-        <w:t>① 补做 MQTT 与 HTTP 开销对比实验，完善监控端，撰写并扩充课程设计报告。</w:t>
+        <w:t>① 补做 MQTT 与 HTTP 的开销对比实验，为协议选型提供量化依据。</w:t>
+      </w:r>
+    </w:p>
+    <w:p>
+      <w:pPr>
+        <w:spacing w:line="324" w:lineRule="auto"/>
+      </w:pPr>
+      <w:r>
+        <w:t>② 完善 Web 监控端，并着手撰写、扩充课程设计报告。</w:t>
       </w:r>
     </w:p>
     <w:p>
@@ -2167,7 +2479,15 @@
         <w:spacing w:line="324" w:lineRule="auto"/>
       </w:pPr>
       <w:r>
-        <w:t>今天补做 MQTT 与 HTTP 的开销对比实验为协议选型提供量化依据；完善 Web 监控端（界面美化、选择订阅）；并撰写、扩充课程设计报告。</w:t>
+        <w:t>今天的工作分三块：一是补做 MQTT 与 HTTP 的开销对比实验，为“为什么选 MQTT”提供量化依据；二是完善 Web 监控端，包括界面美化与新增“选择订阅”功能；三是撰写并大幅扩充课程设计报告。三件事都指向同一个目标——让方案的每个选择都有数据和论证支撑。</w:t>
+      </w:r>
+    </w:p>
+    <w:p>
+      <w:pPr>
+        <w:spacing w:line="324" w:lineRule="auto"/>
+      </w:pPr>
+      <w:r>
+        <w:t>在做对比实验时我意识到一个容易讲不清的点：丢包实验里三种 QoS 到达率都是 100%，是因为 TCP 重传兜底，这说明 QoS 不是用来抗丢包的、其价值在连接断开场景。我把这个思路理顺并落到报告与 PPT 中，避免答辩时被问住。</w:t>
       </w:r>
     </w:p>
     <w:p>
@@ -2183,31 +2503,39 @@
         <w:spacing w:line="324" w:lineRule="auto"/>
       </w:pPr>
       <w:r>
-        <w:t>① 编写 compare_mqtt_http.py，逐字节实测同一条数据经 MQTT 与 HTTP 上传的应用层开销（json/json-min/msgpack 各 200 次）：MQTT 比 HTTP 节省 65%~77%，协议头开销约为其 1/8。</w:t>
-      </w:r>
-    </w:p>
-    <w:p>
-      <w:pPr>
-        <w:spacing w:line="324" w:lineRule="auto"/>
-      </w:pPr>
-      <w:r>
-        <w:t>② 美化 Web 监控端为深色仪表盘，新增“选择订阅”功能（按节点、按数据类型或全部过滤，后端按 MQTT 通配符对该连接的推送过滤），直观体现主题订阅机制。</w:t>
-      </w:r>
-    </w:p>
-    <w:p>
-      <w:pPr>
-        <w:spacing w:line="324" w:lineRule="auto"/>
-      </w:pPr>
-      <w:r>
-        <w:t>③ 厘清 QoS 选型思路：TCP 兜底连接内丢包、QoS 解决连接断开，故选 QoS 1 + 持久会话，并用 seq 去重替代 QoS 2。</w:t>
-      </w:r>
-    </w:p>
-    <w:p>
-      <w:pPr>
-        <w:spacing w:line="324" w:lineRule="auto"/>
-      </w:pPr>
-      <w:r>
-        <w:t>④ 撰写并大幅扩充课程设计报告：实现过程详写、测试证据闭环、典型问题与解决过程、设计指标达成汇总表、硬件约束与安全性、工程化总结。</w:t>
+        <w:t>① 编写 compare_mqtt_http.py，逐字节实测同一条环境数据经 MQTT（QoS 1 发布）与 HTTP（POST）上传的应用层开销，对 json、json-min、msgpack 各取 200 次：结果 MQTT 比 HTTP 节省 65%~77%，协议头开销约为其 1/8，且数据越小、上传越频繁，MQTT 越省。</w:t>
+      </w:r>
+    </w:p>
+    <w:p>
+      <w:pPr>
+        <w:spacing w:line="324" w:lineRule="auto"/>
+      </w:pPr>
+      <w:r>
+        <w:t>② 美化 Web 监控端为深色仪表盘风格，使其与需求计算器界面统一、更专业。</w:t>
+      </w:r>
+    </w:p>
+    <w:p>
+      <w:pPr>
+        <w:spacing w:line="324" w:lineRule="auto"/>
+      </w:pPr>
+      <w:r>
+        <w:t>③ 为监控端新增“选择订阅”功能：可按节点、按数据类型或全部进行订阅过滤，后端按 MQTT 通配符对该连接的 SSE 推送做相应过滤，直观体现 MQTT 的主题订阅机制。</w:t>
+      </w:r>
+    </w:p>
+    <w:p>
+      <w:pPr>
+        <w:spacing w:line="324" w:lineRule="auto"/>
+      </w:pPr>
+      <w:r>
+        <w:t>④ 厘清并书面化 QoS 选型思路：TCP 兜底连接内丢包、QoS 解决连接断开时不丢，故选 QoS 1 + 持久会话，并用消息序号 seq 去重替代开销更大的 QoS 2。</w:t>
+      </w:r>
+    </w:p>
+    <w:p>
+      <w:pPr>
+        <w:spacing w:line="324" w:lineRule="auto"/>
+      </w:pPr>
+      <w:r>
+        <w:t>⑤ 撰写并大幅扩充课程设计报告：实现过程详写（PC 节点、ESP32、监控端配置）、测试证据闭环、典型问题与解决过程、设计指标达成情况汇总表、硬件约束与安全性分析、工程化总结等。</w:t>
       </w:r>
     </w:p>
     <w:p>
@@ -2223,7 +2551,15 @@
         <w:spacing w:line="324" w:lineRule="auto"/>
       </w:pPr>
       <w:r>
-        <w:t>① 需要量化“为什么选 MQTT 而不用 HTTP”；报告需补充实现细节、证据链与工程分析。</w:t>
+        <w:t>① 需要量化回答“为什么选 MQTT 而不用 HTTP”，仅靠定性描述说服力不足。</w:t>
+      </w:r>
+    </w:p>
+    <w:p>
+      <w:pPr>
+        <w:spacing w:line="324" w:lineRule="auto"/>
+      </w:pPr>
+      <w:r>
+        <w:t>② 报告需要补充实现细节、测试证据链与工程分析，否则证据链不够直观、达成情况不清晰。</w:t>
       </w:r>
     </w:p>
     <w:p>
@@ -2239,7 +2575,15 @@
         <w:spacing w:line="324" w:lineRule="auto"/>
       </w:pPr>
       <w:r>
-        <w:t>① 做逐字节对比实验拿到真实数据支撑选型；按“测试方法—测试结果—结果分析”补充图表与典型问题闭环。</w:t>
+        <w:t>① 编写逐字节对比实验脚本，用真实数据对比 MQTT 与 HTTP 的报文开销与连接模型差异，为协议选型提供硬证据。</w:t>
+      </w:r>
+    </w:p>
+    <w:p>
+      <w:pPr>
+        <w:spacing w:line="324" w:lineRule="auto"/>
+      </w:pPr>
+      <w:r>
+        <w:t>② 在报告测试章节按“测试方法—测试结果—结果分析”组织，每个结论配图、表或日志，并新增典型问题闭环与指标达成汇总表。</w:t>
       </w:r>
     </w:p>
     <w:p>
@@ -2255,7 +2599,23 @@
         <w:spacing w:line="324" w:lineRule="auto"/>
       </w:pPr>
       <w:r>
-        <w:t>① 完成 MQTT/HTTP 对比实验与数据归档、监控端“选择订阅”功能、以及课程设计报告的撰写与扩充。</w:t>
+        <w:t>① 完成 MQTT 与 HTTP 开销对比实验，并将脚本与数据归档入库。</w:t>
+      </w:r>
+    </w:p>
+    <w:p>
+      <w:pPr>
+        <w:spacing w:line="324" w:lineRule="auto"/>
+      </w:pPr>
+      <w:r>
+        <w:t>② 完成 Web 监控端的界面美化与“选择订阅”功能。</w:t>
+      </w:r>
+    </w:p>
+    <w:p>
+      <w:pPr>
+        <w:spacing w:line="324" w:lineRule="auto"/>
+      </w:pPr>
+      <w:r>
+        <w:t>③ 完成课程设计报告的撰写与大幅扩充，证据链与工程分析更完整。</w:t>
       </w:r>
     </w:p>
     <w:p>
@@ -2271,7 +2631,15 @@
         <w:spacing w:line="324" w:lineRule="auto"/>
       </w:pPr>
       <w:r>
-        <w:t>① 制作答辩 PPT 的协议与硬件部分，合并队友材料并提交全部成果。</w:t>
+        <w:t>① 制作答辩 PPT 的协议与硬件部分。</w:t>
+      </w:r>
+    </w:p>
+    <w:p>
+      <w:pPr>
+        <w:spacing w:line="324" w:lineRule="auto"/>
+      </w:pPr>
+      <w:r>
+        <w:t>② 合并队友硬件材料并整理、提交全部成果。</w:t>
       </w:r>
     </w:p>
     <w:p>
@@ -2308,7 +2676,15 @@
         <w:spacing w:line="324" w:lineRule="auto"/>
       </w:pPr>
       <w:r>
-        <w:t>今天完善答辩 PPT，合入硬件队友材料，统一接线口径，并整理、提交全部课程设计成果，完成项目闭环。</w:t>
+        <w:t>今天完善答辩 PPT、合入硬件队友材料、统一各处口径，并整理、提交全部课程设计成果，使项目形成完整闭环。PPT 的重点是把“需求驱动、考虑成本”的主线讲顺，并让硬件部分清晰呈现。</w:t>
+      </w:r>
+    </w:p>
+    <w:p>
+      <w:pPr>
+        <w:spacing w:line="324" w:lineRule="auto"/>
+      </w:pPr>
+      <w:r>
+        <w:t>在合并材料时我还处理了一处口径不一致：硬件接线图把光照画成了光敏模块，而串口与固件实际用的是 BH1750。我以串口/固件为准统一为 BH1750，并提 Issue 请硬件队友更正图，避免报告与 PPT 自相矛盾。</w:t>
       </w:r>
     </w:p>
     <w:p>
@@ -2324,31 +2700,31 @@
         <w:spacing w:line="324" w:lineRule="auto"/>
       </w:pPr>
       <w:r>
-        <w:t>① 完善答辩 PPT：新增“为什么选 MQTT（对比 HTTP 实测）”页、重构 QoS 论证页（讲清 TCP 与 QoS 分工）、把 2 万连接压测移到校园案例作为实验支撑、新增两页 ESP32 硬件页（组成与传感器接入、Wi-Fi 配网）。</w:t>
-      </w:r>
-    </w:p>
-    <w:p>
-      <w:pPr>
-        <w:spacing w:line="324" w:lineRule="auto"/>
-      </w:pPr>
-      <w:r>
-        <w:t>② 合并硬件队友的固件、测试记录与图片等 PR，统一接线口径（光照以串口/固件为准，即 BH1750）。</w:t>
-      </w:r>
-    </w:p>
-    <w:p>
-      <w:pPr>
-        <w:spacing w:line="324" w:lineRule="auto"/>
-      </w:pPr>
-      <w:r>
-        <w:t>③ 核对课程设计报告、源代码、汇报 PPT、个人日志与测试附件齐备。</w:t>
-      </w:r>
-    </w:p>
-    <w:p>
-      <w:pPr>
-        <w:spacing w:line="324" w:lineRule="auto"/>
-      </w:pPr>
-      <w:r>
-        <w:t>④ 用 Git 分模块提交并推送，保持过程留痕。</w:t>
+        <w:t>① 完善答辩 PPT：新增“为什么选 MQTT（对比 HTTP 实测）”页、重构 QoS 论证页（讲清 TCP 与 QoS 的分工）、把 2 万连接实景压测移到校园案例处作为实验支撑，并新增两页 ESP32 硬件页（组成与传感器接入、Wi-Fi 配网）。</w:t>
+      </w:r>
+    </w:p>
+    <w:p>
+      <w:pPr>
+        <w:spacing w:line="324" w:lineRule="auto"/>
+      </w:pPr>
+      <w:r>
+        <w:t>② 合并硬件队友提交的固件、测试记录与图片等 Pull Request，统一接线口径（光照以串口/固件为准，即 BH1750），并提 Issue 跟进图的更正。</w:t>
+      </w:r>
+    </w:p>
+    <w:p>
+      <w:pPr>
+        <w:spacing w:line="324" w:lineRule="auto"/>
+      </w:pPr>
+      <w:r>
+        <w:t>③ 核对课程设计报告、源代码/仿真文件、汇报 PPT、个人日志与测试附件是否齐备，逐项确认提交清单。</w:t>
+      </w:r>
+    </w:p>
+    <w:p>
+      <w:pPr>
+        <w:spacing w:line="324" w:lineRule="auto"/>
+      </w:pPr>
+      <w:r>
+        <w:t>④ 用 Git 分模块提交并推送全部成果，保持过程留痕、提交信息简洁规范。</w:t>
       </w:r>
     </w:p>
     <w:p>
@@ -2364,7 +2740,15 @@
         <w:spacing w:line="324" w:lineRule="auto"/>
       </w:pPr>
       <w:r>
-        <w:t>① 硬件接线图中光照模块标注与实际（BH1750）不一致；多份材料需统一并提交。</w:t>
+        <w:t>① 硬件接线图与实物图中光照模块的标注与实际使用的 BH1750 不一致，若直接放进报告/PPT 会前后矛盾、易被发现。</w:t>
+      </w:r>
+    </w:p>
+    <w:p>
+      <w:pPr>
+        <w:spacing w:line="324" w:lineRule="auto"/>
+      </w:pPr>
+      <w:r>
+        <w:t>② 报告、PPT、代码、日志、测试附件等多份材料需要统一口径并完整提交，遗漏任一项都会影响评分。</w:t>
       </w:r>
     </w:p>
     <w:p>
@@ -2380,7 +2764,15 @@
         <w:spacing w:line="324" w:lineRule="auto"/>
       </w:pPr>
       <w:r>
-        <w:t>① 统一以串口/固件为准（BH1750），并提 Issue 请硬件队友更正接线图；分模块清点并提交全部成果。</w:t>
+        <w:t>① 统一以串口与固件为准（光照为 BH1750），先在报告与 PPT 的文字、表格中改正，并提 Issue 请硬件队友更正图片后替换。</w:t>
+      </w:r>
+    </w:p>
+    <w:p>
+      <w:pPr>
+        <w:spacing w:line="324" w:lineRule="auto"/>
+      </w:pPr>
+      <w:r>
+        <w:t>② 按提交清单逐项清点报告、代码、PPT、日志与测试数据，分模块用 Git 提交、推送，确保成果齐备、可追溯。</w:t>
       </w:r>
     </w:p>
     <w:p>
@@ -2396,7 +2788,15 @@
         <w:spacing w:line="324" w:lineRule="auto"/>
       </w:pPr>
       <w:r>
-        <w:t>① 完成答辩 PPT、材料合并与成果提交，课程设计形成完整闭环。</w:t>
+        <w:t>① 完成答辩 PPT 的协议与硬件部分制作，叙事主线清晰、硬件呈现完整。</w:t>
+      </w:r>
+    </w:p>
+    <w:p>
+      <w:pPr>
+        <w:spacing w:line="324" w:lineRule="auto"/>
+      </w:pPr>
+      <w:r>
+        <w:t>② 完成硬件材料合并与口径统一，并提交了全部课程设计成果，项目形成完整闭环。</w:t>
       </w:r>
     </w:p>
     <w:p>
@@ -2412,7 +2812,7 @@
         <w:spacing w:line="324" w:lineRule="auto"/>
       </w:pPr>
       <w:r>
-        <w:t>① 参加课程设计答辩演示。</w:t>
+        <w:t>① 参加课程设计答辩演示，完成现场讲解与系统演示。</w:t>
       </w:r>
     </w:p>
     <w:p>
@@ -2444,7 +2844,7 @@
         <w:spacing w:line="324" w:lineRule="auto"/>
       </w:pPr>
       <w:r>
-        <w:t>负责软件侧与项目流程推进，主要包括：需求分析与 MQTT 主题/消息格式设计；PC 模拟节点与 Web 监控端实现；网络负载与服务器配置成本建模；MQTT 5.0 方案升级与 EMQX 选型；协议开销抓包、容量/吞吐压测、QoS×丢包与跨公网延迟等性能实验；需求-成本计算器；MQTT 与 HTTP 开销对比实验；ESP32 室外长测的服务器侧记录与分析；课程设计报告与答辩 PPT 的撰写制作。同时主导 GitHub 协作流程与项目进度推进。</w:t>
+        <w:t>我在本课程设计中负责软件侧与项目流程推进，是软件链路与“需求—成本”主线的主要实现者。具体贡献包括：完成需求分析与 MQTT 主题/消息格式设计；实现 PC 模拟节点（sim_node.py）与基于 Flask+SSE 的 Web 监控端（web_monitor.py），打通完整软件链路；建立“需求参数 → 网络负载 → 服务器最小配置 → 成本”的通用计算方法并实现需求-成本计算器；完成 MQTT 5.0 方案升级与三种消息格式、EMQX 选型；完成协议开销抓包、EMQX 容量与吞吐压测、QoS×丢包、跨公网延迟以及 MQTT 与 HTTP 开销对比等性能实验并校准模型系数；负责 ESP32 室外长测的服务器侧记录与分析；撰写课程设计报告并制作答辩 PPT。此外，我主导了 GitHub 协作流程与项目进度推进，把控每次 PR 的审查与合并。</w:t>
       </w:r>
     </w:p>
     <w:p>
@@ -2460,7 +2860,7 @@
         <w:spacing w:line="324" w:lineRule="auto"/>
       </w:pPr>
       <w:r>
-        <w:t>MQTT 发布/订阅、主题设计、QoS 与持久会话；TCP 的可靠传输与重传；Wireshark 抓包与协议开销分析；EMQX 部署、压测与系统调优；Flask + SSE 实时 Web；网络负载与服务器容量、成本建模；Git 分支协作与 Issue/PR 评审。</w:t>
+        <w:t>通过本课程设计，我较系统地掌握了：MQTT 的发布/订阅模型、主题设计与通配符匹配、QoS 三个等级与持久会话机制；TCP 的可靠传输与重传，以及它与应用层 QoS 的分工关系；用 Wireshark 抓包分析协议开销；EMQX 的部署、压测与系统调优（文件句柄、端口范围等）；Flask 与 SSE 构建实时 Web 应用；面向需求的网络负载、服务器容量与成本建模方法；以及 Git 分支开发、Issue 跟踪与 Pull Request 评审等工程协作技能。</w:t>
       </w:r>
     </w:p>
     <w:p>
@@ -2476,7 +2876,7 @@
         <w:spacing w:line="324" w:lineRule="auto"/>
       </w:pPr>
       <w:r>
-        <w:t>中期反馈要求“需求驱动、考虑成本”，据此建立通用计算模型与需求计算器；内存单一系数估算不准，补满负载爬坡实验改为双模型；QoS 与 TCP 的关系易混淆，用 QoS×丢包实验厘清 QoS 价值在断连；演示 Broker 一致性问题，统一改用本地 EMQX；光照数据异常，经比对定位为硬件端 I2C 接触不良并配合修复。</w:t>
+        <w:t>项目中遇到并解决了多个有代表性的问题：中期检查反馈要求“需求驱动、考虑成本”，据此我把项目重构为可计算的最小成本问题并实现需求计算器；内存用单一系数估算不准，补做满负载爬坡实验后改为空闲~满负载双模型；QoS 与 TCP 的关系容易混淆，通过 QoS×丢包实验厘清“抗丢包是 TCP 的事、QoS 价值在断连”；演示 Broker 一度在 Mosquitto 与 EMQX 间不一致，最终统一到本地 EMQX；光照数据异常则通过比对串口与订阅记录定位为硬件端 I2C 接触不良并配合修复。</w:t>
       </w:r>
     </w:p>
     <w:p>
@@ -2492,7 +2892,7 @@
         <w:spacing w:line="324" w:lineRule="auto"/>
       </w:pPr>
       <w:r>
-        <w:t>好的方案应由需求驱动、用实验量化、求一个有约束的最小成本，而非一味追求最强；软硬件采用同构接口、分层设计，并以完整的“需求—设计—实现—测试—分析”证据链支撑结论。</w:t>
+        <w:t>通过这次课程设计，我对“工程化的网络系统设计”有了更深的认识：好的方案应当由需求驱动、用实验数据量化、并在满足服务质量的约束下求最低成本，而不是一味追求最大并发或最强性能；系统应采用统一、解耦的接口（如软硬件节点同构接入）和清晰的分层结构，并以完整的“需求—设计—实现—测试—分析”证据链支撑每一个结论。工程判断的核心，往往是在多种约束之间做出合理的权衡。</w:t>
       </w:r>
     </w:p>
     <w:p>
@@ -2508,7 +2908,7 @@
         <w:spacing w:line="324" w:lineRule="auto"/>
       </w:pPr>
       <w:r>
-        <w:t>现场供网稳定性不足、下行带宽随订阅端数放大、缺少数据持久化与告警、Broker 尚未启用认证与加密、硬件可靠性与 OTA 维护等，均为后续可改进的方向。</w:t>
+        <w:t>本系统仍有不足：现场供网采用手机热点、稳定性不够，长测中出现过网络中断；下行带宽会随订阅端数量放大；尚未做数据库持久化与超限告警；Broker 目前为匿名连接、未启用认证与加密；硬件侧在传感器精度、供电与接线可靠性、室外部署与维护等方面也有约束。后续可从共享订阅降低下行放大、增加时序数据库与告警、为 Broker 启用 TLS 与账号/ACL、提升硬件可靠性与支持 OTA 等方向继续完善，使系统更接近可实际部署的水平。</w:t>
       </w:r>
     </w:p>
     <w:p>
@@ -2551,7 +2951,7 @@
       <w:tr>
         <w:tc>
           <w:tcPr>
-            <w:tcW w:type="dxa" w:w="1361"/>
+            <w:tcW w:type="dxa" w:w="1304"/>
           </w:tcPr>
           <w:p>
             <w:pPr>
@@ -2570,7 +2970,7 @@
         </w:tc>
         <w:tc>
           <w:tcPr>
-            <w:tcW w:type="dxa" w:w="2268"/>
+            <w:tcW w:type="dxa" w:w="2381"/>
           </w:tcPr>
           <w:p>
             <w:pPr>
@@ -2589,7 +2989,7 @@
         </w:tc>
         <w:tc>
           <w:tcPr>
-            <w:tcW w:type="dxa" w:w="2948"/>
+            <w:tcW w:type="dxa" w:w="2835"/>
           </w:tcPr>
           <w:p>
             <w:pPr>
@@ -2608,7 +3008,7 @@
         </w:tc>
         <w:tc>
           <w:tcPr>
-            <w:tcW w:type="dxa" w:w="907"/>
+            <w:tcW w:type="dxa" w:w="850"/>
           </w:tcPr>
           <w:p>
             <w:pPr>
@@ -2627,7 +3027,7 @@
         </w:tc>
         <w:tc>
           <w:tcPr>
-            <w:tcW w:type="dxa" w:w="1474"/>
+            <w:tcW w:type="dxa" w:w="1587"/>
           </w:tcPr>
           <w:p>
             <w:pPr>
@@ -2648,55 +3048,55 @@
       <w:tr>
         <w:tc>
           <w:tcPr>
-            <w:tcW w:type="dxa" w:w="1361"/>
-          </w:tcPr>
-          <w:p>
-            <w:r>
-              <w:rPr>
-                <w:rFonts w:ascii="Times New Roman" w:hAnsi="Times New Roman" w:eastAsia="宋体"/>
-                <w:b w:val="0"/>
-                <w:color w:val="000000"/>
-                <w:sz w:val="18"/>
-              </w:rPr>
-              <w:t>功能连通性</w:t>
-            </w:r>
-          </w:p>
-        </w:tc>
-        <w:tc>
-          <w:tcPr>
-            <w:tcW w:type="dxa" w:w="2268"/>
-          </w:tcPr>
-          <w:p>
-            <w:r>
-              <w:rPr>
-                <w:rFonts w:ascii="Times New Roman" w:hAnsi="Times New Roman" w:eastAsia="宋体"/>
-                <w:b w:val="0"/>
-                <w:color w:val="000000"/>
-                <w:sz w:val="18"/>
-              </w:rPr>
-              <w:t>双节点并发上传，按 seq 逐条对照</w:t>
-            </w:r>
-          </w:p>
-        </w:tc>
-        <w:tc>
-          <w:tcPr>
-            <w:tcW w:type="dxa" w:w="2948"/>
-          </w:tcPr>
-          <w:p>
-            <w:r>
-              <w:rPr>
-                <w:rFonts w:ascii="Times New Roman" w:hAnsi="Times New Roman" w:eastAsia="宋体"/>
-                <w:b w:val="0"/>
-                <w:color w:val="000000"/>
-                <w:sz w:val="18"/>
-              </w:rPr>
-              <w:t>到达率 100%（48/48），重连约 7 s，QoS 1 离线 12 条全部补发</w:t>
-            </w:r>
-          </w:p>
-        </w:tc>
-        <w:tc>
-          <w:tcPr>
-            <w:tcW w:type="dxa" w:w="907"/>
+            <w:tcW w:type="dxa" w:w="1304"/>
+          </w:tcPr>
+          <w:p>
+            <w:r>
+              <w:rPr>
+                <w:rFonts w:ascii="Times New Roman" w:hAnsi="Times New Roman" w:eastAsia="宋体"/>
+                <w:b w:val="0"/>
+                <w:color w:val="000000"/>
+                <w:sz w:val="18"/>
+              </w:rPr>
+              <w:t>功能与连通性</w:t>
+            </w:r>
+          </w:p>
+        </w:tc>
+        <w:tc>
+          <w:tcPr>
+            <w:tcW w:type="dxa" w:w="2381"/>
+          </w:tcPr>
+          <w:p>
+            <w:r>
+              <w:rPr>
+                <w:rFonts w:ascii="Times New Roman" w:hAnsi="Times New Roman" w:eastAsia="宋体"/>
+                <w:b w:val="0"/>
+                <w:color w:val="000000"/>
+                <w:sz w:val="18"/>
+              </w:rPr>
+              <w:t>双节点并发上传，监控端按序号 seq 与发送日志逐条对照统计</w:t>
+            </w:r>
+          </w:p>
+        </w:tc>
+        <w:tc>
+          <w:tcPr>
+            <w:tcW w:type="dxa" w:w="2835"/>
+          </w:tcPr>
+          <w:p>
+            <w:r>
+              <w:rPr>
+                <w:rFonts w:ascii="Times New Roman" w:hAnsi="Times New Roman" w:eastAsia="宋体"/>
+                <w:b w:val="0"/>
+                <w:color w:val="000000"/>
+                <w:sz w:val="18"/>
+              </w:rPr>
+              <w:t>到达率 100%（48/48），断网后约 7 s 自动重连，QoS 1 离线期间排队的 12 条消息重连后全部补发、零丢失</w:t>
+            </w:r>
+          </w:p>
+        </w:tc>
+        <w:tc>
+          <w:tcPr>
+            <w:tcW w:type="dxa" w:w="850"/>
           </w:tcPr>
           <w:p>
             <w:r>
@@ -2712,17 +3112,17 @@
         </w:tc>
         <w:tc>
           <w:tcPr>
-            <w:tcW w:type="dxa" w:w="1474"/>
-          </w:tcPr>
-          <w:p>
-            <w:r>
-              <w:rPr>
-                <w:rFonts w:ascii="Times New Roman" w:hAnsi="Times New Roman" w:eastAsia="宋体"/>
-                <w:b w:val="0"/>
-                <w:color w:val="000000"/>
-                <w:sz w:val="18"/>
-              </w:rPr>
-              <w:t>软件链路完整</w:t>
+            <w:tcW w:type="dxa" w:w="1587"/>
+          </w:tcPr>
+          <w:p>
+            <w:r>
+              <w:rPr>
+                <w:rFonts w:ascii="Times New Roman" w:hAnsi="Times New Roman" w:eastAsia="宋体"/>
+                <w:b w:val="0"/>
+                <w:color w:val="000000"/>
+                <w:sz w:val="18"/>
+              </w:rPr>
+              <w:t>软件链路完整，重连与补发机制有效</w:t>
             </w:r>
           </w:p>
         </w:tc>
@@ -2730,7 +3130,7 @@
       <w:tr>
         <w:tc>
           <w:tcPr>
-            <w:tcW w:type="dxa" w:w="1361"/>
+            <w:tcW w:type="dxa" w:w="1304"/>
           </w:tcPr>
           <w:p>
             <w:r>
@@ -2746,39 +3146,39 @@
         </w:tc>
         <w:tc>
           <w:tcPr>
-            <w:tcW w:type="dxa" w:w="2268"/>
-          </w:tcPr>
-          <w:p>
-            <w:r>
-              <w:rPr>
-                <w:rFonts w:ascii="Times New Roman" w:hAnsi="Times New Roman" w:eastAsia="宋体"/>
-                <w:b w:val="0"/>
-                <w:color w:val="000000"/>
-                <w:sz w:val="18"/>
-              </w:rPr>
-              <w:t>Wireshark 抓不同 QoS/格式/Alias/版本</w:t>
-            </w:r>
-          </w:p>
-        </w:tc>
-        <w:tc>
-          <w:tcPr>
-            <w:tcW w:type="dxa" w:w="2948"/>
-          </w:tcPr>
-          <w:p>
-            <w:r>
-              <w:rPr>
-                <w:rFonts w:ascii="Times New Roman" w:hAnsi="Times New Roman" w:eastAsia="宋体"/>
-                <w:b w:val="0"/>
-                <w:color w:val="000000"/>
-                <w:sz w:val="18"/>
-              </w:rPr>
-              <w:t>单条 json/json-min/msgpack = 261.9/203.0/185.9 B，Alias 每条省 21.3 B</w:t>
-            </w:r>
-          </w:p>
-        </w:tc>
-        <w:tc>
-          <w:tcPr>
-            <w:tcW w:type="dxa" w:w="907"/>
+            <w:tcW w:type="dxa" w:w="2381"/>
+          </w:tcPr>
+          <w:p>
+            <w:r>
+              <w:rPr>
+                <w:rFonts w:ascii="Times New Roman" w:hAnsi="Times New Roman" w:eastAsia="宋体"/>
+                <w:b w:val="0"/>
+                <w:color w:val="000000"/>
+                <w:sz w:val="18"/>
+              </w:rPr>
+              <w:t>用 Wireshark 抓取不同 QoS、消息格式、是否启用 Topic Alias 及协议版本下的报文并测单条总开销</w:t>
+            </w:r>
+          </w:p>
+        </w:tc>
+        <w:tc>
+          <w:tcPr>
+            <w:tcW w:type="dxa" w:w="2835"/>
+          </w:tcPr>
+          <w:p>
+            <w:r>
+              <w:rPr>
+                <w:rFonts w:ascii="Times New Roman" w:hAnsi="Times New Roman" w:eastAsia="宋体"/>
+                <w:b w:val="0"/>
+                <w:color w:val="000000"/>
+                <w:sz w:val="18"/>
+              </w:rPr>
+              <w:t>QoS1+Alias 下 json/json-min/msgpack 单条分别约 261.9/203.0/185.9 B；Topic Alias 每条省约 21.3 B；空闲心跳约 116 B</w:t>
+            </w:r>
+          </w:p>
+        </w:tc>
+        <w:tc>
+          <w:tcPr>
+            <w:tcW w:type="dxa" w:w="850"/>
           </w:tcPr>
           <w:p>
             <w:r>
@@ -2794,17 +3194,17 @@
         </w:tc>
         <w:tc>
           <w:tcPr>
-            <w:tcW w:type="dxa" w:w="1474"/>
-          </w:tcPr>
-          <w:p>
-            <w:r>
-              <w:rPr>
-                <w:rFonts w:ascii="Times New Roman" w:hAnsi="Times New Roman" w:eastAsia="宋体"/>
-                <w:b w:val="0"/>
-                <w:color w:val="000000"/>
-                <w:sz w:val="18"/>
-              </w:rPr>
-              <w:t>作为带宽系数</w:t>
+            <w:tcW w:type="dxa" w:w="1587"/>
+          </w:tcPr>
+          <w:p>
+            <w:r>
+              <w:rPr>
+                <w:rFonts w:ascii="Times New Roman" w:hAnsi="Times New Roman" w:eastAsia="宋体"/>
+                <w:b w:val="0"/>
+                <w:color w:val="000000"/>
+                <w:sz w:val="18"/>
+              </w:rPr>
+              <w:t>作为带宽与月流量计算的字节系数</w:t>
             </w:r>
           </w:p>
         </w:tc>
@@ -2812,7 +3212,7 @@
       <w:tr>
         <w:tc>
           <w:tcPr>
-            <w:tcW w:type="dxa" w:w="1361"/>
+            <w:tcW w:type="dxa" w:w="1304"/>
           </w:tcPr>
           <w:p>
             <w:r>
@@ -2828,39 +3228,39 @@
         </w:tc>
         <w:tc>
           <w:tcPr>
-            <w:tcW w:type="dxa" w:w="2268"/>
-          </w:tcPr>
-          <w:p>
-            <w:r>
-              <w:rPr>
-                <w:rFonts w:ascii="Times New Roman" w:hAnsi="Times New Roman" w:eastAsia="宋体"/>
-                <w:b w:val="0"/>
-                <w:color w:val="000000"/>
-                <w:sz w:val="18"/>
-              </w:rPr>
-              <w:t>连接爬坡至 5 万</w:t>
-            </w:r>
-          </w:p>
-        </w:tc>
-        <w:tc>
-          <w:tcPr>
-            <w:tcW w:type="dxa" w:w="2948"/>
-          </w:tcPr>
-          <w:p>
-            <w:r>
-              <w:rPr>
-                <w:rFonts w:ascii="Times New Roman" w:hAnsi="Times New Roman" w:eastAsia="宋体"/>
-                <w:b w:val="0"/>
-                <w:color w:val="000000"/>
-                <w:sz w:val="18"/>
-              </w:rPr>
-              <w:t>5 万连接约 1.05 GB（15.75 KB/连），满载 38.76 KB/连（2.46×）</w:t>
-            </w:r>
-          </w:p>
-        </w:tc>
-        <w:tc>
-          <w:tcPr>
-            <w:tcW w:type="dxa" w:w="907"/>
+            <w:tcW w:type="dxa" w:w="2381"/>
+          </w:tcPr>
+          <w:p>
+            <w:r>
+              <w:rPr>
+                <w:rFonts w:ascii="Times New Roman" w:hAnsi="Times New Roman" w:eastAsia="宋体"/>
+                <w:b w:val="0"/>
+                <w:color w:val="000000"/>
+                <w:sz w:val="18"/>
+              </w:rPr>
+              <w:t>在 8 核 32 GB 服务器上对 EMQX 做连接爬坡（加密至 10 档）</w:t>
+            </w:r>
+          </w:p>
+        </w:tc>
+        <w:tc>
+          <w:tcPr>
+            <w:tcW w:type="dxa" w:w="2835"/>
+          </w:tcPr>
+          <w:p>
+            <w:r>
+              <w:rPr>
+                <w:rFonts w:ascii="Times New Roman" w:hAnsi="Times New Roman" w:eastAsia="宋体"/>
+                <w:b w:val="0"/>
+                <w:color w:val="000000"/>
+                <w:sz w:val="18"/>
+              </w:rPr>
+              <w:t>5 万空闲连接约占 1.05 GB（约 15.75 KB/连接），满负载每连接约 38.76 KB（为空闲的 2.46 倍）</w:t>
+            </w:r>
+          </w:p>
+        </w:tc>
+        <w:tc>
+          <w:tcPr>
+            <w:tcW w:type="dxa" w:w="850"/>
           </w:tcPr>
           <w:p>
             <w:r>
@@ -2876,17 +3276,17 @@
         </w:tc>
         <w:tc>
           <w:tcPr>
-            <w:tcW w:type="dxa" w:w="1474"/>
-          </w:tcPr>
-          <w:p>
-            <w:r>
-              <w:rPr>
-                <w:rFonts w:ascii="Times New Roman" w:hAnsi="Times New Roman" w:eastAsia="宋体"/>
-                <w:b w:val="0"/>
-                <w:color w:val="000000"/>
-                <w:sz w:val="18"/>
-              </w:rPr>
-              <w:t>选型按满载上界</w:t>
+            <w:tcW w:type="dxa" w:w="1587"/>
+          </w:tcPr>
+          <w:p>
+            <w:r>
+              <w:rPr>
+                <w:rFonts w:ascii="Times New Roman" w:hAnsi="Times New Roman" w:eastAsia="宋体"/>
+                <w:b w:val="0"/>
+                <w:color w:val="000000"/>
+                <w:sz w:val="18"/>
+              </w:rPr>
+              <w:t>选型须按满负载上界，故计算器采用双模型</w:t>
             </w:r>
           </w:p>
         </w:tc>
@@ -2894,7 +3294,7 @@
       <w:tr>
         <w:tc>
           <w:tcPr>
-            <w:tcW w:type="dxa" w:w="1361"/>
+            <w:tcW w:type="dxa" w:w="1304"/>
           </w:tcPr>
           <w:p>
             <w:r>
@@ -2910,39 +3310,39 @@
         </w:tc>
         <w:tc>
           <w:tcPr>
-            <w:tcW w:type="dxa" w:w="2268"/>
-          </w:tcPr>
-          <w:p>
-            <w:r>
-              <w:rPr>
-                <w:rFonts w:ascii="Times New Roman" w:hAnsi="Times New Roman" w:eastAsia="宋体"/>
-                <w:b w:val="0"/>
-                <w:color w:val="000000"/>
-                <w:sz w:val="18"/>
-              </w:rPr>
-              <w:t>消息吞吐压测</w:t>
-            </w:r>
-          </w:p>
-        </w:tc>
-        <w:tc>
-          <w:tcPr>
-            <w:tcW w:type="dxa" w:w="2948"/>
-          </w:tcPr>
-          <w:p>
-            <w:r>
-              <w:rPr>
-                <w:rFonts w:ascii="Times New Roman" w:hAnsi="Times New Roman" w:eastAsia="宋体"/>
-                <w:b w:val="0"/>
-                <w:color w:val="000000"/>
-                <w:sz w:val="18"/>
-              </w:rPr>
-              <w:t>5 万条/秒约 3.2 核（约 1.9 万条/核·秒）</w:t>
-            </w:r>
-          </w:p>
-        </w:tc>
-        <w:tc>
-          <w:tcPr>
-            <w:tcW w:type="dxa" w:w="907"/>
+            <w:tcW w:type="dxa" w:w="2381"/>
+          </w:tcPr>
+          <w:p>
+            <w:r>
+              <w:rPr>
+                <w:rFonts w:ascii="Times New Roman" w:hAnsi="Times New Roman" w:eastAsia="宋体"/>
+                <w:b w:val="0"/>
+                <w:color w:val="000000"/>
+                <w:sz w:val="18"/>
+              </w:rPr>
+              <w:t>对 EMQX 施加大消息速率并观察 CPU 占用</w:t>
+            </w:r>
+          </w:p>
+        </w:tc>
+        <w:tc>
+          <w:tcPr>
+            <w:tcW w:type="dxa" w:w="2835"/>
+          </w:tcPr>
+          <w:p>
+            <w:r>
+              <w:rPr>
+                <w:rFonts w:ascii="Times New Roman" w:hAnsi="Times New Roman" w:eastAsia="宋体"/>
+                <w:b w:val="0"/>
+                <w:color w:val="000000"/>
+                <w:sz w:val="18"/>
+              </w:rPr>
+              <w:t>处理 5 万条/秒约需 3.2 个核（约每核每秒 1.9 万条）</w:t>
+            </w:r>
+          </w:p>
+        </w:tc>
+        <w:tc>
+          <w:tcPr>
+            <w:tcW w:type="dxa" w:w="850"/>
           </w:tcPr>
           <w:p>
             <w:r>
@@ -2958,17 +3358,17 @@
         </w:tc>
         <w:tc>
           <w:tcPr>
-            <w:tcW w:type="dxa" w:w="1474"/>
-          </w:tcPr>
-          <w:p>
-            <w:r>
-              <w:rPr>
-                <w:rFonts w:ascii="Times New Roman" w:hAnsi="Times New Roman" w:eastAsia="宋体"/>
-                <w:b w:val="0"/>
-                <w:color w:val="000000"/>
-                <w:sz w:val="18"/>
-              </w:rPr>
-              <w:t>对照 amqtt 千级即单核饱和</w:t>
+            <w:tcW w:type="dxa" w:w="1587"/>
+          </w:tcPr>
+          <w:p>
+            <w:r>
+              <w:rPr>
+                <w:rFonts w:ascii="Times New Roman" w:hAnsi="Times New Roman" w:eastAsia="宋体"/>
+                <w:b w:val="0"/>
+                <w:color w:val="000000"/>
+                <w:sz w:val="18"/>
+              </w:rPr>
+              <w:t>对照 amqtt 千级连接即单核饱和</w:t>
             </w:r>
           </w:p>
         </w:tc>
@@ -2976,55 +3376,55 @@
       <w:tr>
         <w:tc>
           <w:tcPr>
-            <w:tcW w:type="dxa" w:w="1361"/>
-          </w:tcPr>
-          <w:p>
-            <w:r>
-              <w:rPr>
-                <w:rFonts w:ascii="Times New Roman" w:hAnsi="Times New Roman" w:eastAsia="宋体"/>
-                <w:b w:val="0"/>
-                <w:color w:val="000000"/>
-                <w:sz w:val="18"/>
-              </w:rPr>
-              <w:t>QoS × 丢包</w:t>
-            </w:r>
-          </w:p>
-        </w:tc>
-        <w:tc>
-          <w:tcPr>
-            <w:tcW w:type="dxa" w:w="2268"/>
-          </w:tcPr>
-          <w:p>
-            <w:r>
-              <w:rPr>
-                <w:rFonts w:ascii="Times New Roman" w:hAnsi="Times New Roman" w:eastAsia="宋体"/>
-                <w:b w:val="0"/>
-                <w:color w:val="000000"/>
-                <w:sz w:val="18"/>
-              </w:rPr>
-              <w:t>0–15% 人为丢包测三种 QoS</w:t>
-            </w:r>
-          </w:p>
-        </w:tc>
-        <w:tc>
-          <w:tcPr>
-            <w:tcW w:type="dxa" w:w="2948"/>
-          </w:tcPr>
-          <w:p>
-            <w:r>
-              <w:rPr>
-                <w:rFonts w:ascii="Times New Roman" w:hAnsi="Times New Roman" w:eastAsia="宋体"/>
-                <w:b w:val="0"/>
-                <w:color w:val="000000"/>
-                <w:sz w:val="18"/>
-              </w:rPr>
-              <w:t>三种 QoS 到达率均 100%（TCP 重传），延迟随丢包率上升</w:t>
-            </w:r>
-          </w:p>
-        </w:tc>
-        <w:tc>
-          <w:tcPr>
-            <w:tcW w:type="dxa" w:w="907"/>
+            <w:tcW w:type="dxa" w:w="1304"/>
+          </w:tcPr>
+          <w:p>
+            <w:r>
+              <w:rPr>
+                <w:rFonts w:ascii="Times New Roman" w:hAnsi="Times New Roman" w:eastAsia="宋体"/>
+                <w:b w:val="0"/>
+                <w:color w:val="000000"/>
+                <w:sz w:val="18"/>
+              </w:rPr>
+              <w:t>QoS×丢包</w:t>
+            </w:r>
+          </w:p>
+        </w:tc>
+        <w:tc>
+          <w:tcPr>
+            <w:tcW w:type="dxa" w:w="2381"/>
+          </w:tcPr>
+          <w:p>
+            <w:r>
+              <w:rPr>
+                <w:rFonts w:ascii="Times New Roman" w:hAnsi="Times New Roman" w:eastAsia="宋体"/>
+                <w:b w:val="0"/>
+                <w:color w:val="000000"/>
+                <w:sz w:val="18"/>
+              </w:rPr>
+              <w:t>在 0~15% 人为丢包下分别测 QoS 0/1/2 的到达率与延迟</w:t>
+            </w:r>
+          </w:p>
+        </w:tc>
+        <w:tc>
+          <w:tcPr>
+            <w:tcW w:type="dxa" w:w="2835"/>
+          </w:tcPr>
+          <w:p>
+            <w:r>
+              <w:rPr>
+                <w:rFonts w:ascii="Times New Roman" w:hAnsi="Times New Roman" w:eastAsia="宋体"/>
+                <w:b w:val="0"/>
+                <w:color w:val="000000"/>
+                <w:sz w:val="18"/>
+              </w:rPr>
+              <w:t>三种 QoS 应用层到达率均保持 100%（TCP 重传兜底），代价是延迟随丢包率上升</w:t>
+            </w:r>
+          </w:p>
+        </w:tc>
+        <w:tc>
+          <w:tcPr>
+            <w:tcW w:type="dxa" w:w="850"/>
           </w:tcPr>
           <w:p>
             <w:r>
@@ -3040,17 +3440,17 @@
         </w:tc>
         <w:tc>
           <w:tcPr>
-            <w:tcW w:type="dxa" w:w="1474"/>
-          </w:tcPr>
-          <w:p>
-            <w:r>
-              <w:rPr>
-                <w:rFonts w:ascii="Times New Roman" w:hAnsi="Times New Roman" w:eastAsia="宋体"/>
-                <w:b w:val="0"/>
-                <w:color w:val="000000"/>
-                <w:sz w:val="18"/>
-              </w:rPr>
-              <w:t>QoS 价值在断连</w:t>
+            <w:tcW w:type="dxa" w:w="1587"/>
+          </w:tcPr>
+          <w:p>
+            <w:r>
+              <w:rPr>
+                <w:rFonts w:ascii="Times New Roman" w:hAnsi="Times New Roman" w:eastAsia="宋体"/>
+                <w:b w:val="0"/>
+                <w:color w:val="000000"/>
+                <w:sz w:val="18"/>
+              </w:rPr>
+              <w:t>说明抗丢包是 TCP 的事，QoS 价值在断连场景</w:t>
             </w:r>
           </w:p>
         </w:tc>
@@ -3058,7 +3458,7 @@
       <w:tr>
         <w:tc>
           <w:tcPr>
-            <w:tcW w:type="dxa" w:w="1361"/>
+            <w:tcW w:type="dxa" w:w="1304"/>
           </w:tcPr>
           <w:p>
             <w:r>
@@ -3074,39 +3474,39 @@
         </w:tc>
         <w:tc>
           <w:tcPr>
-            <w:tcW w:type="dxa" w:w="2268"/>
-          </w:tcPr>
-          <w:p>
-            <w:r>
-              <w:rPr>
-                <w:rFonts w:ascii="Times New Roman" w:hAnsi="Times New Roman" w:eastAsia="宋体"/>
-                <w:b w:val="0"/>
-                <w:color w:val="000000"/>
-                <w:sz w:val="18"/>
-              </w:rPr>
-              <w:t>节点经公网发布、监控端订阅</w:t>
-            </w:r>
-          </w:p>
-        </w:tc>
-        <w:tc>
-          <w:tcPr>
-            <w:tcW w:type="dxa" w:w="2948"/>
-          </w:tcPr>
-          <w:p>
-            <w:r>
-              <w:rPr>
-                <w:rFonts w:ascii="Times New Roman" w:hAnsi="Times New Roman" w:eastAsia="宋体"/>
-                <w:b w:val="0"/>
-                <w:color w:val="000000"/>
-                <w:sz w:val="18"/>
-              </w:rPr>
-              <w:t>平均 44.7 ms、到达率 100%、断线重连 5.2 s</w:t>
-            </w:r>
-          </w:p>
-        </w:tc>
-        <w:tc>
-          <w:tcPr>
-            <w:tcW w:type="dxa" w:w="907"/>
+            <w:tcW w:type="dxa" w:w="2381"/>
+          </w:tcPr>
+          <w:p>
+            <w:r>
+              <w:rPr>
+                <w:rFonts w:ascii="Times New Roman" w:hAnsi="Times New Roman" w:eastAsia="宋体"/>
+                <w:b w:val="0"/>
+                <w:color w:val="000000"/>
+                <w:sz w:val="18"/>
+              </w:rPr>
+              <w:t>节点经公网向云端 EMQX 发布、监控端订阅，统计端到端延迟</w:t>
+            </w:r>
+          </w:p>
+        </w:tc>
+        <w:tc>
+          <w:tcPr>
+            <w:tcW w:type="dxa" w:w="2835"/>
+          </w:tcPr>
+          <w:p>
+            <w:r>
+              <w:rPr>
+                <w:rFonts w:ascii="Times New Roman" w:hAnsi="Times New Roman" w:eastAsia="宋体"/>
+                <w:b w:val="0"/>
+                <w:color w:val="000000"/>
+                <w:sz w:val="18"/>
+              </w:rPr>
+              <w:t>平均约 44.7 ms、到达率 100%，断线重连约 5.2 s</w:t>
+            </w:r>
+          </w:p>
+        </w:tc>
+        <w:tc>
+          <w:tcPr>
+            <w:tcW w:type="dxa" w:w="850"/>
           </w:tcPr>
           <w:p>
             <w:r>
@@ -3122,17 +3522,17 @@
         </w:tc>
         <w:tc>
           <w:tcPr>
-            <w:tcW w:type="dxa" w:w="1474"/>
-          </w:tcPr>
-          <w:p>
-            <w:r>
-              <w:rPr>
-                <w:rFonts w:ascii="Times New Roman" w:hAnsi="Times New Roman" w:eastAsia="宋体"/>
-                <w:b w:val="0"/>
-                <w:color w:val="000000"/>
-                <w:sz w:val="18"/>
-              </w:rPr>
-              <w:t>满足 ≤ 1 s</w:t>
+            <w:tcW w:type="dxa" w:w="1587"/>
+          </w:tcPr>
+          <w:p>
+            <w:r>
+              <w:rPr>
+                <w:rFonts w:ascii="Times New Roman" w:hAnsi="Times New Roman" w:eastAsia="宋体"/>
+                <w:b w:val="0"/>
+                <w:color w:val="000000"/>
+                <w:sz w:val="18"/>
+              </w:rPr>
+              <w:t>远优于 ≤ 1 s 的延迟指标</w:t>
             </w:r>
           </w:p>
         </w:tc>
@@ -3140,7 +3540,7 @@
       <w:tr>
         <w:tc>
           <w:tcPr>
-            <w:tcW w:type="dxa" w:w="1361"/>
+            <w:tcW w:type="dxa" w:w="1304"/>
           </w:tcPr>
           <w:p>
             <w:r>
@@ -3156,39 +3556,39 @@
         </w:tc>
         <w:tc>
           <w:tcPr>
-            <w:tcW w:type="dxa" w:w="2268"/>
-          </w:tcPr>
-          <w:p>
-            <w:r>
-              <w:rPr>
-                <w:rFonts w:ascii="Times New Roman" w:hAnsi="Times New Roman" w:eastAsia="宋体"/>
-                <w:b w:val="0"/>
-                <w:color w:val="000000"/>
-                <w:sz w:val="18"/>
-              </w:rPr>
-              <w:t>2 万连接、30 分钟、10 路转发</w:t>
-            </w:r>
-          </w:p>
-        </w:tc>
-        <w:tc>
-          <w:tcPr>
-            <w:tcW w:type="dxa" w:w="2948"/>
-          </w:tcPr>
-          <w:p>
-            <w:r>
-              <w:rPr>
-                <w:rFonts w:ascii="Times New Roman" w:hAnsi="Times New Roman" w:eastAsia="宋体"/>
-                <w:b w:val="0"/>
-                <w:color w:val="000000"/>
-                <w:sz w:val="18"/>
-              </w:rPr>
-              <w:t>连接零掉线，转发送达 99.96%，CPU 约 1.1 核、内存约 1.5 GB</w:t>
-            </w:r>
-          </w:p>
-        </w:tc>
-        <w:tc>
-          <w:tcPr>
-            <w:tcW w:type="dxa" w:w="907"/>
+            <w:tcW w:type="dxa" w:w="2381"/>
+          </w:tcPr>
+          <w:p>
+            <w:r>
+              <w:rPr>
+                <w:rFonts w:ascii="Times New Roman" w:hAnsi="Times New Roman" w:eastAsia="宋体"/>
+                <w:b w:val="0"/>
+                <w:color w:val="000000"/>
+                <w:sz w:val="18"/>
+              </w:rPr>
+              <w:t>以 2 万连接、每连接每 15 s 一条、10 路订阅全量转发，持续运行 30 分钟</w:t>
+            </w:r>
+          </w:p>
+        </w:tc>
+        <w:tc>
+          <w:tcPr>
+            <w:tcW w:type="dxa" w:w="2835"/>
+          </w:tcPr>
+          <w:p>
+            <w:r>
+              <w:rPr>
+                <w:rFonts w:ascii="Times New Roman" w:hAnsi="Times New Roman" w:eastAsia="宋体"/>
+                <w:b w:val="0"/>
+                <w:color w:val="000000"/>
+                <w:sz w:val="18"/>
+              </w:rPr>
+              <w:t>TCP 连接全程零掉线，转发送达 99.96%，EMQX 进程 CPU 约 1.1 核、内存约 1.5 GB</w:t>
+            </w:r>
+          </w:p>
+        </w:tc>
+        <w:tc>
+          <w:tcPr>
+            <w:tcW w:type="dxa" w:w="850"/>
           </w:tcPr>
           <w:p>
             <w:r>
@@ -3204,17 +3604,17 @@
         </w:tc>
         <w:tc>
           <w:tcPr>
-            <w:tcW w:type="dxa" w:w="1474"/>
-          </w:tcPr>
-          <w:p>
-            <w:r>
-              <w:rPr>
-                <w:rFonts w:ascii="Times New Roman" w:hAnsi="Times New Roman" w:eastAsia="宋体"/>
-                <w:b w:val="0"/>
-                <w:color w:val="000000"/>
-                <w:sz w:val="18"/>
-              </w:rPr>
-              <w:t>与计算器预测吻合</w:t>
+            <w:tcW w:type="dxa" w:w="1587"/>
+          </w:tcPr>
+          <w:p>
+            <w:r>
+              <w:rPr>
+                <w:rFonts w:ascii="Times New Roman" w:hAnsi="Times New Roman" w:eastAsia="宋体"/>
+                <w:b w:val="0"/>
+                <w:color w:val="000000"/>
+                <w:sz w:val="18"/>
+              </w:rPr>
+              <w:t>与计算器对同等规模的配置预测吻合</w:t>
             </w:r>
           </w:p>
         </w:tc>
@@ -3222,7 +3622,7 @@
       <w:tr>
         <w:tc>
           <w:tcPr>
-            <w:tcW w:type="dxa" w:w="1361"/>
+            <w:tcW w:type="dxa" w:w="1304"/>
           </w:tcPr>
           <w:p>
             <w:r>
@@ -3238,39 +3638,39 @@
         </w:tc>
         <w:tc>
           <w:tcPr>
-            <w:tcW w:type="dxa" w:w="2268"/>
-          </w:tcPr>
-          <w:p>
-            <w:r>
-              <w:rPr>
-                <w:rFonts w:ascii="Times New Roman" w:hAnsi="Times New Roman" w:eastAsia="宋体"/>
-                <w:b w:val="0"/>
-                <w:color w:val="000000"/>
-                <w:sz w:val="18"/>
-              </w:rPr>
-              <w:t>同一条数据逐字节对比</w:t>
-            </w:r>
-          </w:p>
-        </w:tc>
-        <w:tc>
-          <w:tcPr>
-            <w:tcW w:type="dxa" w:w="2948"/>
-          </w:tcPr>
-          <w:p>
-            <w:r>
-              <w:rPr>
-                <w:rFonts w:ascii="Times New Roman" w:hAnsi="Times New Roman" w:eastAsia="宋体"/>
-                <w:b w:val="0"/>
-                <w:color w:val="000000"/>
-                <w:sz w:val="18"/>
-              </w:rPr>
-              <w:t>MQTT 比 HTTP 省 65%~77%，协议头约为其 1/8</w:t>
-            </w:r>
-          </w:p>
-        </w:tc>
-        <w:tc>
-          <w:tcPr>
-            <w:tcW w:type="dxa" w:w="907"/>
+            <w:tcW w:type="dxa" w:w="2381"/>
+          </w:tcPr>
+          <w:p>
+            <w:r>
+              <w:rPr>
+                <w:rFonts w:ascii="Times New Roman" w:hAnsi="Times New Roman" w:eastAsia="宋体"/>
+                <w:b w:val="0"/>
+                <w:color w:val="000000"/>
+                <w:sz w:val="18"/>
+              </w:rPr>
+              <w:t>同一条数据分别经 MQTT 发布与 HTTP POST 上传，逐字节对比应用层开销（各 200 次）</w:t>
+            </w:r>
+          </w:p>
+        </w:tc>
+        <w:tc>
+          <w:tcPr>
+            <w:tcW w:type="dxa" w:w="2835"/>
+          </w:tcPr>
+          <w:p>
+            <w:r>
+              <w:rPr>
+                <w:rFonts w:ascii="Times New Roman" w:hAnsi="Times New Roman" w:eastAsia="宋体"/>
+                <w:b w:val="0"/>
+                <w:color w:val="000000"/>
+                <w:sz w:val="18"/>
+              </w:rPr>
+              <w:t>MQTT 比 HTTP 节省 65%~77%，协议头开销约为其 1/8，payload 越小越省</w:t>
+            </w:r>
+          </w:p>
+        </w:tc>
+        <w:tc>
+          <w:tcPr>
+            <w:tcW w:type="dxa" w:w="850"/>
           </w:tcPr>
           <w:p>
             <w:r>
@@ -3286,17 +3686,17 @@
         </w:tc>
         <w:tc>
           <w:tcPr>
-            <w:tcW w:type="dxa" w:w="1474"/>
-          </w:tcPr>
-          <w:p>
-            <w:r>
-              <w:rPr>
-                <w:rFonts w:ascii="Times New Roman" w:hAnsi="Times New Roman" w:eastAsia="宋体"/>
-                <w:b w:val="0"/>
-                <w:color w:val="000000"/>
-                <w:sz w:val="18"/>
-              </w:rPr>
-              <w:t>支撑协议选型</w:t>
+            <w:tcW w:type="dxa" w:w="1587"/>
+          </w:tcPr>
+          <w:p>
+            <w:r>
+              <w:rPr>
+                <w:rFonts w:ascii="Times New Roman" w:hAnsi="Times New Roman" w:eastAsia="宋体"/>
+                <w:b w:val="0"/>
+                <w:color w:val="000000"/>
+                <w:sz w:val="18"/>
+              </w:rPr>
+              <w:t>为选用 MQTT 提供量化依据</w:t>
             </w:r>
           </w:p>
         </w:tc>
@@ -3338,7 +3738,7 @@
       <w:tr>
         <w:tc>
           <w:tcPr>
-            <w:tcW w:type="dxa" w:w="1474"/>
+            <w:tcW w:type="dxa" w:w="1361"/>
           </w:tcPr>
           <w:p>
             <w:pPr>
@@ -3357,7 +3757,7 @@
         </w:tc>
         <w:tc>
           <w:tcPr>
-            <w:tcW w:type="dxa" w:w="2608"/>
+            <w:tcW w:type="dxa" w:w="2494"/>
           </w:tcPr>
           <w:p>
             <w:pPr>
@@ -3376,7 +3776,7 @@
         </w:tc>
         <w:tc>
           <w:tcPr>
-            <w:tcW w:type="dxa" w:w="2494"/>
+            <w:tcW w:type="dxa" w:w="2381"/>
           </w:tcPr>
           <w:p>
             <w:pPr>
@@ -3395,7 +3795,7 @@
         </w:tc>
         <w:tc>
           <w:tcPr>
-            <w:tcW w:type="dxa" w:w="2381"/>
+            <w:tcW w:type="dxa" w:w="2721"/>
           </w:tcPr>
           <w:p>
             <w:pPr>
@@ -3416,7 +3816,7 @@
       <w:tr>
         <w:tc>
           <w:tcPr>
-            <w:tcW w:type="dxa" w:w="1474"/>
+            <w:tcW w:type="dxa" w:w="1361"/>
           </w:tcPr>
           <w:p>
             <w:r>
@@ -3432,22 +3832,6 @@
         </w:tc>
         <w:tc>
           <w:tcPr>
-            <w:tcW w:type="dxa" w:w="2608"/>
-          </w:tcPr>
-          <w:p>
-            <w:r>
-              <w:rPr>
-                <w:rFonts w:ascii="Times New Roman" w:hAnsi="Times New Roman" w:eastAsia="宋体"/>
-                <w:b w:val="0"/>
-                <w:color w:val="000000"/>
-                <w:sz w:val="18"/>
-              </w:rPr>
-              <w:t>按 seq 逐条统计实收/应收</w:t>
-            </w:r>
-          </w:p>
-        </w:tc>
-        <w:tc>
-          <w:tcPr>
             <w:tcW w:type="dxa" w:w="2494"/>
           </w:tcPr>
           <w:p>
@@ -3458,7 +3842,7 @@
                 <w:color w:val="000000"/>
                 <w:sz w:val="18"/>
               </w:rPr>
-              <w:t>功能测试 100%，ESP32 真机 15 h 为 95.0%</w:t>
+              <w:t>按消息序号 seq 逐条统计实收/应收</w:t>
             </w:r>
           </w:p>
         </w:tc>
@@ -3474,7 +3858,23 @@
                 <w:color w:val="000000"/>
                 <w:sz w:val="18"/>
               </w:rPr>
-              <w:t>网络短时中断计入仍达标（≥ 95%）</w:t>
+              <w:t>功能测试 100%，ESP32 真机 15 h 整体 95.0%</w:t>
+            </w:r>
+          </w:p>
+        </w:tc>
+        <w:tc>
+          <w:tcPr>
+            <w:tcW w:type="dxa" w:w="2721"/>
+          </w:tcPr>
+          <w:p>
+            <w:r>
+              <w:rPr>
+                <w:rFonts w:ascii="Times New Roman" w:hAnsi="Times New Roman" w:eastAsia="宋体"/>
+                <w:b w:val="0"/>
+                <w:color w:val="000000"/>
+                <w:sz w:val="18"/>
+              </w:rPr>
+              <w:t>网络短时中断计入后仍达标（≥ 95%），系统靠 QoS1+重连扛住中断</w:t>
             </w:r>
           </w:p>
         </w:tc>
@@ -3482,7 +3882,7 @@
       <w:tr>
         <w:tc>
           <w:tcPr>
-            <w:tcW w:type="dxa" w:w="1474"/>
+            <w:tcW w:type="dxa" w:w="1361"/>
           </w:tcPr>
           <w:p>
             <w:r>
@@ -3498,22 +3898,6 @@
         </w:tc>
         <w:tc>
           <w:tcPr>
-            <w:tcW w:type="dxa" w:w="2608"/>
-          </w:tcPr>
-          <w:p>
-            <w:r>
-              <w:rPr>
-                <w:rFonts w:ascii="Times New Roman" w:hAnsi="Times New Roman" w:eastAsia="宋体"/>
-                <w:b w:val="0"/>
-                <w:color w:val="000000"/>
-                <w:sz w:val="18"/>
-              </w:rPr>
-              <w:t>跨公网 MQTT 发布/订阅</w:t>
-            </w:r>
-          </w:p>
-        </w:tc>
-        <w:tc>
-          <w:tcPr>
             <w:tcW w:type="dxa" w:w="2494"/>
           </w:tcPr>
           <w:p>
@@ -3524,7 +3908,7 @@
                 <w:color w:val="000000"/>
                 <w:sz w:val="18"/>
               </w:rPr>
-              <w:t>平均 44.7 ms（P95 约 85 ms）</w:t>
+              <w:t>跨公网 MQTT 发布/订阅，统计端到端时间</w:t>
             </w:r>
           </w:p>
         </w:tc>
@@ -3540,7 +3924,23 @@
                 <w:color w:val="000000"/>
                 <w:sz w:val="18"/>
               </w:rPr>
-              <w:t>远优于 ≤ 1 s，适合环境监测</w:t>
+              <w:t>平均约 44.7 ms（P95 约 85 ms）</w:t>
+            </w:r>
+          </w:p>
+        </w:tc>
+        <w:tc>
+          <w:tcPr>
+            <w:tcW w:type="dxa" w:w="2721"/>
+          </w:tcPr>
+          <w:p>
+            <w:r>
+              <w:rPr>
+                <w:rFonts w:ascii="Times New Roman" w:hAnsi="Times New Roman" w:eastAsia="宋体"/>
+                <w:b w:val="0"/>
+                <w:color w:val="000000"/>
+                <w:sz w:val="18"/>
+              </w:rPr>
+              <w:t>远优于 ≤ 1 s，发布/订阅方式适合秒级周期的环境监测</w:t>
             </w:r>
           </w:p>
         </w:tc>
@@ -3548,7 +3948,7 @@
       <w:tr>
         <w:tc>
           <w:tcPr>
-            <w:tcW w:type="dxa" w:w="1474"/>
+            <w:tcW w:type="dxa" w:w="1361"/>
           </w:tcPr>
           <w:p>
             <w:r>
@@ -3564,22 +3964,6 @@
         </w:tc>
         <w:tc>
           <w:tcPr>
-            <w:tcW w:type="dxa" w:w="2608"/>
-          </w:tcPr>
-          <w:p>
-            <w:r>
-              <w:rPr>
-                <w:rFonts w:ascii="Times New Roman" w:hAnsi="Times New Roman" w:eastAsia="宋体"/>
-                <w:b w:val="0"/>
-                <w:color w:val="000000"/>
-                <w:sz w:val="18"/>
-              </w:rPr>
-              <w:t>断网后自动恢复并续传</w:t>
-            </w:r>
-          </w:p>
-        </w:tc>
-        <w:tc>
-          <w:tcPr>
             <w:tcW w:type="dxa" w:w="2494"/>
           </w:tcPr>
           <w:p>
@@ -3590,23 +3974,39 @@
                 <w:color w:val="000000"/>
                 <w:sz w:val="18"/>
               </w:rPr>
+              <w:t>断开网络后恢复，记录自动重连并续传的时间</w:t>
+            </w:r>
+          </w:p>
+        </w:tc>
+        <w:tc>
+          <w:tcPr>
+            <w:tcW w:type="dxa" w:w="2381"/>
+          </w:tcPr>
+          <w:p>
+            <w:r>
+              <w:rPr>
+                <w:rFonts w:ascii="Times New Roman" w:hAnsi="Times New Roman" w:eastAsia="宋体"/>
+                <w:b w:val="0"/>
+                <w:color w:val="000000"/>
+                <w:sz w:val="18"/>
+              </w:rPr>
               <w:t>EMQX 约 5.2 s，节点功能测试约 7 s</w:t>
             </w:r>
           </w:p>
         </w:tc>
         <w:tc>
           <w:tcPr>
-            <w:tcW w:type="dxa" w:w="2381"/>
-          </w:tcPr>
-          <w:p>
-            <w:r>
-              <w:rPr>
-                <w:rFonts w:ascii="Times New Roman" w:hAnsi="Times New Roman" w:eastAsia="宋体"/>
-                <w:b w:val="0"/>
-                <w:color w:val="000000"/>
-                <w:sz w:val="18"/>
-              </w:rPr>
-              <w:t>满足 ≤ 10 s</w:t>
+            <w:tcW w:type="dxa" w:w="2721"/>
+          </w:tcPr>
+          <w:p>
+            <w:r>
+              <w:rPr>
+                <w:rFonts w:ascii="Times New Roman" w:hAnsi="Times New Roman" w:eastAsia="宋体"/>
+                <w:b w:val="0"/>
+                <w:color w:val="000000"/>
+                <w:sz w:val="18"/>
+              </w:rPr>
+              <w:t>满足 ≤ 10 s，重连后离线消息可补发</w:t>
             </w:r>
           </w:p>
         </w:tc>
@@ -3614,7 +4014,7 @@
       <w:tr>
         <w:tc>
           <w:tcPr>
-            <w:tcW w:type="dxa" w:w="1474"/>
+            <w:tcW w:type="dxa" w:w="1361"/>
           </w:tcPr>
           <w:p>
             <w:r>
@@ -3630,22 +4030,6 @@
         </w:tc>
         <w:tc>
           <w:tcPr>
-            <w:tcW w:type="dxa" w:w="2608"/>
-          </w:tcPr>
-          <w:p>
-            <w:r>
-              <w:rPr>
-                <w:rFonts w:ascii="Times New Roman" w:hAnsi="Times New Roman" w:eastAsia="宋体"/>
-                <w:b w:val="0"/>
-                <w:color w:val="000000"/>
-                <w:sz w:val="18"/>
-              </w:rPr>
-              <w:t>EMQX 连接爬坡</w:t>
-            </w:r>
-          </w:p>
-        </w:tc>
-        <w:tc>
-          <w:tcPr>
             <w:tcW w:type="dxa" w:w="2494"/>
           </w:tcPr>
           <w:p>
@@ -3656,7 +4040,7 @@
                 <w:color w:val="000000"/>
                 <w:sz w:val="18"/>
               </w:rPr>
-              <w:t>5 万连接约 1 GB 内存，远未触顶</w:t>
+              <w:t>EMQX 连接爬坡至 5 万连接</w:t>
             </w:r>
           </w:p>
         </w:tc>
@@ -3672,7 +4056,23 @@
                 <w:color w:val="000000"/>
                 <w:sz w:val="18"/>
               </w:rPr>
-              <w:t>万级场景余量大，可横向扩展</w:t>
+              <w:t>5 万连接约占 1 GB 内存，远未触顶</w:t>
+            </w:r>
+          </w:p>
+        </w:tc>
+        <w:tc>
+          <w:tcPr>
+            <w:tcW w:type="dxa" w:w="2721"/>
+          </w:tcPr>
+          <w:p>
+            <w:r>
+              <w:rPr>
+                <w:rFonts w:ascii="Times New Roman" w:hAnsi="Times New Roman" w:eastAsia="宋体"/>
+                <w:b w:val="0"/>
+                <w:color w:val="000000"/>
+                <w:sz w:val="18"/>
+              </w:rPr>
+              <w:t>万级场景余量很大，规模再增可横向集群扩展</w:t>
             </w:r>
           </w:p>
         </w:tc>
@@ -3680,7 +4080,7 @@
       <w:tr>
         <w:tc>
           <w:tcPr>
-            <w:tcW w:type="dxa" w:w="1474"/>
+            <w:tcW w:type="dxa" w:w="1361"/>
           </w:tcPr>
           <w:p>
             <w:r>
@@ -3696,22 +4096,6 @@
         </w:tc>
         <w:tc>
           <w:tcPr>
-            <w:tcW w:type="dxa" w:w="2608"/>
-          </w:tcPr>
-          <w:p>
-            <w:r>
-              <w:rPr>
-                <w:rFonts w:ascii="Times New Roman" w:hAnsi="Times New Roman" w:eastAsia="宋体"/>
-                <w:b w:val="0"/>
-                <w:color w:val="000000"/>
-                <w:sz w:val="18"/>
-              </w:rPr>
-              <w:t>EMQX 消息压测</w:t>
-            </w:r>
-          </w:p>
-        </w:tc>
-        <w:tc>
-          <w:tcPr>
             <w:tcW w:type="dxa" w:w="2494"/>
           </w:tcPr>
           <w:p>
@@ -3722,23 +4106,39 @@
                 <w:color w:val="000000"/>
                 <w:sz w:val="18"/>
               </w:rPr>
+              <w:t>对 EMQX 施加大消息速率</w:t>
+            </w:r>
+          </w:p>
+        </w:tc>
+        <w:tc>
+          <w:tcPr>
+            <w:tcW w:type="dxa" w:w="2381"/>
+          </w:tcPr>
+          <w:p>
+            <w:r>
+              <w:rPr>
+                <w:rFonts w:ascii="Times New Roman" w:hAnsi="Times New Roman" w:eastAsia="宋体"/>
+                <w:b w:val="0"/>
+                <w:color w:val="000000"/>
+                <w:sz w:val="18"/>
+              </w:rPr>
               <w:t>5 万条/秒约 3.2 核</w:t>
             </w:r>
           </w:p>
         </w:tc>
         <w:tc>
           <w:tcPr>
-            <w:tcW w:type="dxa" w:w="2381"/>
-          </w:tcPr>
-          <w:p>
-            <w:r>
-              <w:rPr>
-                <w:rFonts w:ascii="Times New Roman" w:hAnsi="Times New Roman" w:eastAsia="宋体"/>
-                <w:b w:val="0"/>
-                <w:color w:val="000000"/>
-                <w:sz w:val="18"/>
-              </w:rPr>
-              <w:t>单节点压力远低于此，瓶颈在带宽/存储</w:t>
+            <w:tcW w:type="dxa" w:w="2721"/>
+          </w:tcPr>
+          <w:p>
+            <w:r>
+              <w:rPr>
+                <w:rFonts w:ascii="Times New Roman" w:hAnsi="Times New Roman" w:eastAsia="宋体"/>
+                <w:b w:val="0"/>
+                <w:color w:val="000000"/>
+                <w:sz w:val="18"/>
+              </w:rPr>
+              <w:t>单节点上传压力远低于此，系统瓶颈在带宽与存储而非 Broker</w:t>
             </w:r>
           </w:p>
         </w:tc>
@@ -3746,7 +4146,7 @@
       <w:tr>
         <w:tc>
           <w:tcPr>
-            <w:tcW w:type="dxa" w:w="1474"/>
+            <w:tcW w:type="dxa" w:w="1361"/>
           </w:tcPr>
           <w:p>
             <w:r>
@@ -3762,22 +4162,6 @@
         </w:tc>
         <w:tc>
           <w:tcPr>
-            <w:tcW w:type="dxa" w:w="2608"/>
-          </w:tcPr>
-          <w:p>
-            <w:r>
-              <w:rPr>
-                <w:rFonts w:ascii="Times New Roman" w:hAnsi="Times New Roman" w:eastAsia="宋体"/>
-                <w:b w:val="0"/>
-                <w:color w:val="000000"/>
-                <w:sz w:val="18"/>
-              </w:rPr>
-              <w:t>2 万连接 30 min + 真机约 15 h</w:t>
-            </w:r>
-          </w:p>
-        </w:tc>
-        <w:tc>
-          <w:tcPr>
             <w:tcW w:type="dxa" w:w="2494"/>
           </w:tcPr>
           <w:p>
@@ -3788,7 +4172,7 @@
                 <w:color w:val="000000"/>
                 <w:sz w:val="18"/>
               </w:rPr>
-              <w:t>零掉线、形成完整曲线</w:t>
+              <w:t>2 万连接压测 30 min，ESP32 真机约 15 h</w:t>
             </w:r>
           </w:p>
         </w:tc>
@@ -3804,7 +4188,23 @@
                 <w:color w:val="000000"/>
                 <w:sz w:val="18"/>
               </w:rPr>
-              <w:t>长时间稳定达标</w:t>
+              <w:t>压测零掉线，真机四类数据形成完整曲线</w:t>
+            </w:r>
+          </w:p>
+        </w:tc>
+        <w:tc>
+          <w:tcPr>
+            <w:tcW w:type="dxa" w:w="2721"/>
+          </w:tcPr>
+          <w:p>
+            <w:r>
+              <w:rPr>
+                <w:rFonts w:ascii="Times New Roman" w:hAnsi="Times New Roman" w:eastAsia="宋体"/>
+                <w:b w:val="0"/>
+                <w:color w:val="000000"/>
+                <w:sz w:val="18"/>
+              </w:rPr>
+              <w:t>长时间运行稳定，满足 ≥ 30 min 不崩溃不掉线</w:t>
             </w:r>
           </w:p>
         </w:tc>

</xml_diff>